<commit_message>
Add ER diagram and embed it in the Word report
Co-Authored-By: Claude Opus 5.5 <noreply@anthropic.com>
Claude-Session: https://claude.ai/code/session_01Kk2nfkPg9B6EJa48cu7SnH
</commit_message>
<xml_diff>
--- a/TI3002C_Etapa_4.2_Equipo_6.docx
+++ b/TI3002C_Etapa_4.2_Equipo_6.docx
@@ -2520,16 +2520,47 @@
     </w:p>
     <w:p>
       <w:pPr>
-        <w:spacing w:after="120"/>
-      </w:pPr>
-      <w:r>
-        <w:rPr>
-          <w:b/>
-          <w:bCs/>
-          <w:highlight w:val="yellow"/>
-          <w:highlightCs w:val="yellow"/>
-        </w:rPr>
-        <w:t xml:space="preserve">[Insertar aquí el Diagrama Entidad-Relación actualizado (Lucidchart)]</w:t>
+        <w:jc w:val="center"/>
+      </w:pPr>
+      <w:r>
+        <w:drawing>
+          <wp:inline distT="0" distB="0" distL="0" distR="0">
+            <wp:extent cx="5943600" cy="2752725"/>
+            <wp:effectExtent t="0" r="0" b="0" l="0"/>
+            <wp:docPr id="1" name="" descr="" title=""/>
+            <wp:cNvGraphicFramePr>
+              <a:graphicFrameLocks xmlns:a="http://schemas.openxmlformats.org/drawingml/2006/main" noChangeAspect="1"/>
+            </wp:cNvGraphicFramePr>
+            <a:graphic xmlns:a="http://schemas.openxmlformats.org/drawingml/2006/main">
+              <a:graphicData uri="http://schemas.openxmlformats.org/drawingml/2006/picture">
+                <pic:pic xmlns:pic="http://schemas.openxmlformats.org/drawingml/2006/picture">
+                  <pic:nvPicPr>
+                    <pic:cNvPr id="0" name="" descr=""/>
+                    <pic:cNvPicPr>
+                      <a:picLocks noChangeAspect="1" noChangeArrowheads="1"/>
+                    </pic:cNvPicPr>
+                  </pic:nvPicPr>
+                  <pic:blipFill>
+                    <a:blip r:embed="rId7" cstate="none"/>
+                    <a:srcRect/>
+                    <a:stretch>
+                      <a:fillRect/>
+                    </a:stretch>
+                  </pic:blipFill>
+                  <pic:spPr bwMode="auto">
+                    <a:xfrm>
+                      <a:off x="0" y="0"/>
+                      <a:ext cx="5943600" cy="2752725"/>
+                    </a:xfrm>
+                    <a:prstGeom prst="rect">
+                      <a:avLst/>
+                    </a:prstGeom>
+                  </pic:spPr>
+                </pic:pic>
+              </a:graphicData>
+            </a:graphic>
+          </wp:inline>
+        </w:drawing>
       </w:r>
     </w:p>
     <w:p>

</xml_diff>

<commit_message>
Fill region and socioeconomic boxplot analysis in Word report
Co-Authored-By: Claude Opus 5.5 <noreply@anthropic.com>
Claude-Session: https://claude.ai/code/session_01Kk2nfkPg9B6EJa48cu7SnH
</commit_message>
<xml_diff>
--- a/TI3002C_Etapa_4.2_Equipo_6.docx
+++ b/TI3002C_Etapa_4.2_Equipo_6.docx
@@ -4995,10 +4995,10 @@
           <w:b/>
           <w:bCs/>
         </w:rPr>
-        <w:t xml:space="preserve">region – Cumplimiento_Venta_Esperada:</w:t>
-      </w:r>
-      <w:r>
-        <w:t xml:space="preserve"> Ciudad de México tiene el cumplimiento más alto (mediana ~35%), seguida de Monterrey (~23%) y Guadalajara (~17%); Noroeste, Sur y Sureste rondan apenas 7–10%. Las regiones pequeñas son las peor planeadas.</w:t>
+        <w:t xml:space="preserve">region – units_sold:</w:t>
+      </w:r>
+      <w:r>
+        <w:t xml:space="preserve"> clara jerarquía: Ciudad de México tiene la mediana más alta (~510 unidades al mes por producto, Q1 ~390 – Q3 ~620), seguida de Monterrey (~320) y Guadalajara (~220); Bajío (~130), Noroeste (~90), Sur (~75) y Sureste (~60) venden mucho menos. Hay outliers en todas las regiones; en Ciudad de México a partir de ~1,000 unidades.</w:t>
       </w:r>
     </w:p>
     <w:p>
@@ -5015,10 +5015,10 @@
           <w:b/>
           <w:bCs/>
         </w:rPr>
-        <w:t xml:space="preserve">region – Dias_Cobertura_Inventario:</w:t>
-      </w:r>
-      <w:r>
-        <w:t xml:space="preserve"> comportamiento inverso: Ciudad de México tiene la menor cobertura (~100 días) y Sureste la mayor (~480 días, con outliers por arriba de 1,000). Las regiones con menos venta acumulan el sobrestock.</w:t>
+        <w:t xml:space="preserve">region – sales_amount (escala log):</w:t>
+      </w:r>
+      <w:r>
+        <w:t xml:space="preserve"> mismo orden que units_sold: Ciudad de México ~$30,000 de mediana mensual por producto, Monterrey ~$19,000, Guadalajara ~$13,000 y Sureste apenas ~$4,000. Las tres zonas metropolitanas generan la mayor parte del ingreso.</w:t>
       </w:r>
     </w:p>
     <w:p>
@@ -5034,10 +5034,41 @@
         <w:rPr>
           <w:b/>
           <w:bCs/>
-          <w:highlight w:val="yellow"/>
-          <w:highlightCs w:val="yellow"/>
         </w:rPr>
-        <w:t xml:space="preserve">[region – units_sold y sales_amount: completar]</w:t>
+        <w:t xml:space="preserve">region – Cumplimiento_Venta_Esperada:</w:t>
+      </w:r>
+      <w:r>
+        <w:t xml:space="preserve"> Ciudad de México tiene el cumplimiento más alto (mediana ~33%), seguida de Monterrey (~22%) y Guadalajara (~17%); Bajío (~12%), Noroeste (~9%), Sur (~8.5%) y Sureste (~6.5%) son las peor planeadas. Outliers en Ciudad de México por arriba de ~47% y por debajo de ~20%.</w:t>
+      </w:r>
+    </w:p>
+    <w:p>
+      <w:pPr>
+        <w:pStyle w:val="ListParagraph"/>
+        <w:numPr>
+          <w:ilvl w:val="0"/>
+          <w:numId w:val="2"/>
+        </w:numPr>
+        <w:spacing w:after="60"/>
+      </w:pPr>
+      <w:r>
+        <w:rPr>
+          <w:b/>
+          <w:bCs/>
+        </w:rPr>
+        <w:t xml:space="preserve">region – Dias_Cobertura_Inventario:</w:t>
+      </w:r>
+      <w:r>
+        <w:t xml:space="preserve"> comportamiento inverso: Ciudad de México tiene la menor cobertura (~105 días) y Sureste la mayor (~470 días), con outliers a partir de ~800 y hasta ~1,380 días. </w:t>
+      </w:r>
+      <w:r>
+        <w:rPr>
+          <w:b/>
+          <w:bCs/>
+        </w:rPr>
+        <w:t xml:space="preserve">Conclusión:</w:t>
+      </w:r>
+      <w:r>
+        <w:t xml:space="preserve"> las regiones con menos venta reciben inventario proporcionalmente excesivo; conviene redistribuirlo hacia las zonas metropolitanas.</w:t>
       </w:r>
     </w:p>
     <w:p>
@@ -5084,7 +5115,97 @@
           <w:highlight w:val="yellow"/>
           <w:highlightCs w:val="yellow"/>
         </w:rPr>
-        <w:t xml:space="preserve">[category, subcategory, region, Client_Category, Preferred_Channel, Socioeconomic_Level: completar]</w:t>
+        <w:t xml:space="preserve">[category, subcategory, region, Client_Category, Preferred_Channel: completar]</w:t>
+      </w:r>
+    </w:p>
+    <w:p>
+      <w:pPr>
+        <w:pStyle w:val="ListParagraph"/>
+        <w:numPr>
+          <w:ilvl w:val="0"/>
+          <w:numId w:val="2"/>
+        </w:numPr>
+        <w:spacing w:after="60"/>
+      </w:pPr>
+      <w:r>
+        <w:rPr>
+          <w:b/>
+          <w:bCs/>
+        </w:rPr>
+        <w:t xml:space="preserve">Socioeconomic_Level – units_sold:</w:t>
+      </w:r>
+      <w:r>
+        <w:t xml:space="preserve"> sin diferencias: en todos los niveles la caja va de 1 a 2 piezas, con outliers en 4, 5 y 6 piezas.</w:t>
+      </w:r>
+    </w:p>
+    <w:p>
+      <w:pPr>
+        <w:pStyle w:val="ListParagraph"/>
+        <w:numPr>
+          <w:ilvl w:val="0"/>
+          <w:numId w:val="2"/>
+        </w:numPr>
+        <w:spacing w:after="60"/>
+      </w:pPr>
+      <w:r>
+        <w:rPr>
+          <w:b/>
+          <w:bCs/>
+        </w:rPr>
+        <w:t xml:space="preserve">Socioeconomic_Level – Annual_Purchase_Frequency:</w:t>
+      </w:r>
+      <w:r>
+        <w:t xml:space="preserve"> aumenta claramente con el nivel: mediana de 3 compras al año en Bajo, 4 en Medio-Bajo, 7 en Medio, 9 en Medio-Alto y 12 en Alto. Outliers a partir de ~10 compras en Bajo y de ~20 en Medio-Alto.</w:t>
+      </w:r>
+    </w:p>
+    <w:p>
+      <w:pPr>
+        <w:pStyle w:val="ListParagraph"/>
+        <w:numPr>
+          <w:ilvl w:val="0"/>
+          <w:numId w:val="2"/>
+        </w:numPr>
+        <w:spacing w:after="60"/>
+      </w:pPr>
+      <w:r>
+        <w:rPr>
+          <w:b/>
+          <w:bCs/>
+        </w:rPr>
+        <w:t xml:space="preserve">Socioeconomic_Level – sales_amount:</w:t>
+      </w:r>
+      <w:r>
+        <w:t xml:space="preserve"> el ticket por transacción es casi igual en todos los niveles (mediana ~$100–120), con outliers a partir de ~$310–360.</w:t>
+      </w:r>
+    </w:p>
+    <w:p>
+      <w:pPr>
+        <w:pStyle w:val="ListParagraph"/>
+        <w:numPr>
+          <w:ilvl w:val="0"/>
+          <w:numId w:val="2"/>
+        </w:numPr>
+        <w:spacing w:after="60"/>
+      </w:pPr>
+      <w:r>
+        <w:rPr>
+          <w:b/>
+          <w:bCs/>
+        </w:rPr>
+        <w:t xml:space="preserve">Socioeconomic_Level – Annual_Total_Spend (escala log):</w:t>
+      </w:r>
+      <w:r>
+        <w:t xml:space="preserve"> fuerte gradiente: mediana de ~$1,800 en Bajo, ~$5,000 en Medio-Bajo, ~$12,000 en Medio, ~$21,000 en Medio-Alto y ~$42,000 en Alto. </w:t>
+      </w:r>
+      <w:r>
+        <w:rPr>
+          <w:b/>
+          <w:bCs/>
+        </w:rPr>
+        <w:t xml:space="preserve">Conclusión:</w:t>
+      </w:r>
+      <w:r>
+        <w:t xml:space="preserve"> los clientes de nivel alto no gastan más por compra, sino que compran con mayor frecuencia; su valor anual es hasta 20 veces el de nivel Bajo.</w:t>
       </w:r>
     </w:p>
     <w:p>
@@ -6808,6 +6929,19 @@
       </w:pPr>
       <w:r>
         <w:t xml:space="preserve">El 92% de las transacciones son de clientes Básico y Silver; el programa de lealtad tiene poca penetración en Gold y Premium.</w:t>
+      </w:r>
+    </w:p>
+    <w:p>
+      <w:pPr>
+        <w:pStyle w:val="ListParagraph"/>
+        <w:numPr>
+          <w:ilvl w:val="0"/>
+          <w:numId w:val="2"/>
+        </w:numPr>
+        <w:spacing w:after="60"/>
+      </w:pPr>
+      <w:r>
+        <w:t xml:space="preserve">El nivel socioeconómico es el principal diferenciador del valor del cliente: el nivel Alto gasta ~$42,000 al año contra ~$1,800 del nivel Bajo, por mayor frecuencia de compra y no por ticket más alto.</w:t>
       </w:r>
     </w:p>
     <w:p>

</xml_diff>

<commit_message>
Keep only verified figures in Word report; mark the rest for review
Co-Authored-By: Claude Opus 5.5 <noreply@anthropic.com>
Claude-Session: https://claude.ai/code/session_01Kk2nfkPg9B6EJa48cu7SnH
</commit_message>
<xml_diff>
--- a/TI3002C_Etapa_4.2_Equipo_6.docx
+++ b/TI3002C_Etapa_4.2_Equipo_6.docx
@@ -3498,7 +3498,13 @@
               <w:jc w:val="left"/>
             </w:pPr>
             <w:r>
-              <w:t xml:space="preserve">~10,400</w:t>
+              <w:rPr>
+                <w:b/>
+                <w:bCs/>
+                <w:highlight w:val="yellow"/>
+                <w:highlightCs w:val="yellow"/>
+              </w:rPr>
+              <w:t xml:space="preserve">[Revisar en el código: clientes_por_rango]</w:t>
             </w:r>
           </w:p>
         </w:tc>
@@ -3523,7 +3529,13 @@
               <w:jc w:val="left"/>
             </w:pPr>
             <w:r>
-              <w:t xml:space="preserve">~23%</w:t>
+              <w:rPr>
+                <w:b/>
+                <w:bCs/>
+                <w:highlight w:val="yellow"/>
+                <w:highlightCs w:val="yellow"/>
+              </w:rPr>
+              <w:t xml:space="preserve">[Revisar en el código: %]</w:t>
             </w:r>
           </w:p>
         </w:tc>
@@ -3575,7 +3587,7 @@
         <w:t xml:space="preserve">subcategory:</w:t>
       </w:r>
       <w:r>
-        <w:t xml:space="preserve"> Sneakers lidera (13.31%); con la regla del 70% se conservan 8 subcategorías y 5 se agrupan en "Otras" (Outerwear, Hats, Bags, Jewelry, Belts).</w:t>
+        <w:t xml:space="preserve"> Sneakers lidera (13.31%); con la regla del 70% se conservan 8 subcategorías (hasta Sandals, 74.10% acumulado) y 5 se agrupan en "Otras" (Outerwear, Hats, Bags, Jewelry, Belts).</w:t>
       </w:r>
     </w:p>
     <w:p>
@@ -3635,7 +3647,7 @@
         <w:t xml:space="preserve">Preferred_Channel:</w:t>
       </w:r>
       <w:r>
-        <w:t xml:space="preserve"> Tienda física (43.26%) sigue siendo el canal principal, pero Online + App ya suman 56.74%.</w:t>
+        <w:t xml:space="preserve"> Tienda física (43.26%) sigue siendo el canal principal, pero Online (36.85%) + App (19.89%) ya suman 56.74%.</w:t>
       </w:r>
     </w:p>
     <w:p>
@@ -3655,7 +3667,7 @@
         <w:t xml:space="preserve">Socioeconomic_Level:</w:t>
       </w:r>
       <w:r>
-        <w:t xml:space="preserve"> el 84.03% de las transacciones vienen de niveles Bajo, Medio-Bajo y Medio; Alto solo representa 3.23%.</w:t>
+        <w:t xml:space="preserve"> el 84.03% de las transacciones vienen de niveles Medio, Medio-Bajo y Bajo; Alto solo representa 3.23%.</w:t>
       </w:r>
     </w:p>
     <w:p>
@@ -3675,13 +3687,8 @@
         <w:t xml:space="preserve">Rango_Edad:</w:t>
       </w:r>
       <w:r>
-        <w:t xml:space="preserve"> analizado por clientes únicos; 35-44 es el rango más común (~23%) y el 62% de los clientes tiene entre 25 y 54 años. En ventas, 35-44 genera $72.84 M (23.0%), 25-34 $64.51 M (20.4%) y 45-54 $58.33 M (18.4%). Todos los rangos gastan ~$7,000 por cliente.</w:t>
-      </w:r>
-    </w:p>
-    <w:p>
-      <w:pPr>
-        <w:spacing w:after="120"/>
-      </w:pPr>
+        <w:t xml:space="preserve"> analizado por clientes únicos; 35-44 es el rango con más clientes. </w:t>
+      </w:r>
       <w:r>
         <w:rPr>
           <w:b/>
@@ -3689,7 +3696,10 @@
           <w:highlight w:val="yellow"/>
           <w:highlightCs w:val="yellow"/>
         </w:rPr>
-        <w:t xml:space="preserve">[Ajustar los % de clientes por rango con la tabla exacta de print(clientes_por_rango)]</w:t>
+        <w:t xml:space="preserve">[Revisar en el código: número y % de clientes por rango con print(clientes_por_rango)]</w:t>
+      </w:r>
+      <w:r>
+        <w:t xml:space="preserve"> En ventas: 35-44 genera $72.84 M (23.0% del total), 25-34 $64.51 M (20.4%), 45-54 $58.33 M (18.4%), 65+ $42.14 M (13.3%), 18-24 $39.66 M (12.5%) y 55-64 $39.34 M (12.4%).</w:t>
       </w:r>
     </w:p>
     <w:p>
@@ -4554,7 +4564,7 @@
         <w:t xml:space="preserve">Valor más frecuente:</w:t>
       </w:r>
       <w:r>
-        <w:t xml:space="preserve"> 2 piezas (44.20%). El 80.99% de las transacciones son de 1 o 2 piezas; compras de 4 o más son menos del 5.4%. </w:t>
+        <w:t xml:space="preserve"> 2 piezas (44.20%). El 80.99% de las transacciones son de 1 o 2 piezas; compras de 4 o más son el 5.40%. </w:t>
       </w:r>
       <w:r>
         <w:rPr>
@@ -4581,7 +4591,7 @@
         <w:spacing w:after="120"/>
       </w:pPr>
       <w:r>
-        <w:t xml:space="preserve">Rango de 1 a 26 compras al año; media 5.91, mediana 5 y Q3 = 8. </w:t>
+        <w:t xml:space="preserve">Rango de 1 a 26 compras al año; media 5.91, Q1 = 3, mediana 5 y Q3 = 8. El 50% central de los registros compra entre 3 y 8 veces al año, y la media es mayor que la mediana (sesgo a la derecha): pocos clientes compran muchas veces. </w:t>
       </w:r>
       <w:r>
         <w:rPr>
@@ -4591,8 +4601,13 @@
         <w:t xml:space="preserve">Valor más frecuente:</w:t>
       </w:r>
       <w:r>
-        <w:t xml:space="preserve"> 4 compras al año. La distribución tiene sesgo a la derecha: la mayoría compra entre 3 y 8 veces al año y muy pocos superan 15. </w:t>
-      </w:r>
+        <w:t xml:space="preserve"> [[Revisar en el código: moda y tabla de frecuencias con analisis_frecuencia(data_DanuStore_Diario, ['Annual_Purchase_Frequency'], Ordenar_Valor=True)]]</w:t>
+      </w:r>
+    </w:p>
+    <w:p>
+      <w:pPr>
+        <w:spacing w:after="120"/>
+      </w:pPr>
       <w:r>
         <w:rPr>
           <w:b/>
@@ -4601,16 +4616,7 @@
         <w:t xml:space="preserve">Conclusión:</w:t>
       </w:r>
       <w:r>
-        <w:t xml:space="preserve"> predominan los clientes de recurrencia media; los muy frecuentes son un grupo pequeño que conviene retener. </w:t>
-      </w:r>
-      <w:r>
-        <w:rPr>
-          <w:b/>
-          <w:bCs/>
-          <w:highlight w:val="yellow"/>
-          <w:highlightCs w:val="yellow"/>
-        </w:rPr>
-        <w:t xml:space="preserve">[Confirmar frecuencias exactas con la tabla de frecuencias del notebook]</w:t>
+        <w:t xml:space="preserve"> predominan los clientes de recurrencia media; los muy frecuentes son un grupo pequeño que conviene retener.</w:t>
       </w:r>
     </w:p>
     <w:p>
@@ -4627,7 +4633,7 @@
         <w:spacing w:after="120"/>
       </w:pPr>
       <w:r>
-        <w:t xml:space="preserve">En los histogramas se graficaron la media, ±1σ y ±3.5σ, y la distribución normal teórica. En los boxplots se usó escala logarítmica cuando la asimetría es mayor a 2.</w:t>
+        <w:t xml:space="preserve">En los histogramas se graficaron la media, ±1σ, ±3.5σ y la distribución normal teórica. En los boxplots se usó escala logarítmica cuando la asimetría es mayor a 2. El límite de outliers se calcula como Q3 + 1.5·IQR.</w:t>
       </w:r>
     </w:p>
     <w:tbl>
@@ -4767,7 +4773,7 @@
               <w:jc w:val="left"/>
             </w:pPr>
             <w:r>
-              <w:t xml:space="preserve">Media $132.20, σ $88.84. Los intervalos más frecuentes están entre ~$50 y ~$175 (Q1 $67.05 – Q3 $173.80). Sesgo a la derecha. Outliers a partir de ~$334 (Q3 + 1.5·IQR); 12,002 transacciones (0.50%) quedan fuera de ±3.5σ, con máximo de $1,033.92.</w:t>
+              <w:t xml:space="preserve">Media $132.20, σ $88.84. El 50% central está entre $67.05 (Q1) y $173.80 (Q3); media &gt; mediana ($109.66), sesgo a la derecha. Outliers a partir de $333.93; 12,002 transacciones (0.50%) fuera de ±3.5σ. Máximo $1,033.92.</w:t>
             </w:r>
           </w:p>
         </w:tc>
@@ -4822,7 +4828,7 @@
               <w:jc w:val="left"/>
             </w:pPr>
             <w:r>
-              <w:t xml:space="preserve">Media $10,871.76, σ $12,195.31. Fuerte sesgo a la derecha: la mayoría gasta entre $2,654 y $14,675 al año. Outliers a partir de ~$32,700; 34,833 registros (1.45%) fuera de ±3.5σ, máximo $118,710.24. Hay un grupo pequeño de clientes de muy alto valor.</w:t>
+              <w:t xml:space="preserve">Media $10,871.76, σ $12,195.31. El 50% central está entre $2,654.40 y $14,675.08; mediana $6,718.08, fuerte sesgo a la derecha. Outliers a partir de $32,706.10; 34,833 registros (1.45%) fuera de ±3.5σ. Máximo $118,710.24.</w:t>
             </w:r>
           </w:p>
         </w:tc>
@@ -4877,7 +4883,7 @@
               <w:jc w:val="left"/>
             </w:pPr>
             <w:r>
-              <w:t xml:space="preserve">Media 15.69%, σ 9.64. Intervalos más frecuentes entre 5% y 20% (Q1 8.11% – Q3 21.25%). Outliers a partir de ~41%; solo 22 registros (0.10%) fuera de ±3.5σ y 0 atípicos extremos. Se vende en promedio solo el 15.7% de lo esperado.</w:t>
+              <w:t xml:space="preserve">Media 15.69%, σ 9.64. El 50% central está entre 8.11% y 21.25%; mediana 12.01%. Outliers a partir de 40.96%; 22 registros (0.10%) fuera de ±3.5σ y 0 atípicos extremos (&gt; 3 IQR). Máximo 57.81%.</w:t>
             </w:r>
           </w:p>
         </w:tc>
@@ -4932,7 +4938,7 @@
               <w:jc w:val="left"/>
             </w:pPr>
             <w:r>
-              <w:t xml:space="preserve">Media 289.35 días, σ 152.04. Intervalos más frecuentes entre ~150 y ~400 días (Q1 165.30 – Q3 383.27). Outliers a partir de ~710 días; 93 registros (0.43%) fuera de ±3.5σ, máximo 1,377 días. El inventario tarda en promedio casi 10 meses en desplazarse.</w:t>
+              <w:t xml:space="preserve">Media 289.35 días, σ 152.04. El 50% central está entre 165.30 y 383.27 días; mediana 266.59. Outliers a partir de 710.23 días; 93 registros (0.43%) fuera de ±3.5σ y 16 atípicos extremos (0.07%). Máximo 1,377.41 días.</w:t>
             </w:r>
           </w:p>
         </w:tc>
@@ -4940,6 +4946,23 @@
     </w:tbl>
     <w:p>
       <w:pPr>
+        <w:spacing w:after="120"/>
+      </w:pPr>
+      <w:r>
+        <w:t xml:space="preserve">Intervalos más frecuentes de cada histograma: </w:t>
+      </w:r>
+      <w:r>
+        <w:rPr>
+          <w:b/>
+          <w:bCs/>
+          <w:highlight w:val="yellow"/>
+          <w:highlightCs w:val="yellow"/>
+        </w:rPr>
+        <w:t xml:space="preserve">[Revisar en el código: leer la barra más alta de cada histograma]</w:t>
+      </w:r>
+    </w:p>
+    <w:p>
+      <w:pPr>
         <w:pStyle w:val="Heading2"/>
         <w:spacing w:after="100" w:before="180"/>
       </w:pPr>
@@ -4952,7 +4975,7 @@
         <w:spacing w:after="120"/>
       </w:pPr>
       <w:r>
-        <w:t xml:space="preserve">Ninguna variable continua sigue una distribución normal: todas tienen sesgo a la derecha, con la mayoría de los valores concentrados en la parte baja y una cola de valores altos. Los outliers son pocos (menos del 1.5% en todos los casos) y corresponden a casos reales del negocio (compras grandes, clientes de alto valor, productos con muy baja rotación), por lo que no se eliminan.</w:t>
+        <w:t xml:space="preserve">Ninguna variable continua sigue una distribución normal: en todas la media es mayor que la mediana (sesgo a la derecha), con la mayoría de los valores en la parte baja y una cola de valores altos. Los valores fuera de ±3.5σ son menos del 1.5% en todos los casos y corresponden a casos reales del negocio (compras grandes, clientes de alto valor, productos con muy baja rotación), por lo que no se eliminan.</w:t>
       </w:r>
     </w:p>
     <w:p>
@@ -4995,10 +5018,19 @@
           <w:b/>
           <w:bCs/>
         </w:rPr>
-        <w:t xml:space="preserve">region – units_sold:</w:t>
-      </w:r>
-      <w:r>
-        <w:t xml:space="preserve"> clara jerarquía: Ciudad de México tiene la mediana más alta (~510 unidades al mes por producto, Q1 ~390 – Q3 ~620), seguida de Monterrey (~320) y Guadalajara (~220); Bajío (~130), Noroeste (~90), Sur (~75) y Sureste (~60) venden mucho menos. Hay outliers en todas las regiones; en Ciudad de México a partir de ~1,000 unidades.</w:t>
+        <w:t xml:space="preserve">region – units_sold y sales_amount:</w:t>
+      </w:r>
+      <w:r>
+        <w:t xml:space="preserve"> jerarquía clara en ambas variables: Ciudad de México tiene la mediana más alta, seguida de Monterrey y Guadalajara; Bajío, Noroeste, Sur y Sureste venden mucho menos (Sureste es la más baja). Todas las regiones presentan outliers en la parte alta. </w:t>
+      </w:r>
+      <w:r>
+        <w:rPr>
+          <w:b/>
+          <w:bCs/>
+          <w:highlight w:val="yellow"/>
+          <w:highlightCs w:val="yellow"/>
+        </w:rPr>
+        <w:t xml:space="preserve">[Revisar en el código: medianas y límites de outliers por región]</w:t>
       </w:r>
     </w:p>
     <w:p>
@@ -5015,10 +5047,19 @@
           <w:b/>
           <w:bCs/>
         </w:rPr>
-        <w:t xml:space="preserve">region – sales_amount (escala log):</w:t>
-      </w:r>
-      <w:r>
-        <w:t xml:space="preserve"> mismo orden que units_sold: Ciudad de México ~$30,000 de mediana mensual por producto, Monterrey ~$19,000, Guadalajara ~$13,000 y Sureste apenas ~$4,000. Las tres zonas metropolitanas generan la mayor parte del ingreso.</w:t>
+        <w:t xml:space="preserve">region – Cumplimiento_Venta_Esperada:</w:t>
+      </w:r>
+      <w:r>
+        <w:t xml:space="preserve"> mismo orden: Ciudad de México tiene el cumplimiento más alto y Sureste el más bajo. Las regiones pequeñas son las peor planeadas. </w:t>
+      </w:r>
+      <w:r>
+        <w:rPr>
+          <w:b/>
+          <w:bCs/>
+          <w:highlight w:val="yellow"/>
+          <w:highlightCs w:val="yellow"/>
+        </w:rPr>
+        <w:t xml:space="preserve">[Revisar en el código: medianas por región]</w:t>
       </w:r>
     </w:p>
     <w:p>
@@ -5035,10 +5076,29 @@
           <w:b/>
           <w:bCs/>
         </w:rPr>
-        <w:t xml:space="preserve">region – Cumplimiento_Venta_Esperada:</w:t>
-      </w:r>
-      <w:r>
-        <w:t xml:space="preserve"> Ciudad de México tiene el cumplimiento más alto (mediana ~33%), seguida de Monterrey (~22%) y Guadalajara (~17%); Bajío (~12%), Noroeste (~9%), Sur (~8.5%) y Sureste (~6.5%) son las peor planeadas. Outliers en Ciudad de México por arriba de ~47% y por debajo de ~20%.</w:t>
+        <w:t xml:space="preserve">region – Dias_Cobertura_Inventario:</w:t>
+      </w:r>
+      <w:r>
+        <w:t xml:space="preserve"> comportamiento inverso: Ciudad de México tiene la menor cobertura y Sureste la mayor, con outliers que llegan hasta el máximo de 1,377 días. </w:t>
+      </w:r>
+      <w:r>
+        <w:rPr>
+          <w:b/>
+          <w:bCs/>
+        </w:rPr>
+        <w:t xml:space="preserve">Conclusión:</w:t>
+      </w:r>
+      <w:r>
+        <w:t xml:space="preserve"> las regiones con menos venta reciben inventario proporcionalmente excesivo; conviene redistribuirlo hacia las zonas metropolitanas. </w:t>
+      </w:r>
+      <w:r>
+        <w:rPr>
+          <w:b/>
+          <w:bCs/>
+          <w:highlight w:val="yellow"/>
+          <w:highlightCs w:val="yellow"/>
+        </w:rPr>
+        <w:t xml:space="preserve">[Revisar en el código: medianas por región]</w:t>
       </w:r>
     </w:p>
     <w:p>
@@ -5054,21 +5114,19 @@
         <w:rPr>
           <w:b/>
           <w:bCs/>
+          <w:highlight w:val="yellow"/>
+          <w:highlightCs w:val="yellow"/>
         </w:rPr>
-        <w:t xml:space="preserve">region – Dias_Cobertura_Inventario:</w:t>
-      </w:r>
-      <w:r>
-        <w:t xml:space="preserve"> comportamiento inverso: Ciudad de México tiene la menor cobertura (~105 días) y Sureste la mayor (~470 días), con outliers a partir de ~800 y hasta ~1,380 días. </w:t>
-      </w:r>
-      <w:r>
-        <w:rPr>
-          <w:b/>
-          <w:bCs/>
-        </w:rPr>
-        <w:t xml:space="preserve">Conclusión:</w:t>
-      </w:r>
-      <w:r>
-        <w:t xml:space="preserve"> las regiones con menos venta reciben inventario proporcionalmente excesivo; conviene redistribuirlo hacia las zonas metropolitanas.</w:t>
+        <w:t xml:space="preserve">[Revisar en el código: category y subcategory – las 4 variables]</w:t>
+      </w:r>
+    </w:p>
+    <w:p>
+      <w:pPr>
+        <w:pStyle w:val="Heading2"/>
+        <w:spacing w:after="100" w:before="180"/>
+      </w:pPr>
+      <w:r>
+        <w:t xml:space="preserve">5.2 Nivel Micro (6 cualitativas + Rango_Edad)</w:t>
       </w:r>
     </w:p>
     <w:p>
@@ -5087,16 +5145,7 @@
           <w:highlight w:val="yellow"/>
           <w:highlightCs w:val="yellow"/>
         </w:rPr>
-        <w:t xml:space="preserve">[category y subcategory – las 4 variables: completar]</w:t>
-      </w:r>
-    </w:p>
-    <w:p>
-      <w:pPr>
-        <w:pStyle w:val="Heading2"/>
-        <w:spacing w:after="100" w:before="180"/>
-      </w:pPr>
-      <w:r>
-        <w:t xml:space="preserve">5.2 Nivel Micro (6 cualitativas + Rango_Edad)</w:t>
+        <w:t xml:space="preserve">[Revisar en el código: category, subcategory, region, Client_Category, Preferred_Channel]</w:t>
       </w:r>
     </w:p>
     <w:p>
@@ -5112,10 +5161,11 @@
         <w:rPr>
           <w:b/>
           <w:bCs/>
-          <w:highlight w:val="yellow"/>
-          <w:highlightCs w:val="yellow"/>
         </w:rPr>
-        <w:t xml:space="preserve">[category, subcategory, region, Client_Category, Preferred_Channel: completar]</w:t>
+        <w:t xml:space="preserve">Socioeconomic_Level – units_sold:</w:t>
+      </w:r>
+      <w:r>
+        <w:t xml:space="preserve"> sin diferencias: en todos los niveles la caja va de 1 a 2 piezas, con outliers en 4, 5 y 6 piezas.</w:t>
       </w:r>
     </w:p>
     <w:p>
@@ -5132,10 +5182,19 @@
           <w:b/>
           <w:bCs/>
         </w:rPr>
-        <w:t xml:space="preserve">Socioeconomic_Level – units_sold:</w:t>
-      </w:r>
-      <w:r>
-        <w:t xml:space="preserve"> sin diferencias: en todos los niveles la caja va de 1 a 2 piezas, con outliers en 4, 5 y 6 piezas.</w:t>
+        <w:t xml:space="preserve">Socioeconomic_Level – Annual_Purchase_Frequency:</w:t>
+      </w:r>
+      <w:r>
+        <w:t xml:space="preserve"> la mediana aumenta en cada nivel, de Bajo (la más baja) a Alto (la más alta). Todos los niveles tienen outliers en la parte alta. </w:t>
+      </w:r>
+      <w:r>
+        <w:rPr>
+          <w:b/>
+          <w:bCs/>
+          <w:highlight w:val="yellow"/>
+          <w:highlightCs w:val="yellow"/>
+        </w:rPr>
+        <w:t xml:space="preserve">[Revisar en el código: medianas por nivel]</w:t>
       </w:r>
     </w:p>
     <w:p>
@@ -5152,10 +5211,19 @@
           <w:b/>
           <w:bCs/>
         </w:rPr>
-        <w:t xml:space="preserve">Socioeconomic_Level – Annual_Purchase_Frequency:</w:t>
-      </w:r>
-      <w:r>
-        <w:t xml:space="preserve"> aumenta claramente con el nivel: mediana de 3 compras al año en Bajo, 4 en Medio-Bajo, 7 en Medio, 9 en Medio-Alto y 12 en Alto. Outliers a partir de ~10 compras en Bajo y de ~20 en Medio-Alto.</w:t>
+        <w:t xml:space="preserve">Socioeconomic_Level – sales_amount:</w:t>
+      </w:r>
+      <w:r>
+        <w:t xml:space="preserve"> el ticket por transacción es muy similar en todos los niveles, con outliers en la parte alta en todos. </w:t>
+      </w:r>
+      <w:r>
+        <w:rPr>
+          <w:b/>
+          <w:bCs/>
+          <w:highlight w:val="yellow"/>
+          <w:highlightCs w:val="yellow"/>
+        </w:rPr>
+        <w:t xml:space="preserve">[Revisar en el código: medianas y límite de outliers]</w:t>
       </w:r>
     </w:p>
     <w:p>
@@ -5172,10 +5240,29 @@
           <w:b/>
           <w:bCs/>
         </w:rPr>
-        <w:t xml:space="preserve">Socioeconomic_Level – sales_amount:</w:t>
-      </w:r>
-      <w:r>
-        <w:t xml:space="preserve"> el ticket por transacción es casi igual en todos los niveles (mediana ~$100–120), con outliers a partir de ~$310–360.</w:t>
+        <w:t xml:space="preserve">Socioeconomic_Level – Annual_Total_Spend (escala log):</w:t>
+      </w:r>
+      <w:r>
+        <w:t xml:space="preserve"> fuerte gradiente: el gasto anual sube en cada nivel, de Bajo a Alto. </w:t>
+      </w:r>
+      <w:r>
+        <w:rPr>
+          <w:b/>
+          <w:bCs/>
+        </w:rPr>
+        <w:t xml:space="preserve">Conclusión:</w:t>
+      </w:r>
+      <w:r>
+        <w:t xml:space="preserve"> los clientes de nivel alto no gastan más por compra, sino que compran con mayor frecuencia. </w:t>
+      </w:r>
+      <w:r>
+        <w:rPr>
+          <w:b/>
+          <w:bCs/>
+          <w:highlight w:val="yellow"/>
+          <w:highlightCs w:val="yellow"/>
+        </w:rPr>
+        <w:t xml:space="preserve">[Revisar en el código: medianas por nivel]</w:t>
       </w:r>
     </w:p>
     <w:p>
@@ -5192,20 +5279,26 @@
           <w:b/>
           <w:bCs/>
         </w:rPr>
-        <w:t xml:space="preserve">Socioeconomic_Level – Annual_Total_Spend (escala log):</w:t>
-      </w:r>
-      <w:r>
-        <w:t xml:space="preserve"> fuerte gradiente: mediana de ~$1,800 en Bajo, ~$5,000 en Medio-Bajo, ~$12,000 en Medio, ~$21,000 en Medio-Alto y ~$42,000 en Alto. </w:t>
+        <w:t xml:space="preserve">Rango_Edad:</w:t>
+      </w:r>
+      <w:r>
+        <w:t xml:space="preserve"> las cuatro variables (units_sold, Annual_Purchase_Frequency, sales_amount, Annual_Total_Spend) tienen distribuciones prácticamente iguales en todos los rangos, y todos presentan outliers de sales_amount en la parte alta. </w:t>
       </w:r>
       <w:r>
         <w:rPr>
           <w:b/>
           <w:bCs/>
         </w:rPr>
-        <w:t xml:space="preserve">Conclusión:</w:t>
-      </w:r>
-      <w:r>
-        <w:t xml:space="preserve"> los clientes de nivel alto no gastan más por compra, sino que compran con mayor frecuencia; su valor anual es hasta 20 veces el de nivel Bajo.</w:t>
+        <w:t xml:space="preserve">La edad no diferencia el comportamiento de compra.</w:t>
+      </w:r>
+    </w:p>
+    <w:p>
+      <w:pPr>
+        <w:pStyle w:val="Heading2"/>
+        <w:spacing w:after="100" w:before="180"/>
+      </w:pPr>
+      <w:r>
+        <w:t xml:space="preserve">Análisis adicional: Stock vs. Esperado vs. Vendido</w:t>
       </w:r>
     </w:p>
     <w:p>
@@ -5218,30 +5311,7 @@
         <w:spacing w:after="60"/>
       </w:pPr>
       <w:r>
-        <w:rPr>
-          <w:b/>
-          <w:bCs/>
-        </w:rPr>
-        <w:t xml:space="preserve">Rango_Edad:</w:t>
-      </w:r>
-      <w:r>
-        <w:t xml:space="preserve"> las cuatro variables (units_sold, Annual_Purchase_Frequency, sales_amount, Annual_Total_Spend) tienen distribuciones prácticamente iguales en todos los rangos. sales_amount presenta outliers en todos los rangos a partir de ~$350, con máximos cercanos a $1,000. Annual_Total_Spend (escala log) tampoco muestra diferencias. </w:t>
-      </w:r>
-      <w:r>
-        <w:rPr>
-          <w:b/>
-          <w:bCs/>
-        </w:rPr>
-        <w:t xml:space="preserve">La edad no diferencia el comportamiento de compra.</w:t>
-      </w:r>
-    </w:p>
-    <w:p>
-      <w:pPr>
-        <w:pStyle w:val="Heading2"/>
-        <w:spacing w:after="100" w:before="180"/>
-      </w:pPr>
-      <w:r>
-        <w:t xml:space="preserve">Análisis adicional: Stock vs. Esperado vs. Vendido</w:t>
+        <w:t xml:space="preserve">En todos los meses de 2024 y 2025 las unidades vendidas son muy inferiores a la demanda esperada y al stock; en el nivel macro el cumplimiento promedio es de 15.69%.</w:t>
       </w:r>
     </w:p>
     <w:p>
@@ -5254,17 +5324,7 @@
         <w:spacing w:after="60"/>
       </w:pPr>
       <w:r>
-        <w:t xml:space="preserve">Se venden entre 160 y 230 mil unidades al mes, contra una demanda esperada de 1.07 a 1.15 millones: solo se vende el </w:t>
-      </w:r>
-      <w:r>
-        <w:rPr>
-          <w:b/>
-          <w:bCs/>
-        </w:rPr>
-        <w:t xml:space="preserve">15–20% de lo esperado</w:t>
-      </w:r>
-      <w:r>
-        <w:t xml:space="preserve">.</w:t>
+        <w:t xml:space="preserve">El stock es mayor que la demanda esperada en todos los meses.</w:t>
       </w:r>
     </w:p>
     <w:p>
@@ -5277,7 +5337,7 @@
         <w:spacing w:after="60"/>
       </w:pPr>
       <w:r>
-        <w:t xml:space="preserve">El stock supera lo esperado en ~11% (~120 mil unidades) todos los meses.</w:t>
+        <w:t xml:space="preserve">En enero de 2025 la demanda esperada y el stock suben de nivel, mientras que las ventas se mantienen en un nivel similar al de 2024.</w:t>
       </w:r>
     </w:p>
     <w:p>
@@ -5290,7 +5350,7 @@
         <w:spacing w:after="60"/>
       </w:pPr>
       <w:r>
-        <w:t xml:space="preserve">En enero de 2025 la proyección y el stock subieron ~6–7%, pero las ventas se mantuvieron igual que en 2024.</w:t>
+        <w:t xml:space="preserve">Las ventas tienen picos en noviembre y diciembre, mientras que la demanda esperada se mantiene casi plana.</w:t>
       </w:r>
     </w:p>
     <w:p>
@@ -5303,7 +5363,13 @@
         <w:spacing w:after="60"/>
       </w:pPr>
       <w:r>
-        <w:t xml:space="preserve">Las ventas son estacionales (pico en noviembre–diciembre, mínimo en febrero), pero la proyección es prácticamente plana.</w:t>
+        <w:rPr>
+          <w:b/>
+          <w:bCs/>
+          <w:highlight w:val="yellow"/>
+          <w:highlightCs w:val="yellow"/>
+        </w:rPr>
+        <w:t xml:space="preserve">[Revisar en el código: cifras mensuales exactas en la tabla print(por_mes)]</w:t>
       </w:r>
     </w:p>
     <w:p>
@@ -6798,7 +6864,7 @@
         <w:spacing w:after="60"/>
       </w:pPr>
       <w:r>
-        <w:t xml:space="preserve">En todas las variables la media es mayor que la mediana, lo que confirma el sesgo a la derecha.</w:t>
+        <w:t xml:space="preserve">En todas las variables, excepto units_sold del nivel micro, la media es mayor que la mediana, lo que confirma el sesgo a la derecha.</w:t>
       </w:r>
     </w:p>
     <w:p>
@@ -6824,7 +6890,7 @@
         <w:spacing w:after="60"/>
       </w:pPr>
       <w:r>
-        <w:t xml:space="preserve">El cumplimiento mediano es de solo 12%: la mitad de los registros mensuales vende menos del 12% de lo esperado.</w:t>
+        <w:t xml:space="preserve">El cumplimiento mediano es de 12.01%: la mitad de los registros mensuales vende menos del 12% de lo esperado.</w:t>
       </w:r>
     </w:p>
     <w:p>
@@ -6837,7 +6903,7 @@
         <w:spacing w:after="60"/>
       </w:pPr>
       <w:r>
-        <w:t xml:space="preserve">La cobertura mediana de 267 días indica sobrestock generalizado.</w:t>
+        <w:t xml:space="preserve">La cobertura mediana de 266.59 días indica sobrestock generalizado.</w:t>
       </w:r>
     </w:p>
     <w:p>
@@ -6876,7 +6942,7 @@
         <w:spacing w:after="60"/>
       </w:pPr>
       <w:r>
-        <w:t xml:space="preserve">Ninguna variable continua es normal: todas presentan sesgo a la derecha y outliers en la cola superior (menos del 1.5% de los datos).</w:t>
+        <w:t xml:space="preserve">Ninguna variable continua es normal: todas presentan sesgo a la derecha, y los valores fuera de ±3.5σ son menos del 1.5% de los datos.</w:t>
       </w:r>
     </w:p>
     <w:p>
@@ -6889,7 +6955,7 @@
         <w:spacing w:after="60"/>
       </w:pPr>
       <w:r>
-        <w:t xml:space="preserve">La canasta típica es de 1–2 piezas (81% de las transacciones) y el ticket mediano es de $109.66.</w:t>
+        <w:t xml:space="preserve">La canasta típica es de 1–2 piezas (80.99% de las transacciones) y el ticket mediano es de $109.66.</w:t>
       </w:r>
     </w:p>
     <w:p>
@@ -6902,7 +6968,7 @@
         <w:spacing w:after="60"/>
       </w:pPr>
       <w:r>
-        <w:t xml:space="preserve">DanuStore solo vende en promedio el 15.7% de las unidades esperadas y su inventario dura ~289 días: existe una sobreestimación sistemática de la demanda.</w:t>
+        <w:t xml:space="preserve">DanuStore solo vende en promedio el 15.69% de las unidades esperadas y su inventario cubre en promedio 289 días: existe una sobreestimación sistemática de la demanda.</w:t>
       </w:r>
     </w:p>
     <w:p>
@@ -6915,7 +6981,7 @@
         <w:spacing w:after="60"/>
       </w:pPr>
       <w:r>
-        <w:t xml:space="preserve">Ciudad de México, Monterrey y Guadalajara concentran el 73.64% de las transacciones y son las regiones con mejor cumplimiento; las regiones pequeñas acumulan el sobrestock (hasta ~480 días de cobertura en Sureste).</w:t>
+        <w:t xml:space="preserve">Ciudad de México, Monterrey y Guadalajara concentran el 73.64% de las transacciones y tienen el mejor cumplimiento; las regiones pequeñas (sobre todo Sureste) acumulan el sobrestock.</w:t>
       </w:r>
     </w:p>
     <w:p>
@@ -6928,7 +6994,7 @@
         <w:spacing w:after="60"/>
       </w:pPr>
       <w:r>
-        <w:t xml:space="preserve">El 92% de las transacciones son de clientes Básico y Silver; el programa de lealtad tiene poca penetración en Gold y Premium.</w:t>
+        <w:t xml:space="preserve">El 92.36% de las transacciones son de clientes Básico y Silver; el programa de lealtad tiene poca penetración en Gold y Premium.</w:t>
       </w:r>
     </w:p>
     <w:p>
@@ -6941,7 +7007,7 @@
         <w:spacing w:after="60"/>
       </w:pPr>
       <w:r>
-        <w:t xml:space="preserve">El nivel socioeconómico es el principal diferenciador del valor del cliente: el nivel Alto gasta ~$42,000 al año contra ~$1,800 del nivel Bajo, por mayor frecuencia de compra y no por ticket más alto.</w:t>
+        <w:t xml:space="preserve">El nivel socioeconómico es el principal diferenciador del valor del cliente: el gasto anual sube de Bajo a Alto por mayor frecuencia de compra, no por un ticket más alto.</w:t>
       </w:r>
     </w:p>
     <w:p>
@@ -6954,7 +7020,7 @@
         <w:spacing w:after="60"/>
       </w:pPr>
       <w:r>
-        <w:t xml:space="preserve">El 62% de los clientes tiene entre 25 y 54 años, pero la edad no cambia el comportamiento de compra (~$7,000 por cliente en todos los rangos).</w:t>
+        <w:t xml:space="preserve">La edad no cambia el comportamiento de compra: todos los rangos tienen distribuciones casi idénticas; el rango 35-44 es el que más vende (23.0% de las ventas).</w:t>
       </w:r>
     </w:p>
     <w:p>

</xml_diff>

<commit_message>
Fill Word report with exact figures computed from the dataset
Co-Authored-By: Claude Opus 5.5 <noreply@anthropic.com>
Claude-Session: https://claude.ai/code/session_01Kk2nfkPg9B6EJa48cu7SnH
</commit_message>
<xml_diff>
--- a/TI3002C_Etapa_4.2_Equipo_6.docx
+++ b/TI3002C_Etapa_4.2_Equipo_6.docx
@@ -3498,13 +3498,7 @@
               <w:jc w:val="left"/>
             </w:pPr>
             <w:r>
-              <w:rPr>
-                <w:b/>
-                <w:bCs/>
-                <w:highlight w:val="yellow"/>
-                <w:highlightCs w:val="yellow"/>
-              </w:rPr>
-              <w:t xml:space="preserve">[Revisar en el código: clientes_por_rango]</w:t>
+              <w:t xml:space="preserve">10,411</w:t>
             </w:r>
           </w:p>
         </w:tc>
@@ -3529,13 +3523,7 @@
               <w:jc w:val="left"/>
             </w:pPr>
             <w:r>
-              <w:rPr>
-                <w:b/>
-                <w:bCs/>
-                <w:highlight w:val="yellow"/>
-                <w:highlightCs w:val="yellow"/>
-              </w:rPr>
-              <w:t xml:space="preserve">[Revisar en el código: %]</w:t>
+              <w:t xml:space="preserve">23.14%</w:t>
             </w:r>
           </w:p>
         </w:tc>
@@ -3687,19 +3675,7 @@
         <w:t xml:space="preserve">Rango_Edad:</w:t>
       </w:r>
       <w:r>
-        <w:t xml:space="preserve"> analizado por clientes únicos; 35-44 es el rango con más clientes. </w:t>
-      </w:r>
-      <w:r>
-        <w:rPr>
-          <w:b/>
-          <w:bCs/>
-          <w:highlight w:val="yellow"/>
-          <w:highlightCs w:val="yellow"/>
-        </w:rPr>
-        <w:t xml:space="preserve">[Revisar en el código: número y % de clientes por rango con print(clientes_por_rango)]</w:t>
-      </w:r>
-      <w:r>
-        <w:t xml:space="preserve"> En ventas: 35-44 genera $72.84 M (23.0% del total), 25-34 $64.51 M (20.4%), 45-54 $58.33 M (18.4%), 65+ $42.14 M (13.3%), 18-24 $39.66 M (12.5%) y 55-64 $39.34 M (12.4%).</w:t>
+        <w:t xml:space="preserve"> analizado con los 44,987 clientes únicos. 35-44 es el rango más frecuente (10,411 clientes, 23.14%), seguido de 25-34 (9,134; 20.30%) y 45-54 (8,329; 18.51%); 65+ tiene 5,963 (13.25%), 55-64 5,608 (12.47%) y 18-24 5,542 (12.32%). El 61.95% de los clientes tiene entre 25 y 54 años. En ventas, 35-44 genera $72.84 M (22.99% del total), 25-34 $64.51 M (20.36%), 45-54 $58.31 M (18.40%), 65+ $42.14 M (13.30%), 18-24 $39.66 M (12.52%) y 55-64 $39.36 M (12.42%). El gasto por cliente es casi igual en todos los rangos: de $6,996.64 (35-44) a $7,156.74 (18-24).</w:t>
       </w:r>
     </w:p>
     <w:p>
@@ -4591,7 +4567,7 @@
         <w:spacing w:after="120"/>
       </w:pPr>
       <w:r>
-        <w:t xml:space="preserve">Rango de 1 a 26 compras al año; media 5.91, Q1 = 3, mediana 5 y Q3 = 8. El 50% central de los registros compra entre 3 y 8 veces al año, y la media es mayor que la mediana (sesgo a la derecha): pocos clientes compran muchas veces. </w:t>
+        <w:t xml:space="preserve">Rango de 1 a 26 compras al año; media 5.91, Q1 = 3, mediana 5 y Q3 = 8. </w:t>
       </w:r>
       <w:r>
         <w:rPr>
@@ -4601,9 +4577,1425 @@
         <w:t xml:space="preserve">Valor más frecuente:</w:t>
       </w:r>
       <w:r>
-        <w:t xml:space="preserve"> [[Revisar en el código: moda y tabla de frecuencias con analisis_frecuencia(data_DanuStore_Diario, ['Annual_Purchase_Frequency'], Ordenar_Valor=True)]]</w:t>
+        <w:t xml:space="preserve"> 4 compras al año (312,409 registros, 13.04%), seguido de 5 (11.91%) y 3 (11.66%). El 71.92% de los registros corresponde a clientes con 7 compras o menos y solo el 1.34% a clientes con más de 15. La media es mayor que la mediana (sesgo a la derecha).</w:t>
       </w:r>
     </w:p>
+    <w:tbl>
+      <w:tblPr>
+        <w:tblW w:type="dxa" w:w="9360"/>
+        <w:tblBorders>
+          <w:top w:val="single" w:color="auto" w:sz="4"/>
+          <w:left w:val="single" w:color="auto" w:sz="4"/>
+          <w:bottom w:val="single" w:color="auto" w:sz="4"/>
+          <w:right w:val="single" w:color="auto" w:sz="4"/>
+          <w:insideH w:val="single" w:color="auto" w:sz="4"/>
+          <w:insideV w:val="single" w:color="auto" w:sz="4"/>
+        </w:tblBorders>
+      </w:tblPr>
+      <w:tblGrid>
+        <w:gridCol w:w="2700"/>
+        <w:gridCol w:w="2220"/>
+        <w:gridCol w:w="2220"/>
+        <w:gridCol w:w="2220"/>
+      </w:tblGrid>
+      <w:tr>
+        <w:trPr>
+          <w:tblHeader/>
+        </w:trPr>
+        <w:tc>
+          <w:tcPr>
+            <w:tcW w:type="dxa" w:w="2700"/>
+            <w:tcBorders>
+              <w:top w:val="single" w:color="999999" w:sz="4"/>
+              <w:left w:val="single" w:color="999999" w:sz="4"/>
+              <w:bottom w:val="single" w:color="999999" w:sz="4"/>
+              <w:right w:val="single" w:color="999999" w:sz="4"/>
+            </w:tcBorders>
+            <w:shd w:fill="1F4E79" w:color="auto" w:val="clear"/>
+            <w:tcMar>
+              <w:top w:type="dxa" w:w="60"/>
+              <w:left w:type="dxa" w:w="100"/>
+              <w:bottom w:type="dxa" w:w="60"/>
+              <w:right w:type="dxa" w:w="100"/>
+            </w:tcMar>
+          </w:tcPr>
+          <w:p>
+            <w:pPr>
+              <w:jc w:val="left"/>
+            </w:pPr>
+            <w:r>
+              <w:rPr>
+                <w:b/>
+                <w:bCs/>
+                <w:color w:val="FFFFFF"/>
+                <w:sz w:val="18"/>
+                <w:szCs w:val="18"/>
+              </w:rPr>
+              <w:t xml:space="preserve">Compras al año</w:t>
+            </w:r>
+          </w:p>
+        </w:tc>
+        <w:tc>
+          <w:tcPr>
+            <w:tcW w:type="dxa" w:w="2220"/>
+            <w:tcBorders>
+              <w:top w:val="single" w:color="999999" w:sz="4"/>
+              <w:left w:val="single" w:color="999999" w:sz="4"/>
+              <w:bottom w:val="single" w:color="999999" w:sz="4"/>
+              <w:right w:val="single" w:color="999999" w:sz="4"/>
+            </w:tcBorders>
+            <w:shd w:fill="1F4E79" w:color="auto" w:val="clear"/>
+            <w:tcMar>
+              <w:top w:type="dxa" w:w="60"/>
+              <w:left w:type="dxa" w:w="100"/>
+              <w:bottom w:type="dxa" w:w="60"/>
+              <w:right w:type="dxa" w:w="100"/>
+            </w:tcMar>
+          </w:tcPr>
+          <w:p>
+            <w:pPr>
+              <w:jc w:val="left"/>
+            </w:pPr>
+            <w:r>
+              <w:rPr>
+                <w:b/>
+                <w:bCs/>
+                <w:color w:val="FFFFFF"/>
+                <w:sz w:val="18"/>
+                <w:szCs w:val="18"/>
+              </w:rPr>
+              <w:t xml:space="preserve">Frecuencia</w:t>
+            </w:r>
+          </w:p>
+        </w:tc>
+        <w:tc>
+          <w:tcPr>
+            <w:tcW w:type="dxa" w:w="2220"/>
+            <w:tcBorders>
+              <w:top w:val="single" w:color="999999" w:sz="4"/>
+              <w:left w:val="single" w:color="999999" w:sz="4"/>
+              <w:bottom w:val="single" w:color="999999" w:sz="4"/>
+              <w:right w:val="single" w:color="999999" w:sz="4"/>
+            </w:tcBorders>
+            <w:shd w:fill="1F4E79" w:color="auto" w:val="clear"/>
+            <w:tcMar>
+              <w:top w:type="dxa" w:w="60"/>
+              <w:left w:type="dxa" w:w="100"/>
+              <w:bottom w:type="dxa" w:w="60"/>
+              <w:right w:type="dxa" w:w="100"/>
+            </w:tcMar>
+          </w:tcPr>
+          <w:p>
+            <w:pPr>
+              <w:jc w:val="left"/>
+            </w:pPr>
+            <w:r>
+              <w:rPr>
+                <w:b/>
+                <w:bCs/>
+                <w:color w:val="FFFFFF"/>
+                <w:sz w:val="18"/>
+                <w:szCs w:val="18"/>
+              </w:rPr>
+              <w:t xml:space="preserve">% Relativo</w:t>
+            </w:r>
+          </w:p>
+        </w:tc>
+        <w:tc>
+          <w:tcPr>
+            <w:tcW w:type="dxa" w:w="2220"/>
+            <w:tcBorders>
+              <w:top w:val="single" w:color="999999" w:sz="4"/>
+              <w:left w:val="single" w:color="999999" w:sz="4"/>
+              <w:bottom w:val="single" w:color="999999" w:sz="4"/>
+              <w:right w:val="single" w:color="999999" w:sz="4"/>
+            </w:tcBorders>
+            <w:shd w:fill="1F4E79" w:color="auto" w:val="clear"/>
+            <w:tcMar>
+              <w:top w:type="dxa" w:w="60"/>
+              <w:left w:type="dxa" w:w="100"/>
+              <w:bottom w:type="dxa" w:w="60"/>
+              <w:right w:type="dxa" w:w="100"/>
+            </w:tcMar>
+          </w:tcPr>
+          <w:p>
+            <w:pPr>
+              <w:jc w:val="left"/>
+            </w:pPr>
+            <w:r>
+              <w:rPr>
+                <w:b/>
+                <w:bCs/>
+                <w:color w:val="FFFFFF"/>
+                <w:sz w:val="18"/>
+                <w:szCs w:val="18"/>
+              </w:rPr>
+              <w:t xml:space="preserve">% Acumulado</w:t>
+            </w:r>
+          </w:p>
+        </w:tc>
+      </w:tr>
+      <w:tr>
+        <w:trPr>
+          <w:tblHeader w:val="false"/>
+        </w:trPr>
+        <w:tc>
+          <w:tcPr>
+            <w:tcW w:type="dxa" w:w="2700"/>
+            <w:tcBorders>
+              <w:top w:val="single" w:color="999999" w:sz="4"/>
+              <w:left w:val="single" w:color="999999" w:sz="4"/>
+              <w:bottom w:val="single" w:color="999999" w:sz="4"/>
+              <w:right w:val="single" w:color="999999" w:sz="4"/>
+            </w:tcBorders>
+            <w:tcMar>
+              <w:top w:type="dxa" w:w="60"/>
+              <w:left w:type="dxa" w:w="100"/>
+              <w:bottom w:type="dxa" w:w="60"/>
+              <w:right w:type="dxa" w:w="100"/>
+            </w:tcMar>
+          </w:tcPr>
+          <w:p>
+            <w:pPr>
+              <w:jc w:val="left"/>
+            </w:pPr>
+            <w:r>
+              <w:t xml:space="preserve">1</w:t>
+            </w:r>
+          </w:p>
+        </w:tc>
+        <w:tc>
+          <w:tcPr>
+            <w:tcW w:type="dxa" w:w="2220"/>
+            <w:tcBorders>
+              <w:top w:val="single" w:color="999999" w:sz="4"/>
+              <w:left w:val="single" w:color="999999" w:sz="4"/>
+              <w:bottom w:val="single" w:color="999999" w:sz="4"/>
+              <w:right w:val="single" w:color="999999" w:sz="4"/>
+            </w:tcBorders>
+            <w:tcMar>
+              <w:top w:type="dxa" w:w="60"/>
+              <w:left w:type="dxa" w:w="100"/>
+              <w:bottom w:type="dxa" w:w="60"/>
+              <w:right w:type="dxa" w:w="100"/>
+            </w:tcMar>
+          </w:tcPr>
+          <w:p>
+            <w:pPr>
+              <w:jc w:val="left"/>
+            </w:pPr>
+            <w:r>
+              <w:t xml:space="preserve">157,861</w:t>
+            </w:r>
+          </w:p>
+        </w:tc>
+        <w:tc>
+          <w:tcPr>
+            <w:tcW w:type="dxa" w:w="2220"/>
+            <w:tcBorders>
+              <w:top w:val="single" w:color="999999" w:sz="4"/>
+              <w:left w:val="single" w:color="999999" w:sz="4"/>
+              <w:bottom w:val="single" w:color="999999" w:sz="4"/>
+              <w:right w:val="single" w:color="999999" w:sz="4"/>
+            </w:tcBorders>
+            <w:tcMar>
+              <w:top w:type="dxa" w:w="60"/>
+              <w:left w:type="dxa" w:w="100"/>
+              <w:bottom w:type="dxa" w:w="60"/>
+              <w:right w:type="dxa" w:w="100"/>
+            </w:tcMar>
+          </w:tcPr>
+          <w:p>
+            <w:pPr>
+              <w:jc w:val="left"/>
+            </w:pPr>
+            <w:r>
+              <w:t xml:space="preserve">6.59%</w:t>
+            </w:r>
+          </w:p>
+        </w:tc>
+        <w:tc>
+          <w:tcPr>
+            <w:tcW w:type="dxa" w:w="2220"/>
+            <w:tcBorders>
+              <w:top w:val="single" w:color="999999" w:sz="4"/>
+              <w:left w:val="single" w:color="999999" w:sz="4"/>
+              <w:bottom w:val="single" w:color="999999" w:sz="4"/>
+              <w:right w:val="single" w:color="999999" w:sz="4"/>
+            </w:tcBorders>
+            <w:tcMar>
+              <w:top w:type="dxa" w:w="60"/>
+              <w:left w:type="dxa" w:w="100"/>
+              <w:bottom w:type="dxa" w:w="60"/>
+              <w:right w:type="dxa" w:w="100"/>
+            </w:tcMar>
+          </w:tcPr>
+          <w:p>
+            <w:pPr>
+              <w:jc w:val="left"/>
+            </w:pPr>
+            <w:r>
+              <w:t xml:space="preserve">6.59%</w:t>
+            </w:r>
+          </w:p>
+        </w:tc>
+      </w:tr>
+      <w:tr>
+        <w:trPr>
+          <w:tblHeader w:val="false"/>
+        </w:trPr>
+        <w:tc>
+          <w:tcPr>
+            <w:tcW w:type="dxa" w:w="2700"/>
+            <w:tcBorders>
+              <w:top w:val="single" w:color="999999" w:sz="4"/>
+              <w:left w:val="single" w:color="999999" w:sz="4"/>
+              <w:bottom w:val="single" w:color="999999" w:sz="4"/>
+              <w:right w:val="single" w:color="999999" w:sz="4"/>
+            </w:tcBorders>
+            <w:tcMar>
+              <w:top w:type="dxa" w:w="60"/>
+              <w:left w:type="dxa" w:w="100"/>
+              <w:bottom w:type="dxa" w:w="60"/>
+              <w:right w:type="dxa" w:w="100"/>
+            </w:tcMar>
+          </w:tcPr>
+          <w:p>
+            <w:pPr>
+              <w:jc w:val="left"/>
+            </w:pPr>
+            <w:r>
+              <w:t xml:space="preserve">2</w:t>
+            </w:r>
+          </w:p>
+        </w:tc>
+        <w:tc>
+          <w:tcPr>
+            <w:tcW w:type="dxa" w:w="2220"/>
+            <w:tcBorders>
+              <w:top w:val="single" w:color="999999" w:sz="4"/>
+              <w:left w:val="single" w:color="999999" w:sz="4"/>
+              <w:bottom w:val="single" w:color="999999" w:sz="4"/>
+              <w:right w:val="single" w:color="999999" w:sz="4"/>
+            </w:tcBorders>
+            <w:tcMar>
+              <w:top w:type="dxa" w:w="60"/>
+              <w:left w:type="dxa" w:w="100"/>
+              <w:bottom w:type="dxa" w:w="60"/>
+              <w:right w:type="dxa" w:w="100"/>
+            </w:tcMar>
+          </w:tcPr>
+          <w:p>
+            <w:pPr>
+              <w:jc w:val="left"/>
+            </w:pPr>
+            <w:r>
+              <w:t xml:space="preserve">217,274</w:t>
+            </w:r>
+          </w:p>
+        </w:tc>
+        <w:tc>
+          <w:tcPr>
+            <w:tcW w:type="dxa" w:w="2220"/>
+            <w:tcBorders>
+              <w:top w:val="single" w:color="999999" w:sz="4"/>
+              <w:left w:val="single" w:color="999999" w:sz="4"/>
+              <w:bottom w:val="single" w:color="999999" w:sz="4"/>
+              <w:right w:val="single" w:color="999999" w:sz="4"/>
+            </w:tcBorders>
+            <w:tcMar>
+              <w:top w:type="dxa" w:w="60"/>
+              <w:left w:type="dxa" w:w="100"/>
+              <w:bottom w:type="dxa" w:w="60"/>
+              <w:right w:type="dxa" w:w="100"/>
+            </w:tcMar>
+          </w:tcPr>
+          <w:p>
+            <w:pPr>
+              <w:jc w:val="left"/>
+            </w:pPr>
+            <w:r>
+              <w:t xml:space="preserve">9.07%</w:t>
+            </w:r>
+          </w:p>
+        </w:tc>
+        <w:tc>
+          <w:tcPr>
+            <w:tcW w:type="dxa" w:w="2220"/>
+            <w:tcBorders>
+              <w:top w:val="single" w:color="999999" w:sz="4"/>
+              <w:left w:val="single" w:color="999999" w:sz="4"/>
+              <w:bottom w:val="single" w:color="999999" w:sz="4"/>
+              <w:right w:val="single" w:color="999999" w:sz="4"/>
+            </w:tcBorders>
+            <w:tcMar>
+              <w:top w:type="dxa" w:w="60"/>
+              <w:left w:type="dxa" w:w="100"/>
+              <w:bottom w:type="dxa" w:w="60"/>
+              <w:right w:type="dxa" w:w="100"/>
+            </w:tcMar>
+          </w:tcPr>
+          <w:p>
+            <w:pPr>
+              <w:jc w:val="left"/>
+            </w:pPr>
+            <w:r>
+              <w:t xml:space="preserve">15.65%</w:t>
+            </w:r>
+          </w:p>
+        </w:tc>
+      </w:tr>
+      <w:tr>
+        <w:trPr>
+          <w:tblHeader w:val="false"/>
+        </w:trPr>
+        <w:tc>
+          <w:tcPr>
+            <w:tcW w:type="dxa" w:w="2700"/>
+            <w:tcBorders>
+              <w:top w:val="single" w:color="999999" w:sz="4"/>
+              <w:left w:val="single" w:color="999999" w:sz="4"/>
+              <w:bottom w:val="single" w:color="999999" w:sz="4"/>
+              <w:right w:val="single" w:color="999999" w:sz="4"/>
+            </w:tcBorders>
+            <w:tcMar>
+              <w:top w:type="dxa" w:w="60"/>
+              <w:left w:type="dxa" w:w="100"/>
+              <w:bottom w:type="dxa" w:w="60"/>
+              <w:right w:type="dxa" w:w="100"/>
+            </w:tcMar>
+          </w:tcPr>
+          <w:p>
+            <w:pPr>
+              <w:jc w:val="left"/>
+            </w:pPr>
+            <w:r>
+              <w:t xml:space="preserve">3</w:t>
+            </w:r>
+          </w:p>
+        </w:tc>
+        <w:tc>
+          <w:tcPr>
+            <w:tcW w:type="dxa" w:w="2220"/>
+            <w:tcBorders>
+              <w:top w:val="single" w:color="999999" w:sz="4"/>
+              <w:left w:val="single" w:color="999999" w:sz="4"/>
+              <w:bottom w:val="single" w:color="999999" w:sz="4"/>
+              <w:right w:val="single" w:color="999999" w:sz="4"/>
+            </w:tcBorders>
+            <w:tcMar>
+              <w:top w:type="dxa" w:w="60"/>
+              <w:left w:type="dxa" w:w="100"/>
+              <w:bottom w:type="dxa" w:w="60"/>
+              <w:right w:type="dxa" w:w="100"/>
+            </w:tcMar>
+          </w:tcPr>
+          <w:p>
+            <w:pPr>
+              <w:jc w:val="left"/>
+            </w:pPr>
+            <w:r>
+              <w:t xml:space="preserve">279,529</w:t>
+            </w:r>
+          </w:p>
+        </w:tc>
+        <w:tc>
+          <w:tcPr>
+            <w:tcW w:type="dxa" w:w="2220"/>
+            <w:tcBorders>
+              <w:top w:val="single" w:color="999999" w:sz="4"/>
+              <w:left w:val="single" w:color="999999" w:sz="4"/>
+              <w:bottom w:val="single" w:color="999999" w:sz="4"/>
+              <w:right w:val="single" w:color="999999" w:sz="4"/>
+            </w:tcBorders>
+            <w:tcMar>
+              <w:top w:type="dxa" w:w="60"/>
+              <w:left w:type="dxa" w:w="100"/>
+              <w:bottom w:type="dxa" w:w="60"/>
+              <w:right w:type="dxa" w:w="100"/>
+            </w:tcMar>
+          </w:tcPr>
+          <w:p>
+            <w:pPr>
+              <w:jc w:val="left"/>
+            </w:pPr>
+            <w:r>
+              <w:t xml:space="preserve">11.66%</w:t>
+            </w:r>
+          </w:p>
+        </w:tc>
+        <w:tc>
+          <w:tcPr>
+            <w:tcW w:type="dxa" w:w="2220"/>
+            <w:tcBorders>
+              <w:top w:val="single" w:color="999999" w:sz="4"/>
+              <w:left w:val="single" w:color="999999" w:sz="4"/>
+              <w:bottom w:val="single" w:color="999999" w:sz="4"/>
+              <w:right w:val="single" w:color="999999" w:sz="4"/>
+            </w:tcBorders>
+            <w:tcMar>
+              <w:top w:type="dxa" w:w="60"/>
+              <w:left w:type="dxa" w:w="100"/>
+              <w:bottom w:type="dxa" w:w="60"/>
+              <w:right w:type="dxa" w:w="100"/>
+            </w:tcMar>
+          </w:tcPr>
+          <w:p>
+            <w:pPr>
+              <w:jc w:val="left"/>
+            </w:pPr>
+            <w:r>
+              <w:t xml:space="preserve">27.32%</w:t>
+            </w:r>
+          </w:p>
+        </w:tc>
+      </w:tr>
+      <w:tr>
+        <w:trPr>
+          <w:tblHeader w:val="false"/>
+        </w:trPr>
+        <w:tc>
+          <w:tcPr>
+            <w:tcW w:type="dxa" w:w="2700"/>
+            <w:tcBorders>
+              <w:top w:val="single" w:color="999999" w:sz="4"/>
+              <w:left w:val="single" w:color="999999" w:sz="4"/>
+              <w:bottom w:val="single" w:color="999999" w:sz="4"/>
+              <w:right w:val="single" w:color="999999" w:sz="4"/>
+            </w:tcBorders>
+            <w:tcMar>
+              <w:top w:type="dxa" w:w="60"/>
+              <w:left w:type="dxa" w:w="100"/>
+              <w:bottom w:type="dxa" w:w="60"/>
+              <w:right w:type="dxa" w:w="100"/>
+            </w:tcMar>
+          </w:tcPr>
+          <w:p>
+            <w:pPr>
+              <w:jc w:val="left"/>
+            </w:pPr>
+            <w:r>
+              <w:t xml:space="preserve">4</w:t>
+            </w:r>
+          </w:p>
+        </w:tc>
+        <w:tc>
+          <w:tcPr>
+            <w:tcW w:type="dxa" w:w="2220"/>
+            <w:tcBorders>
+              <w:top w:val="single" w:color="999999" w:sz="4"/>
+              <w:left w:val="single" w:color="999999" w:sz="4"/>
+              <w:bottom w:val="single" w:color="999999" w:sz="4"/>
+              <w:right w:val="single" w:color="999999" w:sz="4"/>
+            </w:tcBorders>
+            <w:tcMar>
+              <w:top w:type="dxa" w:w="60"/>
+              <w:left w:type="dxa" w:w="100"/>
+              <w:bottom w:type="dxa" w:w="60"/>
+              <w:right w:type="dxa" w:w="100"/>
+            </w:tcMar>
+          </w:tcPr>
+          <w:p>
+            <w:pPr>
+              <w:jc w:val="left"/>
+            </w:pPr>
+            <w:r>
+              <w:t xml:space="preserve">312,409</w:t>
+            </w:r>
+          </w:p>
+        </w:tc>
+        <w:tc>
+          <w:tcPr>
+            <w:tcW w:type="dxa" w:w="2220"/>
+            <w:tcBorders>
+              <w:top w:val="single" w:color="999999" w:sz="4"/>
+              <w:left w:val="single" w:color="999999" w:sz="4"/>
+              <w:bottom w:val="single" w:color="999999" w:sz="4"/>
+              <w:right w:val="single" w:color="999999" w:sz="4"/>
+            </w:tcBorders>
+            <w:tcMar>
+              <w:top w:type="dxa" w:w="60"/>
+              <w:left w:type="dxa" w:w="100"/>
+              <w:bottom w:type="dxa" w:w="60"/>
+              <w:right w:type="dxa" w:w="100"/>
+            </w:tcMar>
+          </w:tcPr>
+          <w:p>
+            <w:pPr>
+              <w:jc w:val="left"/>
+            </w:pPr>
+            <w:r>
+              <w:t xml:space="preserve">13.04%</w:t>
+            </w:r>
+          </w:p>
+        </w:tc>
+        <w:tc>
+          <w:tcPr>
+            <w:tcW w:type="dxa" w:w="2220"/>
+            <w:tcBorders>
+              <w:top w:val="single" w:color="999999" w:sz="4"/>
+              <w:left w:val="single" w:color="999999" w:sz="4"/>
+              <w:bottom w:val="single" w:color="999999" w:sz="4"/>
+              <w:right w:val="single" w:color="999999" w:sz="4"/>
+            </w:tcBorders>
+            <w:tcMar>
+              <w:top w:type="dxa" w:w="60"/>
+              <w:left w:type="dxa" w:w="100"/>
+              <w:bottom w:type="dxa" w:w="60"/>
+              <w:right w:type="dxa" w:w="100"/>
+            </w:tcMar>
+          </w:tcPr>
+          <w:p>
+            <w:pPr>
+              <w:jc w:val="left"/>
+            </w:pPr>
+            <w:r>
+              <w:t xml:space="preserve">40.35%</w:t>
+            </w:r>
+          </w:p>
+        </w:tc>
+      </w:tr>
+      <w:tr>
+        <w:trPr>
+          <w:tblHeader w:val="false"/>
+        </w:trPr>
+        <w:tc>
+          <w:tcPr>
+            <w:tcW w:type="dxa" w:w="2700"/>
+            <w:tcBorders>
+              <w:top w:val="single" w:color="999999" w:sz="4"/>
+              <w:left w:val="single" w:color="999999" w:sz="4"/>
+              <w:bottom w:val="single" w:color="999999" w:sz="4"/>
+              <w:right w:val="single" w:color="999999" w:sz="4"/>
+            </w:tcBorders>
+            <w:tcMar>
+              <w:top w:type="dxa" w:w="60"/>
+              <w:left w:type="dxa" w:w="100"/>
+              <w:bottom w:type="dxa" w:w="60"/>
+              <w:right w:type="dxa" w:w="100"/>
+            </w:tcMar>
+          </w:tcPr>
+          <w:p>
+            <w:pPr>
+              <w:jc w:val="left"/>
+            </w:pPr>
+            <w:r>
+              <w:t xml:space="preserve">5</w:t>
+            </w:r>
+          </w:p>
+        </w:tc>
+        <w:tc>
+          <w:tcPr>
+            <w:tcW w:type="dxa" w:w="2220"/>
+            <w:tcBorders>
+              <w:top w:val="single" w:color="999999" w:sz="4"/>
+              <w:left w:val="single" w:color="999999" w:sz="4"/>
+              <w:bottom w:val="single" w:color="999999" w:sz="4"/>
+              <w:right w:val="single" w:color="999999" w:sz="4"/>
+            </w:tcBorders>
+            <w:tcMar>
+              <w:top w:type="dxa" w:w="60"/>
+              <w:left w:type="dxa" w:w="100"/>
+              <w:bottom w:type="dxa" w:w="60"/>
+              <w:right w:type="dxa" w:w="100"/>
+            </w:tcMar>
+          </w:tcPr>
+          <w:p>
+            <w:pPr>
+              <w:jc w:val="left"/>
+            </w:pPr>
+            <w:r>
+              <w:t xml:space="preserve">285,474</w:t>
+            </w:r>
+          </w:p>
+        </w:tc>
+        <w:tc>
+          <w:tcPr>
+            <w:tcW w:type="dxa" w:w="2220"/>
+            <w:tcBorders>
+              <w:top w:val="single" w:color="999999" w:sz="4"/>
+              <w:left w:val="single" w:color="999999" w:sz="4"/>
+              <w:bottom w:val="single" w:color="999999" w:sz="4"/>
+              <w:right w:val="single" w:color="999999" w:sz="4"/>
+            </w:tcBorders>
+            <w:tcMar>
+              <w:top w:type="dxa" w:w="60"/>
+              <w:left w:type="dxa" w:w="100"/>
+              <w:bottom w:type="dxa" w:w="60"/>
+              <w:right w:type="dxa" w:w="100"/>
+            </w:tcMar>
+          </w:tcPr>
+          <w:p>
+            <w:pPr>
+              <w:jc w:val="left"/>
+            </w:pPr>
+            <w:r>
+              <w:t xml:space="preserve">11.91%</w:t>
+            </w:r>
+          </w:p>
+        </w:tc>
+        <w:tc>
+          <w:tcPr>
+            <w:tcW w:type="dxa" w:w="2220"/>
+            <w:tcBorders>
+              <w:top w:val="single" w:color="999999" w:sz="4"/>
+              <w:left w:val="single" w:color="999999" w:sz="4"/>
+              <w:bottom w:val="single" w:color="999999" w:sz="4"/>
+              <w:right w:val="single" w:color="999999" w:sz="4"/>
+            </w:tcBorders>
+            <w:tcMar>
+              <w:top w:type="dxa" w:w="60"/>
+              <w:left w:type="dxa" w:w="100"/>
+              <w:bottom w:type="dxa" w:w="60"/>
+              <w:right w:type="dxa" w:w="100"/>
+            </w:tcMar>
+          </w:tcPr>
+          <w:p>
+            <w:pPr>
+              <w:jc w:val="left"/>
+            </w:pPr>
+            <w:r>
+              <w:t xml:space="preserve">52.26%</w:t>
+            </w:r>
+          </w:p>
+        </w:tc>
+      </w:tr>
+      <w:tr>
+        <w:trPr>
+          <w:tblHeader w:val="false"/>
+        </w:trPr>
+        <w:tc>
+          <w:tcPr>
+            <w:tcW w:type="dxa" w:w="2700"/>
+            <w:tcBorders>
+              <w:top w:val="single" w:color="999999" w:sz="4"/>
+              <w:left w:val="single" w:color="999999" w:sz="4"/>
+              <w:bottom w:val="single" w:color="999999" w:sz="4"/>
+              <w:right w:val="single" w:color="999999" w:sz="4"/>
+            </w:tcBorders>
+            <w:tcMar>
+              <w:top w:type="dxa" w:w="60"/>
+              <w:left w:type="dxa" w:w="100"/>
+              <w:bottom w:type="dxa" w:w="60"/>
+              <w:right w:type="dxa" w:w="100"/>
+            </w:tcMar>
+          </w:tcPr>
+          <w:p>
+            <w:pPr>
+              <w:jc w:val="left"/>
+            </w:pPr>
+            <w:r>
+              <w:t xml:space="preserve">6</w:t>
+            </w:r>
+          </w:p>
+        </w:tc>
+        <w:tc>
+          <w:tcPr>
+            <w:tcW w:type="dxa" w:w="2220"/>
+            <w:tcBorders>
+              <w:top w:val="single" w:color="999999" w:sz="4"/>
+              <w:left w:val="single" w:color="999999" w:sz="4"/>
+              <w:bottom w:val="single" w:color="999999" w:sz="4"/>
+              <w:right w:val="single" w:color="999999" w:sz="4"/>
+            </w:tcBorders>
+            <w:tcMar>
+              <w:top w:type="dxa" w:w="60"/>
+              <w:left w:type="dxa" w:w="100"/>
+              <w:bottom w:type="dxa" w:w="60"/>
+              <w:right w:type="dxa" w:w="100"/>
+            </w:tcMar>
+          </w:tcPr>
+          <w:p>
+            <w:pPr>
+              <w:jc w:val="left"/>
+            </w:pPr>
+            <w:r>
+              <w:t xml:space="preserve">253,406</w:t>
+            </w:r>
+          </w:p>
+        </w:tc>
+        <w:tc>
+          <w:tcPr>
+            <w:tcW w:type="dxa" w:w="2220"/>
+            <w:tcBorders>
+              <w:top w:val="single" w:color="999999" w:sz="4"/>
+              <w:left w:val="single" w:color="999999" w:sz="4"/>
+              <w:bottom w:val="single" w:color="999999" w:sz="4"/>
+              <w:right w:val="single" w:color="999999" w:sz="4"/>
+            </w:tcBorders>
+            <w:tcMar>
+              <w:top w:type="dxa" w:w="60"/>
+              <w:left w:type="dxa" w:w="100"/>
+              <w:bottom w:type="dxa" w:w="60"/>
+              <w:right w:type="dxa" w:w="100"/>
+            </w:tcMar>
+          </w:tcPr>
+          <w:p>
+            <w:pPr>
+              <w:jc w:val="left"/>
+            </w:pPr>
+            <w:r>
+              <w:t xml:space="preserve">10.57%</w:t>
+            </w:r>
+          </w:p>
+        </w:tc>
+        <w:tc>
+          <w:tcPr>
+            <w:tcW w:type="dxa" w:w="2220"/>
+            <w:tcBorders>
+              <w:top w:val="single" w:color="999999" w:sz="4"/>
+              <w:left w:val="single" w:color="999999" w:sz="4"/>
+              <w:bottom w:val="single" w:color="999999" w:sz="4"/>
+              <w:right w:val="single" w:color="999999" w:sz="4"/>
+            </w:tcBorders>
+            <w:tcMar>
+              <w:top w:type="dxa" w:w="60"/>
+              <w:left w:type="dxa" w:w="100"/>
+              <w:bottom w:type="dxa" w:w="60"/>
+              <w:right w:type="dxa" w:w="100"/>
+            </w:tcMar>
+          </w:tcPr>
+          <w:p>
+            <w:pPr>
+              <w:jc w:val="left"/>
+            </w:pPr>
+            <w:r>
+              <w:t xml:space="preserve">62.84%</w:t>
+            </w:r>
+          </w:p>
+        </w:tc>
+      </w:tr>
+      <w:tr>
+        <w:trPr>
+          <w:tblHeader w:val="false"/>
+        </w:trPr>
+        <w:tc>
+          <w:tcPr>
+            <w:tcW w:type="dxa" w:w="2700"/>
+            <w:tcBorders>
+              <w:top w:val="single" w:color="999999" w:sz="4"/>
+              <w:left w:val="single" w:color="999999" w:sz="4"/>
+              <w:bottom w:val="single" w:color="999999" w:sz="4"/>
+              <w:right w:val="single" w:color="999999" w:sz="4"/>
+            </w:tcBorders>
+            <w:tcMar>
+              <w:top w:type="dxa" w:w="60"/>
+              <w:left w:type="dxa" w:w="100"/>
+              <w:bottom w:type="dxa" w:w="60"/>
+              <w:right w:type="dxa" w:w="100"/>
+            </w:tcMar>
+          </w:tcPr>
+          <w:p>
+            <w:pPr>
+              <w:jc w:val="left"/>
+            </w:pPr>
+            <w:r>
+              <w:t xml:space="preserve">7</w:t>
+            </w:r>
+          </w:p>
+        </w:tc>
+        <w:tc>
+          <w:tcPr>
+            <w:tcW w:type="dxa" w:w="2220"/>
+            <w:tcBorders>
+              <w:top w:val="single" w:color="999999" w:sz="4"/>
+              <w:left w:val="single" w:color="999999" w:sz="4"/>
+              <w:bottom w:val="single" w:color="999999" w:sz="4"/>
+              <w:right w:val="single" w:color="999999" w:sz="4"/>
+            </w:tcBorders>
+            <w:tcMar>
+              <w:top w:type="dxa" w:w="60"/>
+              <w:left w:type="dxa" w:w="100"/>
+              <w:bottom w:type="dxa" w:w="60"/>
+              <w:right w:type="dxa" w:w="100"/>
+            </w:tcMar>
+          </w:tcPr>
+          <w:p>
+            <w:pPr>
+              <w:jc w:val="left"/>
+            </w:pPr>
+            <w:r>
+              <w:t xml:space="preserve">217,804</w:t>
+            </w:r>
+          </w:p>
+        </w:tc>
+        <w:tc>
+          <w:tcPr>
+            <w:tcW w:type="dxa" w:w="2220"/>
+            <w:tcBorders>
+              <w:top w:val="single" w:color="999999" w:sz="4"/>
+              <w:left w:val="single" w:color="999999" w:sz="4"/>
+              <w:bottom w:val="single" w:color="999999" w:sz="4"/>
+              <w:right w:val="single" w:color="999999" w:sz="4"/>
+            </w:tcBorders>
+            <w:tcMar>
+              <w:top w:type="dxa" w:w="60"/>
+              <w:left w:type="dxa" w:w="100"/>
+              <w:bottom w:type="dxa" w:w="60"/>
+              <w:right w:type="dxa" w:w="100"/>
+            </w:tcMar>
+          </w:tcPr>
+          <w:p>
+            <w:pPr>
+              <w:jc w:val="left"/>
+            </w:pPr>
+            <w:r>
+              <w:t xml:space="preserve">9.09%</w:t>
+            </w:r>
+          </w:p>
+        </w:tc>
+        <w:tc>
+          <w:tcPr>
+            <w:tcW w:type="dxa" w:w="2220"/>
+            <w:tcBorders>
+              <w:top w:val="single" w:color="999999" w:sz="4"/>
+              <w:left w:val="single" w:color="999999" w:sz="4"/>
+              <w:bottom w:val="single" w:color="999999" w:sz="4"/>
+              <w:right w:val="single" w:color="999999" w:sz="4"/>
+            </w:tcBorders>
+            <w:tcMar>
+              <w:top w:type="dxa" w:w="60"/>
+              <w:left w:type="dxa" w:w="100"/>
+              <w:bottom w:type="dxa" w:w="60"/>
+              <w:right w:type="dxa" w:w="100"/>
+            </w:tcMar>
+          </w:tcPr>
+          <w:p>
+            <w:pPr>
+              <w:jc w:val="left"/>
+            </w:pPr>
+            <w:r>
+              <w:t xml:space="preserve">71.92%</w:t>
+            </w:r>
+          </w:p>
+        </w:tc>
+      </w:tr>
+      <w:tr>
+        <w:trPr>
+          <w:tblHeader w:val="false"/>
+        </w:trPr>
+        <w:tc>
+          <w:tcPr>
+            <w:tcW w:type="dxa" w:w="2700"/>
+            <w:tcBorders>
+              <w:top w:val="single" w:color="999999" w:sz="4"/>
+              <w:left w:val="single" w:color="999999" w:sz="4"/>
+              <w:bottom w:val="single" w:color="999999" w:sz="4"/>
+              <w:right w:val="single" w:color="999999" w:sz="4"/>
+            </w:tcBorders>
+            <w:tcMar>
+              <w:top w:type="dxa" w:w="60"/>
+              <w:left w:type="dxa" w:w="100"/>
+              <w:bottom w:type="dxa" w:w="60"/>
+              <w:right w:type="dxa" w:w="100"/>
+            </w:tcMar>
+          </w:tcPr>
+          <w:p>
+            <w:pPr>
+              <w:jc w:val="left"/>
+            </w:pPr>
+            <w:r>
+              <w:t xml:space="preserve">8</w:t>
+            </w:r>
+          </w:p>
+        </w:tc>
+        <w:tc>
+          <w:tcPr>
+            <w:tcW w:type="dxa" w:w="2220"/>
+            <w:tcBorders>
+              <w:top w:val="single" w:color="999999" w:sz="4"/>
+              <w:left w:val="single" w:color="999999" w:sz="4"/>
+              <w:bottom w:val="single" w:color="999999" w:sz="4"/>
+              <w:right w:val="single" w:color="999999" w:sz="4"/>
+            </w:tcBorders>
+            <w:tcMar>
+              <w:top w:type="dxa" w:w="60"/>
+              <w:left w:type="dxa" w:w="100"/>
+              <w:bottom w:type="dxa" w:w="60"/>
+              <w:right w:type="dxa" w:w="100"/>
+            </w:tcMar>
+          </w:tcPr>
+          <w:p>
+            <w:pPr>
+              <w:jc w:val="left"/>
+            </w:pPr>
+            <w:r>
+              <w:t xml:space="preserve">173,472</w:t>
+            </w:r>
+          </w:p>
+        </w:tc>
+        <w:tc>
+          <w:tcPr>
+            <w:tcW w:type="dxa" w:w="2220"/>
+            <w:tcBorders>
+              <w:top w:val="single" w:color="999999" w:sz="4"/>
+              <w:left w:val="single" w:color="999999" w:sz="4"/>
+              <w:bottom w:val="single" w:color="999999" w:sz="4"/>
+              <w:right w:val="single" w:color="999999" w:sz="4"/>
+            </w:tcBorders>
+            <w:tcMar>
+              <w:top w:type="dxa" w:w="60"/>
+              <w:left w:type="dxa" w:w="100"/>
+              <w:bottom w:type="dxa" w:w="60"/>
+              <w:right w:type="dxa" w:w="100"/>
+            </w:tcMar>
+          </w:tcPr>
+          <w:p>
+            <w:pPr>
+              <w:jc w:val="left"/>
+            </w:pPr>
+            <w:r>
+              <w:t xml:space="preserve">7.24%</w:t>
+            </w:r>
+          </w:p>
+        </w:tc>
+        <w:tc>
+          <w:tcPr>
+            <w:tcW w:type="dxa" w:w="2220"/>
+            <w:tcBorders>
+              <w:top w:val="single" w:color="999999" w:sz="4"/>
+              <w:left w:val="single" w:color="999999" w:sz="4"/>
+              <w:bottom w:val="single" w:color="999999" w:sz="4"/>
+              <w:right w:val="single" w:color="999999" w:sz="4"/>
+            </w:tcBorders>
+            <w:tcMar>
+              <w:top w:type="dxa" w:w="60"/>
+              <w:left w:type="dxa" w:w="100"/>
+              <w:bottom w:type="dxa" w:w="60"/>
+              <w:right w:type="dxa" w:w="100"/>
+            </w:tcMar>
+          </w:tcPr>
+          <w:p>
+            <w:pPr>
+              <w:jc w:val="left"/>
+            </w:pPr>
+            <w:r>
+              <w:t xml:space="preserve">79.16%</w:t>
+            </w:r>
+          </w:p>
+        </w:tc>
+      </w:tr>
+      <w:tr>
+        <w:trPr>
+          <w:tblHeader w:val="false"/>
+        </w:trPr>
+        <w:tc>
+          <w:tcPr>
+            <w:tcW w:type="dxa" w:w="2700"/>
+            <w:tcBorders>
+              <w:top w:val="single" w:color="999999" w:sz="4"/>
+              <w:left w:val="single" w:color="999999" w:sz="4"/>
+              <w:bottom w:val="single" w:color="999999" w:sz="4"/>
+              <w:right w:val="single" w:color="999999" w:sz="4"/>
+            </w:tcBorders>
+            <w:tcMar>
+              <w:top w:type="dxa" w:w="60"/>
+              <w:left w:type="dxa" w:w="100"/>
+              <w:bottom w:type="dxa" w:w="60"/>
+              <w:right w:type="dxa" w:w="100"/>
+            </w:tcMar>
+          </w:tcPr>
+          <w:p>
+            <w:pPr>
+              <w:jc w:val="left"/>
+            </w:pPr>
+            <w:r>
+              <w:t xml:space="preserve">9</w:t>
+            </w:r>
+          </w:p>
+        </w:tc>
+        <w:tc>
+          <w:tcPr>
+            <w:tcW w:type="dxa" w:w="2220"/>
+            <w:tcBorders>
+              <w:top w:val="single" w:color="999999" w:sz="4"/>
+              <w:left w:val="single" w:color="999999" w:sz="4"/>
+              <w:bottom w:val="single" w:color="999999" w:sz="4"/>
+              <w:right w:val="single" w:color="999999" w:sz="4"/>
+            </w:tcBorders>
+            <w:tcMar>
+              <w:top w:type="dxa" w:w="60"/>
+              <w:left w:type="dxa" w:w="100"/>
+              <w:bottom w:type="dxa" w:w="60"/>
+              <w:right w:type="dxa" w:w="100"/>
+            </w:tcMar>
+          </w:tcPr>
+          <w:p>
+            <w:pPr>
+              <w:jc w:val="left"/>
+            </w:pPr>
+            <w:r>
+              <w:t xml:space="preserve">138,555</w:t>
+            </w:r>
+          </w:p>
+        </w:tc>
+        <w:tc>
+          <w:tcPr>
+            <w:tcW w:type="dxa" w:w="2220"/>
+            <w:tcBorders>
+              <w:top w:val="single" w:color="999999" w:sz="4"/>
+              <w:left w:val="single" w:color="999999" w:sz="4"/>
+              <w:bottom w:val="single" w:color="999999" w:sz="4"/>
+              <w:right w:val="single" w:color="999999" w:sz="4"/>
+            </w:tcBorders>
+            <w:tcMar>
+              <w:top w:type="dxa" w:w="60"/>
+              <w:left w:type="dxa" w:w="100"/>
+              <w:bottom w:type="dxa" w:w="60"/>
+              <w:right w:type="dxa" w:w="100"/>
+            </w:tcMar>
+          </w:tcPr>
+          <w:p>
+            <w:pPr>
+              <w:jc w:val="left"/>
+            </w:pPr>
+            <w:r>
+              <w:t xml:space="preserve">5.78%</w:t>
+            </w:r>
+          </w:p>
+        </w:tc>
+        <w:tc>
+          <w:tcPr>
+            <w:tcW w:type="dxa" w:w="2220"/>
+            <w:tcBorders>
+              <w:top w:val="single" w:color="999999" w:sz="4"/>
+              <w:left w:val="single" w:color="999999" w:sz="4"/>
+              <w:bottom w:val="single" w:color="999999" w:sz="4"/>
+              <w:right w:val="single" w:color="999999" w:sz="4"/>
+            </w:tcBorders>
+            <w:tcMar>
+              <w:top w:type="dxa" w:w="60"/>
+              <w:left w:type="dxa" w:w="100"/>
+              <w:bottom w:type="dxa" w:w="60"/>
+              <w:right w:type="dxa" w:w="100"/>
+            </w:tcMar>
+          </w:tcPr>
+          <w:p>
+            <w:pPr>
+              <w:jc w:val="left"/>
+            </w:pPr>
+            <w:r>
+              <w:t xml:space="preserve">84.94%</w:t>
+            </w:r>
+          </w:p>
+        </w:tc>
+      </w:tr>
+      <w:tr>
+        <w:trPr>
+          <w:tblHeader w:val="false"/>
+        </w:trPr>
+        <w:tc>
+          <w:tcPr>
+            <w:tcW w:type="dxa" w:w="2700"/>
+            <w:tcBorders>
+              <w:top w:val="single" w:color="999999" w:sz="4"/>
+              <w:left w:val="single" w:color="999999" w:sz="4"/>
+              <w:bottom w:val="single" w:color="999999" w:sz="4"/>
+              <w:right w:val="single" w:color="999999" w:sz="4"/>
+            </w:tcBorders>
+            <w:tcMar>
+              <w:top w:type="dxa" w:w="60"/>
+              <w:left w:type="dxa" w:w="100"/>
+              <w:bottom w:type="dxa" w:w="60"/>
+              <w:right w:type="dxa" w:w="100"/>
+            </w:tcMar>
+          </w:tcPr>
+          <w:p>
+            <w:pPr>
+              <w:jc w:val="left"/>
+            </w:pPr>
+            <w:r>
+              <w:t xml:space="preserve">10</w:t>
+            </w:r>
+          </w:p>
+        </w:tc>
+        <w:tc>
+          <w:tcPr>
+            <w:tcW w:type="dxa" w:w="2220"/>
+            <w:tcBorders>
+              <w:top w:val="single" w:color="999999" w:sz="4"/>
+              <w:left w:val="single" w:color="999999" w:sz="4"/>
+              <w:bottom w:val="single" w:color="999999" w:sz="4"/>
+              <w:right w:val="single" w:color="999999" w:sz="4"/>
+            </w:tcBorders>
+            <w:tcMar>
+              <w:top w:type="dxa" w:w="60"/>
+              <w:left w:type="dxa" w:w="100"/>
+              <w:bottom w:type="dxa" w:w="60"/>
+              <w:right w:type="dxa" w:w="100"/>
+            </w:tcMar>
+          </w:tcPr>
+          <w:p>
+            <w:pPr>
+              <w:jc w:val="left"/>
+            </w:pPr>
+            <w:r>
+              <w:t xml:space="preserve">105,900</w:t>
+            </w:r>
+          </w:p>
+        </w:tc>
+        <w:tc>
+          <w:tcPr>
+            <w:tcW w:type="dxa" w:w="2220"/>
+            <w:tcBorders>
+              <w:top w:val="single" w:color="999999" w:sz="4"/>
+              <w:left w:val="single" w:color="999999" w:sz="4"/>
+              <w:bottom w:val="single" w:color="999999" w:sz="4"/>
+              <w:right w:val="single" w:color="999999" w:sz="4"/>
+            </w:tcBorders>
+            <w:tcMar>
+              <w:top w:type="dxa" w:w="60"/>
+              <w:left w:type="dxa" w:w="100"/>
+              <w:bottom w:type="dxa" w:w="60"/>
+              <w:right w:type="dxa" w:w="100"/>
+            </w:tcMar>
+          </w:tcPr>
+          <w:p>
+            <w:pPr>
+              <w:jc w:val="left"/>
+            </w:pPr>
+            <w:r>
+              <w:t xml:space="preserve">4.42%</w:t>
+            </w:r>
+          </w:p>
+        </w:tc>
+        <w:tc>
+          <w:tcPr>
+            <w:tcW w:type="dxa" w:w="2220"/>
+            <w:tcBorders>
+              <w:top w:val="single" w:color="999999" w:sz="4"/>
+              <w:left w:val="single" w:color="999999" w:sz="4"/>
+              <w:bottom w:val="single" w:color="999999" w:sz="4"/>
+              <w:right w:val="single" w:color="999999" w:sz="4"/>
+            </w:tcBorders>
+            <w:tcMar>
+              <w:top w:type="dxa" w:w="60"/>
+              <w:left w:type="dxa" w:w="100"/>
+              <w:bottom w:type="dxa" w:w="60"/>
+              <w:right w:type="dxa" w:w="100"/>
+            </w:tcMar>
+          </w:tcPr>
+          <w:p>
+            <w:pPr>
+              <w:jc w:val="left"/>
+            </w:pPr>
+            <w:r>
+              <w:t xml:space="preserve">89.36%</w:t>
+            </w:r>
+          </w:p>
+        </w:tc>
+      </w:tr>
+      <w:tr>
+        <w:trPr>
+          <w:tblHeader w:val="false"/>
+        </w:trPr>
+        <w:tc>
+          <w:tcPr>
+            <w:tcW w:type="dxa" w:w="2700"/>
+            <w:tcBorders>
+              <w:top w:val="single" w:color="999999" w:sz="4"/>
+              <w:left w:val="single" w:color="999999" w:sz="4"/>
+              <w:bottom w:val="single" w:color="999999" w:sz="4"/>
+              <w:right w:val="single" w:color="999999" w:sz="4"/>
+            </w:tcBorders>
+            <w:tcMar>
+              <w:top w:type="dxa" w:w="60"/>
+              <w:left w:type="dxa" w:w="100"/>
+              <w:bottom w:type="dxa" w:w="60"/>
+              <w:right w:type="dxa" w:w="100"/>
+            </w:tcMar>
+          </w:tcPr>
+          <w:p>
+            <w:pPr>
+              <w:jc w:val="left"/>
+            </w:pPr>
+            <w:r>
+              <w:t xml:space="preserve">11 a 15</w:t>
+            </w:r>
+          </w:p>
+        </w:tc>
+        <w:tc>
+          <w:tcPr>
+            <w:tcW w:type="dxa" w:w="2220"/>
+            <w:tcBorders>
+              <w:top w:val="single" w:color="999999" w:sz="4"/>
+              <w:left w:val="single" w:color="999999" w:sz="4"/>
+              <w:bottom w:val="single" w:color="999999" w:sz="4"/>
+              <w:right w:val="single" w:color="999999" w:sz="4"/>
+            </w:tcBorders>
+            <w:tcMar>
+              <w:top w:type="dxa" w:w="60"/>
+              <w:left w:type="dxa" w:w="100"/>
+              <w:bottom w:type="dxa" w:w="60"/>
+              <w:right w:type="dxa" w:w="100"/>
+            </w:tcMar>
+          </w:tcPr>
+          <w:p>
+            <w:pPr>
+              <w:jc w:val="left"/>
+            </w:pPr>
+            <w:r>
+              <w:t xml:space="preserve">222,983</w:t>
+            </w:r>
+          </w:p>
+        </w:tc>
+        <w:tc>
+          <w:tcPr>
+            <w:tcW w:type="dxa" w:w="2220"/>
+            <w:tcBorders>
+              <w:top w:val="single" w:color="999999" w:sz="4"/>
+              <w:left w:val="single" w:color="999999" w:sz="4"/>
+              <w:bottom w:val="single" w:color="999999" w:sz="4"/>
+              <w:right w:val="single" w:color="999999" w:sz="4"/>
+            </w:tcBorders>
+            <w:tcMar>
+              <w:top w:type="dxa" w:w="60"/>
+              <w:left w:type="dxa" w:w="100"/>
+              <w:bottom w:type="dxa" w:w="60"/>
+              <w:right w:type="dxa" w:w="100"/>
+            </w:tcMar>
+          </w:tcPr>
+          <w:p>
+            <w:pPr>
+              <w:jc w:val="left"/>
+            </w:pPr>
+            <w:r>
+              <w:t xml:space="preserve">9.30%</w:t>
+            </w:r>
+          </w:p>
+        </w:tc>
+        <w:tc>
+          <w:tcPr>
+            <w:tcW w:type="dxa" w:w="2220"/>
+            <w:tcBorders>
+              <w:top w:val="single" w:color="999999" w:sz="4"/>
+              <w:left w:val="single" w:color="999999" w:sz="4"/>
+              <w:bottom w:val="single" w:color="999999" w:sz="4"/>
+              <w:right w:val="single" w:color="999999" w:sz="4"/>
+            </w:tcBorders>
+            <w:tcMar>
+              <w:top w:type="dxa" w:w="60"/>
+              <w:left w:type="dxa" w:w="100"/>
+              <w:bottom w:type="dxa" w:w="60"/>
+              <w:right w:type="dxa" w:w="100"/>
+            </w:tcMar>
+          </w:tcPr>
+          <w:p>
+            <w:pPr>
+              <w:jc w:val="left"/>
+            </w:pPr>
+            <w:r>
+              <w:t xml:space="preserve">98.66%</w:t>
+            </w:r>
+          </w:p>
+        </w:tc>
+      </w:tr>
+      <w:tr>
+        <w:trPr>
+          <w:tblHeader w:val="false"/>
+        </w:trPr>
+        <w:tc>
+          <w:tcPr>
+            <w:tcW w:type="dxa" w:w="2700"/>
+            <w:tcBorders>
+              <w:top w:val="single" w:color="999999" w:sz="4"/>
+              <w:left w:val="single" w:color="999999" w:sz="4"/>
+              <w:bottom w:val="single" w:color="999999" w:sz="4"/>
+              <w:right w:val="single" w:color="999999" w:sz="4"/>
+            </w:tcBorders>
+            <w:tcMar>
+              <w:top w:type="dxa" w:w="60"/>
+              <w:left w:type="dxa" w:w="100"/>
+              <w:bottom w:type="dxa" w:w="60"/>
+              <w:right w:type="dxa" w:w="100"/>
+            </w:tcMar>
+          </w:tcPr>
+          <w:p>
+            <w:pPr>
+              <w:jc w:val="left"/>
+            </w:pPr>
+            <w:r>
+              <w:t xml:space="preserve">16 a 26</w:t>
+            </w:r>
+          </w:p>
+        </w:tc>
+        <w:tc>
+          <w:tcPr>
+            <w:tcW w:type="dxa" w:w="2220"/>
+            <w:tcBorders>
+              <w:top w:val="single" w:color="999999" w:sz="4"/>
+              <w:left w:val="single" w:color="999999" w:sz="4"/>
+              <w:bottom w:val="single" w:color="999999" w:sz="4"/>
+              <w:right w:val="single" w:color="999999" w:sz="4"/>
+            </w:tcBorders>
+            <w:tcMar>
+              <w:top w:type="dxa" w:w="60"/>
+              <w:left w:type="dxa" w:w="100"/>
+              <w:bottom w:type="dxa" w:w="60"/>
+              <w:right w:type="dxa" w:w="100"/>
+            </w:tcMar>
+          </w:tcPr>
+          <w:p>
+            <w:pPr>
+              <w:jc w:val="left"/>
+            </w:pPr>
+            <w:r>
+              <w:t xml:space="preserve">31,996</w:t>
+            </w:r>
+          </w:p>
+        </w:tc>
+        <w:tc>
+          <w:tcPr>
+            <w:tcW w:type="dxa" w:w="2220"/>
+            <w:tcBorders>
+              <w:top w:val="single" w:color="999999" w:sz="4"/>
+              <w:left w:val="single" w:color="999999" w:sz="4"/>
+              <w:bottom w:val="single" w:color="999999" w:sz="4"/>
+              <w:right w:val="single" w:color="999999" w:sz="4"/>
+            </w:tcBorders>
+            <w:tcMar>
+              <w:top w:type="dxa" w:w="60"/>
+              <w:left w:type="dxa" w:w="100"/>
+              <w:bottom w:type="dxa" w:w="60"/>
+              <w:right w:type="dxa" w:w="100"/>
+            </w:tcMar>
+          </w:tcPr>
+          <w:p>
+            <w:pPr>
+              <w:jc w:val="left"/>
+            </w:pPr>
+            <w:r>
+              <w:t xml:space="preserve">1.34%</w:t>
+            </w:r>
+          </w:p>
+        </w:tc>
+        <w:tc>
+          <w:tcPr>
+            <w:tcW w:type="dxa" w:w="2220"/>
+            <w:tcBorders>
+              <w:top w:val="single" w:color="999999" w:sz="4"/>
+              <w:left w:val="single" w:color="999999" w:sz="4"/>
+              <w:bottom w:val="single" w:color="999999" w:sz="4"/>
+              <w:right w:val="single" w:color="999999" w:sz="4"/>
+            </w:tcBorders>
+            <w:tcMar>
+              <w:top w:type="dxa" w:w="60"/>
+              <w:left w:type="dxa" w:w="100"/>
+              <w:bottom w:type="dxa" w:w="60"/>
+              <w:right w:type="dxa" w:w="100"/>
+            </w:tcMar>
+          </w:tcPr>
+          <w:p>
+            <w:pPr>
+              <w:jc w:val="left"/>
+            </w:pPr>
+            <w:r>
+              <w:t xml:space="preserve">100.00%</w:t>
+            </w:r>
+          </w:p>
+        </w:tc>
+      </w:tr>
+    </w:tbl>
     <w:p>
       <w:pPr>
         <w:spacing w:after="120"/>
@@ -4946,62 +6338,1738 @@
     </w:tbl>
     <w:p>
       <w:pPr>
-        <w:spacing w:after="120"/>
-      </w:pPr>
-      <w:r>
-        <w:t xml:space="preserve">Intervalos más frecuentes de cada histograma: </w:t>
-      </w:r>
-      <w:r>
-        <w:rPr>
-          <w:b/>
-          <w:bCs/>
-          <w:highlight w:val="yellow"/>
-          <w:highlightCs w:val="yellow"/>
-        </w:rPr>
-        <w:t xml:space="preserve">[Revisar en el código: leer la barra más alta de cada histograma]</w:t>
+        <w:pStyle w:val="Heading3"/>
+        <w:spacing w:after="80" w:before="120"/>
+      </w:pPr>
+      <w:r>
+        <w:t xml:space="preserve">Intervalos más frecuentes (histogramas con regla de Sturges)</w:t>
+      </w:r>
+    </w:p>
+    <w:tbl>
+      <w:tblPr>
+        <w:tblW w:type="dxa" w:w="9360"/>
+        <w:tblBorders>
+          <w:top w:val="single" w:color="auto" w:sz="4"/>
+          <w:left w:val="single" w:color="auto" w:sz="4"/>
+          <w:bottom w:val="single" w:color="auto" w:sz="4"/>
+          <w:right w:val="single" w:color="auto" w:sz="4"/>
+          <w:insideH w:val="single" w:color="auto" w:sz="4"/>
+          <w:insideV w:val="single" w:color="auto" w:sz="4"/>
+        </w:tblBorders>
+      </w:tblPr>
+      <w:tblGrid>
+        <w:gridCol w:w="3000"/>
+        <w:gridCol w:w="1700"/>
+        <w:gridCol w:w="2760"/>
+        <w:gridCol w:w="1900"/>
+      </w:tblGrid>
+      <w:tr>
+        <w:trPr>
+          <w:tblHeader/>
+        </w:trPr>
+        <w:tc>
+          <w:tcPr>
+            <w:tcW w:type="dxa" w:w="3000"/>
+            <w:tcBorders>
+              <w:top w:val="single" w:color="999999" w:sz="4"/>
+              <w:left w:val="single" w:color="999999" w:sz="4"/>
+              <w:bottom w:val="single" w:color="999999" w:sz="4"/>
+              <w:right w:val="single" w:color="999999" w:sz="4"/>
+            </w:tcBorders>
+            <w:shd w:fill="1F4E79" w:color="auto" w:val="clear"/>
+            <w:tcMar>
+              <w:top w:type="dxa" w:w="60"/>
+              <w:left w:type="dxa" w:w="100"/>
+              <w:bottom w:type="dxa" w:w="60"/>
+              <w:right w:type="dxa" w:w="100"/>
+            </w:tcMar>
+          </w:tcPr>
+          <w:p>
+            <w:pPr>
+              <w:jc w:val="left"/>
+            </w:pPr>
+            <w:r>
+              <w:rPr>
+                <w:b/>
+                <w:bCs/>
+                <w:color w:val="FFFFFF"/>
+                <w:sz w:val="18"/>
+                <w:szCs w:val="18"/>
+              </w:rPr>
+              <w:t xml:space="preserve">Variable</w:t>
+            </w:r>
+          </w:p>
+        </w:tc>
+        <w:tc>
+          <w:tcPr>
+            <w:tcW w:type="dxa" w:w="1700"/>
+            <w:tcBorders>
+              <w:top w:val="single" w:color="999999" w:sz="4"/>
+              <w:left w:val="single" w:color="999999" w:sz="4"/>
+              <w:bottom w:val="single" w:color="999999" w:sz="4"/>
+              <w:right w:val="single" w:color="999999" w:sz="4"/>
+            </w:tcBorders>
+            <w:shd w:fill="1F4E79" w:color="auto" w:val="clear"/>
+            <w:tcMar>
+              <w:top w:type="dxa" w:w="60"/>
+              <w:left w:type="dxa" w:w="100"/>
+              <w:bottom w:type="dxa" w:w="60"/>
+              <w:right w:type="dxa" w:w="100"/>
+            </w:tcMar>
+          </w:tcPr>
+          <w:p>
+            <w:pPr>
+              <w:jc w:val="left"/>
+            </w:pPr>
+            <w:r>
+              <w:rPr>
+                <w:b/>
+                <w:bCs/>
+                <w:color w:val="FFFFFF"/>
+                <w:sz w:val="18"/>
+                <w:szCs w:val="18"/>
+              </w:rPr>
+              <w:t xml:space="preserve">N.º de intervalos</w:t>
+            </w:r>
+          </w:p>
+        </w:tc>
+        <w:tc>
+          <w:tcPr>
+            <w:tcW w:type="dxa" w:w="2760"/>
+            <w:tcBorders>
+              <w:top w:val="single" w:color="999999" w:sz="4"/>
+              <w:left w:val="single" w:color="999999" w:sz="4"/>
+              <w:bottom w:val="single" w:color="999999" w:sz="4"/>
+              <w:right w:val="single" w:color="999999" w:sz="4"/>
+            </w:tcBorders>
+            <w:shd w:fill="1F4E79" w:color="auto" w:val="clear"/>
+            <w:tcMar>
+              <w:top w:type="dxa" w:w="60"/>
+              <w:left w:type="dxa" w:w="100"/>
+              <w:bottom w:type="dxa" w:w="60"/>
+              <w:right w:type="dxa" w:w="100"/>
+            </w:tcMar>
+          </w:tcPr>
+          <w:p>
+            <w:pPr>
+              <w:jc w:val="left"/>
+            </w:pPr>
+            <w:r>
+              <w:rPr>
+                <w:b/>
+                <w:bCs/>
+                <w:color w:val="FFFFFF"/>
+                <w:sz w:val="18"/>
+                <w:szCs w:val="18"/>
+              </w:rPr>
+              <w:t xml:space="preserve">Intervalo más frecuente</w:t>
+            </w:r>
+          </w:p>
+        </w:tc>
+        <w:tc>
+          <w:tcPr>
+            <w:tcW w:type="dxa" w:w="1900"/>
+            <w:tcBorders>
+              <w:top w:val="single" w:color="999999" w:sz="4"/>
+              <w:left w:val="single" w:color="999999" w:sz="4"/>
+              <w:bottom w:val="single" w:color="999999" w:sz="4"/>
+              <w:right w:val="single" w:color="999999" w:sz="4"/>
+            </w:tcBorders>
+            <w:shd w:fill="1F4E79" w:color="auto" w:val="clear"/>
+            <w:tcMar>
+              <w:top w:type="dxa" w:w="60"/>
+              <w:left w:type="dxa" w:w="100"/>
+              <w:bottom w:type="dxa" w:w="60"/>
+              <w:right w:type="dxa" w:w="100"/>
+            </w:tcMar>
+          </w:tcPr>
+          <w:p>
+            <w:pPr>
+              <w:jc w:val="left"/>
+            </w:pPr>
+            <w:r>
+              <w:rPr>
+                <w:b/>
+                <w:bCs/>
+                <w:color w:val="FFFFFF"/>
+                <w:sz w:val="18"/>
+                <w:szCs w:val="18"/>
+              </w:rPr>
+              <w:t xml:space="preserve">% de los datos</w:t>
+            </w:r>
+          </w:p>
+        </w:tc>
+      </w:tr>
+      <w:tr>
+        <w:trPr>
+          <w:tblHeader w:val="false"/>
+        </w:trPr>
+        <w:tc>
+          <w:tcPr>
+            <w:tcW w:type="dxa" w:w="3000"/>
+            <w:tcBorders>
+              <w:top w:val="single" w:color="999999" w:sz="4"/>
+              <w:left w:val="single" w:color="999999" w:sz="4"/>
+              <w:bottom w:val="single" w:color="999999" w:sz="4"/>
+              <w:right w:val="single" w:color="999999" w:sz="4"/>
+            </w:tcBorders>
+            <w:tcMar>
+              <w:top w:type="dxa" w:w="60"/>
+              <w:left w:type="dxa" w:w="100"/>
+              <w:bottom w:type="dxa" w:w="60"/>
+              <w:right w:type="dxa" w:w="100"/>
+            </w:tcMar>
+          </w:tcPr>
+          <w:p>
+            <w:pPr>
+              <w:jc w:val="left"/>
+            </w:pPr>
+            <w:r>
+              <w:t xml:space="preserve">sales_amount</w:t>
+            </w:r>
+          </w:p>
+        </w:tc>
+        <w:tc>
+          <w:tcPr>
+            <w:tcW w:type="dxa" w:w="1700"/>
+            <w:tcBorders>
+              <w:top w:val="single" w:color="999999" w:sz="4"/>
+              <w:left w:val="single" w:color="999999" w:sz="4"/>
+              <w:bottom w:val="single" w:color="999999" w:sz="4"/>
+              <w:right w:val="single" w:color="999999" w:sz="4"/>
+            </w:tcBorders>
+            <w:tcMar>
+              <w:top w:type="dxa" w:w="60"/>
+              <w:left w:type="dxa" w:w="100"/>
+              <w:bottom w:type="dxa" w:w="60"/>
+              <w:right w:type="dxa" w:w="100"/>
+            </w:tcMar>
+          </w:tcPr>
+          <w:p>
+            <w:pPr>
+              <w:jc w:val="left"/>
+            </w:pPr>
+            <w:r>
+              <w:t xml:space="preserve">23</w:t>
+            </w:r>
+          </w:p>
+        </w:tc>
+        <w:tc>
+          <w:tcPr>
+            <w:tcW w:type="dxa" w:w="2760"/>
+            <w:tcBorders>
+              <w:top w:val="single" w:color="999999" w:sz="4"/>
+              <w:left w:val="single" w:color="999999" w:sz="4"/>
+              <w:bottom w:val="single" w:color="999999" w:sz="4"/>
+              <w:right w:val="single" w:color="999999" w:sz="4"/>
+            </w:tcBorders>
+            <w:tcMar>
+              <w:top w:type="dxa" w:w="60"/>
+              <w:left w:type="dxa" w:w="100"/>
+              <w:bottom w:type="dxa" w:w="60"/>
+              <w:right w:type="dxa" w:w="100"/>
+            </w:tcMar>
+          </w:tcPr>
+          <w:p>
+            <w:pPr>
+              <w:jc w:val="left"/>
+            </w:pPr>
+            <w:r>
+              <w:t xml:space="preserve">$58.06 – $102.41</w:t>
+            </w:r>
+          </w:p>
+        </w:tc>
+        <w:tc>
+          <w:tcPr>
+            <w:tcW w:type="dxa" w:w="1900"/>
+            <w:tcBorders>
+              <w:top w:val="single" w:color="999999" w:sz="4"/>
+              <w:left w:val="single" w:color="999999" w:sz="4"/>
+              <w:bottom w:val="single" w:color="999999" w:sz="4"/>
+              <w:right w:val="single" w:color="999999" w:sz="4"/>
+            </w:tcBorders>
+            <w:tcMar>
+              <w:top w:type="dxa" w:w="60"/>
+              <w:left w:type="dxa" w:w="100"/>
+              <w:bottom w:type="dxa" w:w="60"/>
+              <w:right w:type="dxa" w:w="100"/>
+            </w:tcMar>
+          </w:tcPr>
+          <w:p>
+            <w:pPr>
+              <w:jc w:val="left"/>
+            </w:pPr>
+            <w:r>
+              <w:t xml:space="preserve">27.22%</w:t>
+            </w:r>
+          </w:p>
+        </w:tc>
+      </w:tr>
+      <w:tr>
+        <w:trPr>
+          <w:tblHeader w:val="false"/>
+        </w:trPr>
+        <w:tc>
+          <w:tcPr>
+            <w:tcW w:type="dxa" w:w="3000"/>
+            <w:tcBorders>
+              <w:top w:val="single" w:color="999999" w:sz="4"/>
+              <w:left w:val="single" w:color="999999" w:sz="4"/>
+              <w:bottom w:val="single" w:color="999999" w:sz="4"/>
+              <w:right w:val="single" w:color="999999" w:sz="4"/>
+            </w:tcBorders>
+            <w:tcMar>
+              <w:top w:type="dxa" w:w="60"/>
+              <w:left w:type="dxa" w:w="100"/>
+              <w:bottom w:type="dxa" w:w="60"/>
+              <w:right w:type="dxa" w:w="100"/>
+            </w:tcMar>
+          </w:tcPr>
+          <w:p>
+            <w:pPr>
+              <w:jc w:val="left"/>
+            </w:pPr>
+            <w:r>
+              <w:t xml:space="preserve">Annual_Total_Spend</w:t>
+            </w:r>
+          </w:p>
+        </w:tc>
+        <w:tc>
+          <w:tcPr>
+            <w:tcW w:type="dxa" w:w="1700"/>
+            <w:tcBorders>
+              <w:top w:val="single" w:color="999999" w:sz="4"/>
+              <w:left w:val="single" w:color="999999" w:sz="4"/>
+              <w:bottom w:val="single" w:color="999999" w:sz="4"/>
+              <w:right w:val="single" w:color="999999" w:sz="4"/>
+            </w:tcBorders>
+            <w:tcMar>
+              <w:top w:type="dxa" w:w="60"/>
+              <w:left w:type="dxa" w:w="100"/>
+              <w:bottom w:type="dxa" w:w="60"/>
+              <w:right w:type="dxa" w:w="100"/>
+            </w:tcMar>
+          </w:tcPr>
+          <w:p>
+            <w:pPr>
+              <w:jc w:val="left"/>
+            </w:pPr>
+            <w:r>
+              <w:t xml:space="preserve">23</w:t>
+            </w:r>
+          </w:p>
+        </w:tc>
+        <w:tc>
+          <w:tcPr>
+            <w:tcW w:type="dxa" w:w="2760"/>
+            <w:tcBorders>
+              <w:top w:val="single" w:color="999999" w:sz="4"/>
+              <w:left w:val="single" w:color="999999" w:sz="4"/>
+              <w:bottom w:val="single" w:color="999999" w:sz="4"/>
+              <w:right w:val="single" w:color="999999" w:sz="4"/>
+            </w:tcBorders>
+            <w:tcMar>
+              <w:top w:type="dxa" w:w="60"/>
+              <w:left w:type="dxa" w:w="100"/>
+              <w:bottom w:type="dxa" w:w="60"/>
+              <w:right w:type="dxa" w:w="100"/>
+            </w:tcMar>
+          </w:tcPr>
+          <w:p>
+            <w:pPr>
+              <w:jc w:val="left"/>
+            </w:pPr>
+            <w:r>
+              <w:t xml:space="preserve">$150.00 – $5,304.79</w:t>
+            </w:r>
+          </w:p>
+        </w:tc>
+        <w:tc>
+          <w:tcPr>
+            <w:tcW w:type="dxa" w:w="1900"/>
+            <w:tcBorders>
+              <w:top w:val="single" w:color="999999" w:sz="4"/>
+              <w:left w:val="single" w:color="999999" w:sz="4"/>
+              <w:bottom w:val="single" w:color="999999" w:sz="4"/>
+              <w:right w:val="single" w:color="999999" w:sz="4"/>
+            </w:tcBorders>
+            <w:tcMar>
+              <w:top w:type="dxa" w:w="60"/>
+              <w:left w:type="dxa" w:w="100"/>
+              <w:bottom w:type="dxa" w:w="60"/>
+              <w:right w:type="dxa" w:w="100"/>
+            </w:tcMar>
+          </w:tcPr>
+          <w:p>
+            <w:pPr>
+              <w:jc w:val="left"/>
+            </w:pPr>
+            <w:r>
+              <w:t xml:space="preserve">42.70%</w:t>
+            </w:r>
+          </w:p>
+        </w:tc>
+      </w:tr>
+      <w:tr>
+        <w:trPr>
+          <w:tblHeader w:val="false"/>
+        </w:trPr>
+        <w:tc>
+          <w:tcPr>
+            <w:tcW w:type="dxa" w:w="3000"/>
+            <w:tcBorders>
+              <w:top w:val="single" w:color="999999" w:sz="4"/>
+              <w:left w:val="single" w:color="999999" w:sz="4"/>
+              <w:bottom w:val="single" w:color="999999" w:sz="4"/>
+              <w:right w:val="single" w:color="999999" w:sz="4"/>
+            </w:tcBorders>
+            <w:tcMar>
+              <w:top w:type="dxa" w:w="60"/>
+              <w:left w:type="dxa" w:w="100"/>
+              <w:bottom w:type="dxa" w:w="60"/>
+              <w:right w:type="dxa" w:w="100"/>
+            </w:tcMar>
+          </w:tcPr>
+          <w:p>
+            <w:pPr>
+              <w:jc w:val="left"/>
+            </w:pPr>
+            <w:r>
+              <w:t xml:space="preserve">Cumplimiento_Venta_Esperada</w:t>
+            </w:r>
+          </w:p>
+        </w:tc>
+        <w:tc>
+          <w:tcPr>
+            <w:tcW w:type="dxa" w:w="1700"/>
+            <w:tcBorders>
+              <w:top w:val="single" w:color="999999" w:sz="4"/>
+              <w:left w:val="single" w:color="999999" w:sz="4"/>
+              <w:bottom w:val="single" w:color="999999" w:sz="4"/>
+              <w:right w:val="single" w:color="999999" w:sz="4"/>
+            </w:tcBorders>
+            <w:tcMar>
+              <w:top w:type="dxa" w:w="60"/>
+              <w:left w:type="dxa" w:w="100"/>
+              <w:bottom w:type="dxa" w:w="60"/>
+              <w:right w:type="dxa" w:w="100"/>
+            </w:tcMar>
+          </w:tcPr>
+          <w:p>
+            <w:pPr>
+              <w:jc w:val="left"/>
+            </w:pPr>
+            <w:r>
+              <w:t xml:space="preserve">16</w:t>
+            </w:r>
+          </w:p>
+        </w:tc>
+        <w:tc>
+          <w:tcPr>
+            <w:tcW w:type="dxa" w:w="2760"/>
+            <w:tcBorders>
+              <w:top w:val="single" w:color="999999" w:sz="4"/>
+              <w:left w:val="single" w:color="999999" w:sz="4"/>
+              <w:bottom w:val="single" w:color="999999" w:sz="4"/>
+              <w:right w:val="single" w:color="999999" w:sz="4"/>
+            </w:tcBorders>
+            <w:tcMar>
+              <w:top w:type="dxa" w:w="60"/>
+              <w:left w:type="dxa" w:w="100"/>
+              <w:bottom w:type="dxa" w:w="60"/>
+              <w:right w:type="dxa" w:w="100"/>
+            </w:tcMar>
+          </w:tcPr>
+          <w:p>
+            <w:pPr>
+              <w:jc w:val="left"/>
+            </w:pPr>
+            <w:r>
+              <w:t xml:space="preserve">6.20% – 9.64%</w:t>
+            </w:r>
+          </w:p>
+        </w:tc>
+        <w:tc>
+          <w:tcPr>
+            <w:tcW w:type="dxa" w:w="1900"/>
+            <w:tcBorders>
+              <w:top w:val="single" w:color="999999" w:sz="4"/>
+              <w:left w:val="single" w:color="999999" w:sz="4"/>
+              <w:bottom w:val="single" w:color="999999" w:sz="4"/>
+              <w:right w:val="single" w:color="999999" w:sz="4"/>
+            </w:tcBorders>
+            <w:tcMar>
+              <w:top w:type="dxa" w:w="60"/>
+              <w:left w:type="dxa" w:w="100"/>
+              <w:bottom w:type="dxa" w:w="60"/>
+              <w:right w:type="dxa" w:w="100"/>
+            </w:tcMar>
+          </w:tcPr>
+          <w:p>
+            <w:pPr>
+              <w:jc w:val="left"/>
+            </w:pPr>
+            <w:r>
+              <w:t xml:space="preserve">28.62%</w:t>
+            </w:r>
+          </w:p>
+        </w:tc>
+      </w:tr>
+      <w:tr>
+        <w:trPr>
+          <w:tblHeader w:val="false"/>
+        </w:trPr>
+        <w:tc>
+          <w:tcPr>
+            <w:tcW w:type="dxa" w:w="3000"/>
+            <w:tcBorders>
+              <w:top w:val="single" w:color="999999" w:sz="4"/>
+              <w:left w:val="single" w:color="999999" w:sz="4"/>
+              <w:bottom w:val="single" w:color="999999" w:sz="4"/>
+              <w:right w:val="single" w:color="999999" w:sz="4"/>
+            </w:tcBorders>
+            <w:tcMar>
+              <w:top w:type="dxa" w:w="60"/>
+              <w:left w:type="dxa" w:w="100"/>
+              <w:bottom w:type="dxa" w:w="60"/>
+              <w:right w:type="dxa" w:w="100"/>
+            </w:tcMar>
+          </w:tcPr>
+          <w:p>
+            <w:pPr>
+              <w:jc w:val="left"/>
+            </w:pPr>
+            <w:r>
+              <w:t xml:space="preserve">Dias_Cobertura_Inventario</w:t>
+            </w:r>
+          </w:p>
+        </w:tc>
+        <w:tc>
+          <w:tcPr>
+            <w:tcW w:type="dxa" w:w="1700"/>
+            <w:tcBorders>
+              <w:top w:val="single" w:color="999999" w:sz="4"/>
+              <w:left w:val="single" w:color="999999" w:sz="4"/>
+              <w:bottom w:val="single" w:color="999999" w:sz="4"/>
+              <w:right w:val="single" w:color="999999" w:sz="4"/>
+            </w:tcBorders>
+            <w:tcMar>
+              <w:top w:type="dxa" w:w="60"/>
+              <w:left w:type="dxa" w:w="100"/>
+              <w:bottom w:type="dxa" w:w="60"/>
+              <w:right w:type="dxa" w:w="100"/>
+            </w:tcMar>
+          </w:tcPr>
+          <w:p>
+            <w:pPr>
+              <w:jc w:val="left"/>
+            </w:pPr>
+            <w:r>
+              <w:t xml:space="preserve">16</w:t>
+            </w:r>
+          </w:p>
+        </w:tc>
+        <w:tc>
+          <w:tcPr>
+            <w:tcW w:type="dxa" w:w="2760"/>
+            <w:tcBorders>
+              <w:top w:val="single" w:color="999999" w:sz="4"/>
+              <w:left w:val="single" w:color="999999" w:sz="4"/>
+              <w:bottom w:val="single" w:color="999999" w:sz="4"/>
+              <w:right w:val="single" w:color="999999" w:sz="4"/>
+            </w:tcBorders>
+            <w:tcMar>
+              <w:top w:type="dxa" w:w="60"/>
+              <w:left w:type="dxa" w:w="100"/>
+              <w:bottom w:type="dxa" w:w="60"/>
+              <w:right w:type="dxa" w:w="100"/>
+            </w:tcMar>
+          </w:tcPr>
+          <w:p>
+            <w:pPr>
+              <w:jc w:val="left"/>
+            </w:pPr>
+            <w:r>
+              <w:t xml:space="preserve">120.02 – 203.85 días</w:t>
+            </w:r>
+          </w:p>
+        </w:tc>
+        <w:tc>
+          <w:tcPr>
+            <w:tcW w:type="dxa" w:w="1900"/>
+            <w:tcBorders>
+              <w:top w:val="single" w:color="999999" w:sz="4"/>
+              <w:left w:val="single" w:color="999999" w:sz="4"/>
+              <w:bottom w:val="single" w:color="999999" w:sz="4"/>
+              <w:right w:val="single" w:color="999999" w:sz="4"/>
+            </w:tcBorders>
+            <w:tcMar>
+              <w:top w:type="dxa" w:w="60"/>
+              <w:left w:type="dxa" w:w="100"/>
+              <w:bottom w:type="dxa" w:w="60"/>
+              <w:right w:type="dxa" w:w="100"/>
+            </w:tcMar>
+          </w:tcPr>
+          <w:p>
+            <w:pPr>
+              <w:jc w:val="left"/>
+            </w:pPr>
+            <w:r>
+              <w:t xml:space="preserve">24.52%</w:t>
+            </w:r>
+          </w:p>
+        </w:tc>
+      </w:tr>
+    </w:tbl>
+    <w:p>
+      <w:pPr>
+        <w:pStyle w:val="Heading2"/>
+        <w:spacing w:after="100" w:before="180"/>
+      </w:pPr>
+      <w:r>
+        <w:t xml:space="preserve">D. Conclusión de histogramas y boxplots</w:t>
       </w:r>
     </w:p>
     <w:p>
       <w:pPr>
+        <w:spacing w:after="120"/>
+      </w:pPr>
+      <w:r>
+        <w:t xml:space="preserve">Ninguna variable continua sigue una distribución normal: en todas la media es mayor que la mediana (sesgo a la derecha), con la mayoría de los valores en la parte baja y una cola de valores altos. Los valores fuera de ±3.5σ son menos del 1.5% en todos los casos y corresponden a casos reales del negocio (compras grandes, clientes de alto valor, productos con muy baja rotación), por lo que no se eliminan.</w:t>
+      </w:r>
+    </w:p>
+    <w:p>
+      <w:pPr>
+        <w:pStyle w:val="Heading1"/>
+        <w:spacing w:after="120" w:before="240"/>
+      </w:pPr>
+      <w:r>
+        <w:t xml:space="preserve">V. Análisis de variables cuantitativas respecto a variables cualitativas</w:t>
+      </w:r>
+    </w:p>
+    <w:p>
+      <w:pPr>
+        <w:spacing w:after="120"/>
+      </w:pPr>
+      <w:r>
+        <w:t xml:space="preserve">Para cada variable cualitativa se graficaron boxplots de las variables cuantitativas de su mismo nivel, incluyendo una caja de "Todos los datos" como referencia. En subcategory se aplicó la regla del 70% de las unidades vendidas.</w:t>
+      </w:r>
+    </w:p>
+    <w:p>
+      <w:pPr>
         <w:pStyle w:val="Heading2"/>
         <w:spacing w:after="100" w:before="180"/>
       </w:pPr>
       <w:r>
-        <w:t xml:space="preserve">D. Conclusión de histogramas y boxplots</w:t>
+        <w:t xml:space="preserve">5.1 Nivel Macro (category, subcategory, region)</w:t>
       </w:r>
     </w:p>
+    <w:tbl>
+      <w:tblPr>
+        <w:tblW w:type="dxa" w:w="9360"/>
+        <w:tblBorders>
+          <w:top w:val="single" w:color="auto" w:sz="4"/>
+          <w:left w:val="single" w:color="auto" w:sz="4"/>
+          <w:bottom w:val="single" w:color="auto" w:sz="4"/>
+          <w:right w:val="single" w:color="auto" w:sz="4"/>
+          <w:insideH w:val="single" w:color="auto" w:sz="4"/>
+          <w:insideV w:val="single" w:color="auto" w:sz="4"/>
+        </w:tblBorders>
+      </w:tblPr>
+      <w:tblGrid>
+        <w:gridCol w:w="2560"/>
+        <w:gridCol w:w="1600"/>
+        <w:gridCol w:w="1800"/>
+        <w:gridCol w:w="1700"/>
+        <w:gridCol w:w="1700"/>
+      </w:tblGrid>
+      <w:tr>
+        <w:trPr>
+          <w:tblHeader/>
+        </w:trPr>
+        <w:tc>
+          <w:tcPr>
+            <w:tcW w:type="dxa" w:w="2560"/>
+            <w:tcBorders>
+              <w:top w:val="single" w:color="999999" w:sz="4"/>
+              <w:left w:val="single" w:color="999999" w:sz="4"/>
+              <w:bottom w:val="single" w:color="999999" w:sz="4"/>
+              <w:right w:val="single" w:color="999999" w:sz="4"/>
+            </w:tcBorders>
+            <w:shd w:fill="1F4E79" w:color="auto" w:val="clear"/>
+            <w:tcMar>
+              <w:top w:type="dxa" w:w="60"/>
+              <w:left w:type="dxa" w:w="100"/>
+              <w:bottom w:type="dxa" w:w="60"/>
+              <w:right w:type="dxa" w:w="100"/>
+            </w:tcMar>
+          </w:tcPr>
+          <w:p>
+            <w:pPr>
+              <w:jc w:val="left"/>
+            </w:pPr>
+            <w:r>
+              <w:rPr>
+                <w:b/>
+                <w:bCs/>
+                <w:color w:val="FFFFFF"/>
+                <w:sz w:val="18"/>
+                <w:szCs w:val="18"/>
+              </w:rPr>
+              <w:t xml:space="preserve">Región</w:t>
+            </w:r>
+          </w:p>
+        </w:tc>
+        <w:tc>
+          <w:tcPr>
+            <w:tcW w:type="dxa" w:w="1600"/>
+            <w:tcBorders>
+              <w:top w:val="single" w:color="999999" w:sz="4"/>
+              <w:left w:val="single" w:color="999999" w:sz="4"/>
+              <w:bottom w:val="single" w:color="999999" w:sz="4"/>
+              <w:right w:val="single" w:color="999999" w:sz="4"/>
+            </w:tcBorders>
+            <w:shd w:fill="1F4E79" w:color="auto" w:val="clear"/>
+            <w:tcMar>
+              <w:top w:type="dxa" w:w="60"/>
+              <w:left w:type="dxa" w:w="100"/>
+              <w:bottom w:type="dxa" w:w="60"/>
+              <w:right w:type="dxa" w:w="100"/>
+            </w:tcMar>
+          </w:tcPr>
+          <w:p>
+            <w:pPr>
+              <w:jc w:val="left"/>
+            </w:pPr>
+            <w:r>
+              <w:rPr>
+                <w:b/>
+                <w:bCs/>
+                <w:color w:val="FFFFFF"/>
+                <w:sz w:val="18"/>
+                <w:szCs w:val="18"/>
+              </w:rPr>
+              <w:t xml:space="preserve">units_sold</w:t>
+            </w:r>
+          </w:p>
+        </w:tc>
+        <w:tc>
+          <w:tcPr>
+            <w:tcW w:type="dxa" w:w="1800"/>
+            <w:tcBorders>
+              <w:top w:val="single" w:color="999999" w:sz="4"/>
+              <w:left w:val="single" w:color="999999" w:sz="4"/>
+              <w:bottom w:val="single" w:color="999999" w:sz="4"/>
+              <w:right w:val="single" w:color="999999" w:sz="4"/>
+            </w:tcBorders>
+            <w:shd w:fill="1F4E79" w:color="auto" w:val="clear"/>
+            <w:tcMar>
+              <w:top w:type="dxa" w:w="60"/>
+              <w:left w:type="dxa" w:w="100"/>
+              <w:bottom w:type="dxa" w:w="60"/>
+              <w:right w:type="dxa" w:w="100"/>
+            </w:tcMar>
+          </w:tcPr>
+          <w:p>
+            <w:pPr>
+              <w:jc w:val="left"/>
+            </w:pPr>
+            <w:r>
+              <w:rPr>
+                <w:b/>
+                <w:bCs/>
+                <w:color w:val="FFFFFF"/>
+                <w:sz w:val="18"/>
+                <w:szCs w:val="18"/>
+              </w:rPr>
+              <w:t xml:space="preserve">sales_amount</w:t>
+            </w:r>
+          </w:p>
+        </w:tc>
+        <w:tc>
+          <w:tcPr>
+            <w:tcW w:type="dxa" w:w="1700"/>
+            <w:tcBorders>
+              <w:top w:val="single" w:color="999999" w:sz="4"/>
+              <w:left w:val="single" w:color="999999" w:sz="4"/>
+              <w:bottom w:val="single" w:color="999999" w:sz="4"/>
+              <w:right w:val="single" w:color="999999" w:sz="4"/>
+            </w:tcBorders>
+            <w:shd w:fill="1F4E79" w:color="auto" w:val="clear"/>
+            <w:tcMar>
+              <w:top w:type="dxa" w:w="60"/>
+              <w:left w:type="dxa" w:w="100"/>
+              <w:bottom w:type="dxa" w:w="60"/>
+              <w:right w:type="dxa" w:w="100"/>
+            </w:tcMar>
+          </w:tcPr>
+          <w:p>
+            <w:pPr>
+              <w:jc w:val="left"/>
+            </w:pPr>
+            <w:r>
+              <w:rPr>
+                <w:b/>
+                <w:bCs/>
+                <w:color w:val="FFFFFF"/>
+                <w:sz w:val="18"/>
+                <w:szCs w:val="18"/>
+              </w:rPr>
+              <w:t xml:space="preserve">Cumplimiento %</w:t>
+            </w:r>
+          </w:p>
+        </w:tc>
+        <w:tc>
+          <w:tcPr>
+            <w:tcW w:type="dxa" w:w="1700"/>
+            <w:tcBorders>
+              <w:top w:val="single" w:color="999999" w:sz="4"/>
+              <w:left w:val="single" w:color="999999" w:sz="4"/>
+              <w:bottom w:val="single" w:color="999999" w:sz="4"/>
+              <w:right w:val="single" w:color="999999" w:sz="4"/>
+            </w:tcBorders>
+            <w:shd w:fill="1F4E79" w:color="auto" w:val="clear"/>
+            <w:tcMar>
+              <w:top w:type="dxa" w:w="60"/>
+              <w:left w:type="dxa" w:w="100"/>
+              <w:bottom w:type="dxa" w:w="60"/>
+              <w:right w:type="dxa" w:w="100"/>
+            </w:tcMar>
+          </w:tcPr>
+          <w:p>
+            <w:pPr>
+              <w:jc w:val="left"/>
+            </w:pPr>
+            <w:r>
+              <w:rPr>
+                <w:b/>
+                <w:bCs/>
+                <w:color w:val="FFFFFF"/>
+                <w:sz w:val="18"/>
+                <w:szCs w:val="18"/>
+              </w:rPr>
+              <w:t xml:space="preserve">Días cobertura</w:t>
+            </w:r>
+          </w:p>
+        </w:tc>
+      </w:tr>
+      <w:tr>
+        <w:trPr>
+          <w:tblHeader w:val="false"/>
+        </w:trPr>
+        <w:tc>
+          <w:tcPr>
+            <w:tcW w:type="dxa" w:w="2560"/>
+            <w:tcBorders>
+              <w:top w:val="single" w:color="999999" w:sz="4"/>
+              <w:left w:val="single" w:color="999999" w:sz="4"/>
+              <w:bottom w:val="single" w:color="999999" w:sz="4"/>
+              <w:right w:val="single" w:color="999999" w:sz="4"/>
+            </w:tcBorders>
+            <w:tcMar>
+              <w:top w:type="dxa" w:w="60"/>
+              <w:left w:type="dxa" w:w="100"/>
+              <w:bottom w:type="dxa" w:w="60"/>
+              <w:right w:type="dxa" w:w="100"/>
+            </w:tcMar>
+          </w:tcPr>
+          <w:p>
+            <w:pPr>
+              <w:jc w:val="left"/>
+            </w:pPr>
+            <w:r>
+              <w:t xml:space="preserve">Ciudad de México</w:t>
+            </w:r>
+          </w:p>
+        </w:tc>
+        <w:tc>
+          <w:tcPr>
+            <w:tcW w:type="dxa" w:w="1600"/>
+            <w:tcBorders>
+              <w:top w:val="single" w:color="999999" w:sz="4"/>
+              <w:left w:val="single" w:color="999999" w:sz="4"/>
+              <w:bottom w:val="single" w:color="999999" w:sz="4"/>
+              <w:right w:val="single" w:color="999999" w:sz="4"/>
+            </w:tcBorders>
+            <w:tcMar>
+              <w:top w:type="dxa" w:w="60"/>
+              <w:left w:type="dxa" w:w="100"/>
+              <w:bottom w:type="dxa" w:w="60"/>
+              <w:right w:type="dxa" w:w="100"/>
+            </w:tcMar>
+          </w:tcPr>
+          <w:p>
+            <w:pPr>
+              <w:jc w:val="left"/>
+            </w:pPr>
+            <w:r>
+              <w:t xml:space="preserve">512.50</w:t>
+            </w:r>
+          </w:p>
+        </w:tc>
+        <w:tc>
+          <w:tcPr>
+            <w:tcW w:type="dxa" w:w="1800"/>
+            <w:tcBorders>
+              <w:top w:val="single" w:color="999999" w:sz="4"/>
+              <w:left w:val="single" w:color="999999" w:sz="4"/>
+              <w:bottom w:val="single" w:color="999999" w:sz="4"/>
+              <w:right w:val="single" w:color="999999" w:sz="4"/>
+            </w:tcBorders>
+            <w:tcMar>
+              <w:top w:type="dxa" w:w="60"/>
+              <w:left w:type="dxa" w:w="100"/>
+              <w:bottom w:type="dxa" w:w="60"/>
+              <w:right w:type="dxa" w:w="100"/>
+            </w:tcMar>
+          </w:tcPr>
+          <w:p>
+            <w:pPr>
+              <w:jc w:val="left"/>
+            </w:pPr>
+            <w:r>
+              <w:t xml:space="preserve">$30,778.03</w:t>
+            </w:r>
+          </w:p>
+        </w:tc>
+        <w:tc>
+          <w:tcPr>
+            <w:tcW w:type="dxa" w:w="1700"/>
+            <w:tcBorders>
+              <w:top w:val="single" w:color="999999" w:sz="4"/>
+              <w:left w:val="single" w:color="999999" w:sz="4"/>
+              <w:bottom w:val="single" w:color="999999" w:sz="4"/>
+              <w:right w:val="single" w:color="999999" w:sz="4"/>
+            </w:tcBorders>
+            <w:tcMar>
+              <w:top w:type="dxa" w:w="60"/>
+              <w:left w:type="dxa" w:w="100"/>
+              <w:bottom w:type="dxa" w:w="60"/>
+              <w:right w:type="dxa" w:w="100"/>
+            </w:tcMar>
+          </w:tcPr>
+          <w:p>
+            <w:pPr>
+              <w:jc w:val="left"/>
+            </w:pPr>
+            <w:r>
+              <w:t xml:space="preserve">33.29</w:t>
+            </w:r>
+          </w:p>
+        </w:tc>
+        <w:tc>
+          <w:tcPr>
+            <w:tcW w:type="dxa" w:w="1700"/>
+            <w:tcBorders>
+              <w:top w:val="single" w:color="999999" w:sz="4"/>
+              <w:left w:val="single" w:color="999999" w:sz="4"/>
+              <w:bottom w:val="single" w:color="999999" w:sz="4"/>
+              <w:right w:val="single" w:color="999999" w:sz="4"/>
+            </w:tcBorders>
+            <w:tcMar>
+              <w:top w:type="dxa" w:w="60"/>
+              <w:left w:type="dxa" w:w="100"/>
+              <w:bottom w:type="dxa" w:w="60"/>
+              <w:right w:type="dxa" w:w="100"/>
+            </w:tcMar>
+          </w:tcPr>
+          <w:p>
+            <w:pPr>
+              <w:jc w:val="left"/>
+            </w:pPr>
+            <w:r>
+              <w:t xml:space="preserve">109.31</w:t>
+            </w:r>
+          </w:p>
+        </w:tc>
+      </w:tr>
+      <w:tr>
+        <w:trPr>
+          <w:tblHeader w:val="false"/>
+        </w:trPr>
+        <w:tc>
+          <w:tcPr>
+            <w:tcW w:type="dxa" w:w="2560"/>
+            <w:tcBorders>
+              <w:top w:val="single" w:color="999999" w:sz="4"/>
+              <w:left w:val="single" w:color="999999" w:sz="4"/>
+              <w:bottom w:val="single" w:color="999999" w:sz="4"/>
+              <w:right w:val="single" w:color="999999" w:sz="4"/>
+            </w:tcBorders>
+            <w:tcMar>
+              <w:top w:type="dxa" w:w="60"/>
+              <w:left w:type="dxa" w:w="100"/>
+              <w:bottom w:type="dxa" w:w="60"/>
+              <w:right w:type="dxa" w:w="100"/>
+            </w:tcMar>
+          </w:tcPr>
+          <w:p>
+            <w:pPr>
+              <w:jc w:val="left"/>
+            </w:pPr>
+            <w:r>
+              <w:t xml:space="preserve">ZM Monterrey</w:t>
+            </w:r>
+          </w:p>
+        </w:tc>
+        <w:tc>
+          <w:tcPr>
+            <w:tcW w:type="dxa" w:w="1600"/>
+            <w:tcBorders>
+              <w:top w:val="single" w:color="999999" w:sz="4"/>
+              <w:left w:val="single" w:color="999999" w:sz="4"/>
+              <w:bottom w:val="single" w:color="999999" w:sz="4"/>
+              <w:right w:val="single" w:color="999999" w:sz="4"/>
+            </w:tcBorders>
+            <w:tcMar>
+              <w:top w:type="dxa" w:w="60"/>
+              <w:left w:type="dxa" w:w="100"/>
+              <w:bottom w:type="dxa" w:w="60"/>
+              <w:right w:type="dxa" w:w="100"/>
+            </w:tcMar>
+          </w:tcPr>
+          <w:p>
+            <w:pPr>
+              <w:jc w:val="left"/>
+            </w:pPr>
+            <w:r>
+              <w:t xml:space="preserve">318.00</w:t>
+            </w:r>
+          </w:p>
+        </w:tc>
+        <w:tc>
+          <w:tcPr>
+            <w:tcW w:type="dxa" w:w="1800"/>
+            <w:tcBorders>
+              <w:top w:val="single" w:color="999999" w:sz="4"/>
+              <w:left w:val="single" w:color="999999" w:sz="4"/>
+              <w:bottom w:val="single" w:color="999999" w:sz="4"/>
+              <w:right w:val="single" w:color="999999" w:sz="4"/>
+            </w:tcBorders>
+            <w:tcMar>
+              <w:top w:type="dxa" w:w="60"/>
+              <w:left w:type="dxa" w:w="100"/>
+              <w:bottom w:type="dxa" w:w="60"/>
+              <w:right w:type="dxa" w:w="100"/>
+            </w:tcMar>
+          </w:tcPr>
+          <w:p>
+            <w:pPr>
+              <w:jc w:val="left"/>
+            </w:pPr>
+            <w:r>
+              <w:t xml:space="preserve">$18,922.20</w:t>
+            </w:r>
+          </w:p>
+        </w:tc>
+        <w:tc>
+          <w:tcPr>
+            <w:tcW w:type="dxa" w:w="1700"/>
+            <w:tcBorders>
+              <w:top w:val="single" w:color="999999" w:sz="4"/>
+              <w:left w:val="single" w:color="999999" w:sz="4"/>
+              <w:bottom w:val="single" w:color="999999" w:sz="4"/>
+              <w:right w:val="single" w:color="999999" w:sz="4"/>
+            </w:tcBorders>
+            <w:tcMar>
+              <w:top w:type="dxa" w:w="60"/>
+              <w:left w:type="dxa" w:w="100"/>
+              <w:bottom w:type="dxa" w:w="60"/>
+              <w:right w:type="dxa" w:w="100"/>
+            </w:tcMar>
+          </w:tcPr>
+          <w:p>
+            <w:pPr>
+              <w:jc w:val="left"/>
+            </w:pPr>
+            <w:r>
+              <w:t xml:space="preserve">22.44</w:t>
+            </w:r>
+          </w:p>
+        </w:tc>
+        <w:tc>
+          <w:tcPr>
+            <w:tcW w:type="dxa" w:w="1700"/>
+            <w:tcBorders>
+              <w:top w:val="single" w:color="999999" w:sz="4"/>
+              <w:left w:val="single" w:color="999999" w:sz="4"/>
+              <w:bottom w:val="single" w:color="999999" w:sz="4"/>
+              <w:right w:val="single" w:color="999999" w:sz="4"/>
+            </w:tcBorders>
+            <w:tcMar>
+              <w:top w:type="dxa" w:w="60"/>
+              <w:left w:type="dxa" w:w="100"/>
+              <w:bottom w:type="dxa" w:w="60"/>
+              <w:right w:type="dxa" w:w="100"/>
+            </w:tcMar>
+          </w:tcPr>
+          <w:p>
+            <w:pPr>
+              <w:jc w:val="left"/>
+            </w:pPr>
+            <w:r>
+              <w:t xml:space="preserve">159.64</w:t>
+            </w:r>
+          </w:p>
+        </w:tc>
+      </w:tr>
+      <w:tr>
+        <w:trPr>
+          <w:tblHeader w:val="false"/>
+        </w:trPr>
+        <w:tc>
+          <w:tcPr>
+            <w:tcW w:type="dxa" w:w="2560"/>
+            <w:tcBorders>
+              <w:top w:val="single" w:color="999999" w:sz="4"/>
+              <w:left w:val="single" w:color="999999" w:sz="4"/>
+              <w:bottom w:val="single" w:color="999999" w:sz="4"/>
+              <w:right w:val="single" w:color="999999" w:sz="4"/>
+            </w:tcBorders>
+            <w:tcMar>
+              <w:top w:type="dxa" w:w="60"/>
+              <w:left w:type="dxa" w:w="100"/>
+              <w:bottom w:type="dxa" w:w="60"/>
+              <w:right w:type="dxa" w:w="100"/>
+            </w:tcMar>
+          </w:tcPr>
+          <w:p>
+            <w:pPr>
+              <w:jc w:val="left"/>
+            </w:pPr>
+            <w:r>
+              <w:t xml:space="preserve">ZM Guadalajara</w:t>
+            </w:r>
+          </w:p>
+        </w:tc>
+        <w:tc>
+          <w:tcPr>
+            <w:tcW w:type="dxa" w:w="1600"/>
+            <w:tcBorders>
+              <w:top w:val="single" w:color="999999" w:sz="4"/>
+              <w:left w:val="single" w:color="999999" w:sz="4"/>
+              <w:bottom w:val="single" w:color="999999" w:sz="4"/>
+              <w:right w:val="single" w:color="999999" w:sz="4"/>
+            </w:tcBorders>
+            <w:tcMar>
+              <w:top w:type="dxa" w:w="60"/>
+              <w:left w:type="dxa" w:w="100"/>
+              <w:bottom w:type="dxa" w:w="60"/>
+              <w:right w:type="dxa" w:w="100"/>
+            </w:tcMar>
+          </w:tcPr>
+          <w:p>
+            <w:pPr>
+              <w:jc w:val="left"/>
+            </w:pPr>
+            <w:r>
+              <w:t xml:space="preserve">227.00</w:t>
+            </w:r>
+          </w:p>
+        </w:tc>
+        <w:tc>
+          <w:tcPr>
+            <w:tcW w:type="dxa" w:w="1800"/>
+            <w:tcBorders>
+              <w:top w:val="single" w:color="999999" w:sz="4"/>
+              <w:left w:val="single" w:color="999999" w:sz="4"/>
+              <w:bottom w:val="single" w:color="999999" w:sz="4"/>
+              <w:right w:val="single" w:color="999999" w:sz="4"/>
+            </w:tcBorders>
+            <w:tcMar>
+              <w:top w:type="dxa" w:w="60"/>
+              <w:left w:type="dxa" w:w="100"/>
+              <w:bottom w:type="dxa" w:w="60"/>
+              <w:right w:type="dxa" w:w="100"/>
+            </w:tcMar>
+          </w:tcPr>
+          <w:p>
+            <w:pPr>
+              <w:jc w:val="left"/>
+            </w:pPr>
+            <w:r>
+              <w:t xml:space="preserve">$13,795.21</w:t>
+            </w:r>
+          </w:p>
+        </w:tc>
+        <w:tc>
+          <w:tcPr>
+            <w:tcW w:type="dxa" w:w="1700"/>
+            <w:tcBorders>
+              <w:top w:val="single" w:color="999999" w:sz="4"/>
+              <w:left w:val="single" w:color="999999" w:sz="4"/>
+              <w:bottom w:val="single" w:color="999999" w:sz="4"/>
+              <w:right w:val="single" w:color="999999" w:sz="4"/>
+            </w:tcBorders>
+            <w:tcMar>
+              <w:top w:type="dxa" w:w="60"/>
+              <w:left w:type="dxa" w:w="100"/>
+              <w:bottom w:type="dxa" w:w="60"/>
+              <w:right w:type="dxa" w:w="100"/>
+            </w:tcMar>
+          </w:tcPr>
+          <w:p>
+            <w:pPr>
+              <w:jc w:val="left"/>
+            </w:pPr>
+            <w:r>
+              <w:t xml:space="preserve">17.41</w:t>
+            </w:r>
+          </w:p>
+        </w:tc>
+        <w:tc>
+          <w:tcPr>
+            <w:tcW w:type="dxa" w:w="1700"/>
+            <w:tcBorders>
+              <w:top w:val="single" w:color="999999" w:sz="4"/>
+              <w:left w:val="single" w:color="999999" w:sz="4"/>
+              <w:bottom w:val="single" w:color="999999" w:sz="4"/>
+              <w:right w:val="single" w:color="999999" w:sz="4"/>
+            </w:tcBorders>
+            <w:tcMar>
+              <w:top w:type="dxa" w:w="60"/>
+              <w:left w:type="dxa" w:w="100"/>
+              <w:bottom w:type="dxa" w:w="60"/>
+              <w:right w:type="dxa" w:w="100"/>
+            </w:tcMar>
+          </w:tcPr>
+          <w:p>
+            <w:pPr>
+              <w:jc w:val="left"/>
+            </w:pPr>
+            <w:r>
+              <w:t xml:space="preserve">201.38</w:t>
+            </w:r>
+          </w:p>
+        </w:tc>
+      </w:tr>
+      <w:tr>
+        <w:trPr>
+          <w:tblHeader w:val="false"/>
+        </w:trPr>
+        <w:tc>
+          <w:tcPr>
+            <w:tcW w:type="dxa" w:w="2560"/>
+            <w:tcBorders>
+              <w:top w:val="single" w:color="999999" w:sz="4"/>
+              <w:left w:val="single" w:color="999999" w:sz="4"/>
+              <w:bottom w:val="single" w:color="999999" w:sz="4"/>
+              <w:right w:val="single" w:color="999999" w:sz="4"/>
+            </w:tcBorders>
+            <w:tcMar>
+              <w:top w:type="dxa" w:w="60"/>
+              <w:left w:type="dxa" w:w="100"/>
+              <w:bottom w:type="dxa" w:w="60"/>
+              <w:right w:type="dxa" w:w="100"/>
+            </w:tcMar>
+          </w:tcPr>
+          <w:p>
+            <w:pPr>
+              <w:jc w:val="left"/>
+            </w:pPr>
+            <w:r>
+              <w:t xml:space="preserve">Bajío</w:t>
+            </w:r>
+          </w:p>
+        </w:tc>
+        <w:tc>
+          <w:tcPr>
+            <w:tcW w:type="dxa" w:w="1600"/>
+            <w:tcBorders>
+              <w:top w:val="single" w:color="999999" w:sz="4"/>
+              <w:left w:val="single" w:color="999999" w:sz="4"/>
+              <w:bottom w:val="single" w:color="999999" w:sz="4"/>
+              <w:right w:val="single" w:color="999999" w:sz="4"/>
+            </w:tcBorders>
+            <w:tcMar>
+              <w:top w:type="dxa" w:w="60"/>
+              <w:left w:type="dxa" w:w="100"/>
+              <w:bottom w:type="dxa" w:w="60"/>
+              <w:right w:type="dxa" w:w="100"/>
+            </w:tcMar>
+          </w:tcPr>
+          <w:p>
+            <w:pPr>
+              <w:jc w:val="left"/>
+            </w:pPr>
+            <w:r>
+              <w:t xml:space="preserve">137.00</w:t>
+            </w:r>
+          </w:p>
+        </w:tc>
+        <w:tc>
+          <w:tcPr>
+            <w:tcW w:type="dxa" w:w="1800"/>
+            <w:tcBorders>
+              <w:top w:val="single" w:color="999999" w:sz="4"/>
+              <w:left w:val="single" w:color="999999" w:sz="4"/>
+              <w:bottom w:val="single" w:color="999999" w:sz="4"/>
+              <w:right w:val="single" w:color="999999" w:sz="4"/>
+            </w:tcBorders>
+            <w:tcMar>
+              <w:top w:type="dxa" w:w="60"/>
+              <w:left w:type="dxa" w:w="100"/>
+              <w:bottom w:type="dxa" w:w="60"/>
+              <w:right w:type="dxa" w:w="100"/>
+            </w:tcMar>
+          </w:tcPr>
+          <w:p>
+            <w:pPr>
+              <w:jc w:val="left"/>
+            </w:pPr>
+            <w:r>
+              <w:t xml:space="preserve">$8,110.71</w:t>
+            </w:r>
+          </w:p>
+        </w:tc>
+        <w:tc>
+          <w:tcPr>
+            <w:tcW w:type="dxa" w:w="1700"/>
+            <w:tcBorders>
+              <w:top w:val="single" w:color="999999" w:sz="4"/>
+              <w:left w:val="single" w:color="999999" w:sz="4"/>
+              <w:bottom w:val="single" w:color="999999" w:sz="4"/>
+              <w:right w:val="single" w:color="999999" w:sz="4"/>
+            </w:tcBorders>
+            <w:tcMar>
+              <w:top w:type="dxa" w:w="60"/>
+              <w:left w:type="dxa" w:w="100"/>
+              <w:bottom w:type="dxa" w:w="60"/>
+              <w:right w:type="dxa" w:w="100"/>
+            </w:tcMar>
+          </w:tcPr>
+          <w:p>
+            <w:pPr>
+              <w:jc w:val="left"/>
+            </w:pPr>
+            <w:r>
+              <w:t xml:space="preserve">11.40</w:t>
+            </w:r>
+          </w:p>
+        </w:tc>
+        <w:tc>
+          <w:tcPr>
+            <w:tcW w:type="dxa" w:w="1700"/>
+            <w:tcBorders>
+              <w:top w:val="single" w:color="999999" w:sz="4"/>
+              <w:left w:val="single" w:color="999999" w:sz="4"/>
+              <w:bottom w:val="single" w:color="999999" w:sz="4"/>
+              <w:right w:val="single" w:color="999999" w:sz="4"/>
+            </w:tcBorders>
+            <w:tcMar>
+              <w:top w:type="dxa" w:w="60"/>
+              <w:left w:type="dxa" w:w="100"/>
+              <w:bottom w:type="dxa" w:w="60"/>
+              <w:right w:type="dxa" w:w="100"/>
+            </w:tcMar>
+          </w:tcPr>
+          <w:p>
+            <w:pPr>
+              <w:jc w:val="left"/>
+            </w:pPr>
+            <w:r>
+              <w:t xml:space="preserve">294.69</w:t>
+            </w:r>
+          </w:p>
+        </w:tc>
+      </w:tr>
+      <w:tr>
+        <w:trPr>
+          <w:tblHeader w:val="false"/>
+        </w:trPr>
+        <w:tc>
+          <w:tcPr>
+            <w:tcW w:type="dxa" w:w="2560"/>
+            <w:tcBorders>
+              <w:top w:val="single" w:color="999999" w:sz="4"/>
+              <w:left w:val="single" w:color="999999" w:sz="4"/>
+              <w:bottom w:val="single" w:color="999999" w:sz="4"/>
+              <w:right w:val="single" w:color="999999" w:sz="4"/>
+            </w:tcBorders>
+            <w:tcMar>
+              <w:top w:type="dxa" w:w="60"/>
+              <w:left w:type="dxa" w:w="100"/>
+              <w:bottom w:type="dxa" w:w="60"/>
+              <w:right w:type="dxa" w:w="100"/>
+            </w:tcMar>
+          </w:tcPr>
+          <w:p>
+            <w:pPr>
+              <w:jc w:val="left"/>
+            </w:pPr>
+            <w:r>
+              <w:t xml:space="preserve">Noroeste</w:t>
+            </w:r>
+          </w:p>
+        </w:tc>
+        <w:tc>
+          <w:tcPr>
+            <w:tcW w:type="dxa" w:w="1600"/>
+            <w:tcBorders>
+              <w:top w:val="single" w:color="999999" w:sz="4"/>
+              <w:left w:val="single" w:color="999999" w:sz="4"/>
+              <w:bottom w:val="single" w:color="999999" w:sz="4"/>
+              <w:right w:val="single" w:color="999999" w:sz="4"/>
+            </w:tcBorders>
+            <w:tcMar>
+              <w:top w:type="dxa" w:w="60"/>
+              <w:left w:type="dxa" w:w="100"/>
+              <w:bottom w:type="dxa" w:w="60"/>
+              <w:right w:type="dxa" w:w="100"/>
+            </w:tcMar>
+          </w:tcPr>
+          <w:p>
+            <w:pPr>
+              <w:jc w:val="left"/>
+            </w:pPr>
+            <w:r>
+              <w:t xml:space="preserve">94.00</w:t>
+            </w:r>
+          </w:p>
+        </w:tc>
+        <w:tc>
+          <w:tcPr>
+            <w:tcW w:type="dxa" w:w="1800"/>
+            <w:tcBorders>
+              <w:top w:val="single" w:color="999999" w:sz="4"/>
+              <w:left w:val="single" w:color="999999" w:sz="4"/>
+              <w:bottom w:val="single" w:color="999999" w:sz="4"/>
+              <w:right w:val="single" w:color="999999" w:sz="4"/>
+            </w:tcBorders>
+            <w:tcMar>
+              <w:top w:type="dxa" w:w="60"/>
+              <w:left w:type="dxa" w:w="100"/>
+              <w:bottom w:type="dxa" w:w="60"/>
+              <w:right w:type="dxa" w:w="100"/>
+            </w:tcMar>
+          </w:tcPr>
+          <w:p>
+            <w:pPr>
+              <w:jc w:val="left"/>
+            </w:pPr>
+            <w:r>
+              <w:t xml:space="preserve">$5,706.37</w:t>
+            </w:r>
+          </w:p>
+        </w:tc>
+        <w:tc>
+          <w:tcPr>
+            <w:tcW w:type="dxa" w:w="1700"/>
+            <w:tcBorders>
+              <w:top w:val="single" w:color="999999" w:sz="4"/>
+              <w:left w:val="single" w:color="999999" w:sz="4"/>
+              <w:bottom w:val="single" w:color="999999" w:sz="4"/>
+              <w:right w:val="single" w:color="999999" w:sz="4"/>
+            </w:tcBorders>
+            <w:tcMar>
+              <w:top w:type="dxa" w:w="60"/>
+              <w:left w:type="dxa" w:w="100"/>
+              <w:bottom w:type="dxa" w:w="60"/>
+              <w:right w:type="dxa" w:w="100"/>
+            </w:tcMar>
+          </w:tcPr>
+          <w:p>
+            <w:pPr>
+              <w:jc w:val="left"/>
+            </w:pPr>
+            <w:r>
+              <w:t xml:space="preserve">8.70</w:t>
+            </w:r>
+          </w:p>
+        </w:tc>
+        <w:tc>
+          <w:tcPr>
+            <w:tcW w:type="dxa" w:w="1700"/>
+            <w:tcBorders>
+              <w:top w:val="single" w:color="999999" w:sz="4"/>
+              <w:left w:val="single" w:color="999999" w:sz="4"/>
+              <w:bottom w:val="single" w:color="999999" w:sz="4"/>
+              <w:right w:val="single" w:color="999999" w:sz="4"/>
+            </w:tcBorders>
+            <w:tcMar>
+              <w:top w:type="dxa" w:w="60"/>
+              <w:left w:type="dxa" w:w="100"/>
+              <w:bottom w:type="dxa" w:w="60"/>
+              <w:right w:type="dxa" w:w="100"/>
+            </w:tcMar>
+          </w:tcPr>
+          <w:p>
+            <w:pPr>
+              <w:jc w:val="left"/>
+            </w:pPr>
+            <w:r>
+              <w:t xml:space="preserve">364.66</w:t>
+            </w:r>
+          </w:p>
+        </w:tc>
+      </w:tr>
+      <w:tr>
+        <w:trPr>
+          <w:tblHeader w:val="false"/>
+        </w:trPr>
+        <w:tc>
+          <w:tcPr>
+            <w:tcW w:type="dxa" w:w="2560"/>
+            <w:tcBorders>
+              <w:top w:val="single" w:color="999999" w:sz="4"/>
+              <w:left w:val="single" w:color="999999" w:sz="4"/>
+              <w:bottom w:val="single" w:color="999999" w:sz="4"/>
+              <w:right w:val="single" w:color="999999" w:sz="4"/>
+            </w:tcBorders>
+            <w:tcMar>
+              <w:top w:type="dxa" w:w="60"/>
+              <w:left w:type="dxa" w:w="100"/>
+              <w:bottom w:type="dxa" w:w="60"/>
+              <w:right w:type="dxa" w:w="100"/>
+            </w:tcMar>
+          </w:tcPr>
+          <w:p>
+            <w:pPr>
+              <w:jc w:val="left"/>
+            </w:pPr>
+            <w:r>
+              <w:t xml:space="preserve">Sur</w:t>
+            </w:r>
+          </w:p>
+        </w:tc>
+        <w:tc>
+          <w:tcPr>
+            <w:tcW w:type="dxa" w:w="1600"/>
+            <w:tcBorders>
+              <w:top w:val="single" w:color="999999" w:sz="4"/>
+              <w:left w:val="single" w:color="999999" w:sz="4"/>
+              <w:bottom w:val="single" w:color="999999" w:sz="4"/>
+              <w:right w:val="single" w:color="999999" w:sz="4"/>
+            </w:tcBorders>
+            <w:tcMar>
+              <w:top w:type="dxa" w:w="60"/>
+              <w:left w:type="dxa" w:w="100"/>
+              <w:bottom w:type="dxa" w:w="60"/>
+              <w:right w:type="dxa" w:w="100"/>
+            </w:tcMar>
+          </w:tcPr>
+          <w:p>
+            <w:pPr>
+              <w:jc w:val="left"/>
+            </w:pPr>
+            <w:r>
+              <w:t xml:space="preserve">79.00</w:t>
+            </w:r>
+          </w:p>
+        </w:tc>
+        <w:tc>
+          <w:tcPr>
+            <w:tcW w:type="dxa" w:w="1800"/>
+            <w:tcBorders>
+              <w:top w:val="single" w:color="999999" w:sz="4"/>
+              <w:left w:val="single" w:color="999999" w:sz="4"/>
+              <w:bottom w:val="single" w:color="999999" w:sz="4"/>
+              <w:right w:val="single" w:color="999999" w:sz="4"/>
+            </w:tcBorders>
+            <w:tcMar>
+              <w:top w:type="dxa" w:w="60"/>
+              <w:left w:type="dxa" w:w="100"/>
+              <w:bottom w:type="dxa" w:w="60"/>
+              <w:right w:type="dxa" w:w="100"/>
+            </w:tcMar>
+          </w:tcPr>
+          <w:p>
+            <w:pPr>
+              <w:jc w:val="left"/>
+            </w:pPr>
+            <w:r>
+              <w:t xml:space="preserve">$4,567.57</w:t>
+            </w:r>
+          </w:p>
+        </w:tc>
+        <w:tc>
+          <w:tcPr>
+            <w:tcW w:type="dxa" w:w="1700"/>
+            <w:tcBorders>
+              <w:top w:val="single" w:color="999999" w:sz="4"/>
+              <w:left w:val="single" w:color="999999" w:sz="4"/>
+              <w:bottom w:val="single" w:color="999999" w:sz="4"/>
+              <w:right w:val="single" w:color="999999" w:sz="4"/>
+            </w:tcBorders>
+            <w:tcMar>
+              <w:top w:type="dxa" w:w="60"/>
+              <w:left w:type="dxa" w:w="100"/>
+              <w:bottom w:type="dxa" w:w="60"/>
+              <w:right w:type="dxa" w:w="100"/>
+            </w:tcMar>
+          </w:tcPr>
+          <w:p>
+            <w:pPr>
+              <w:jc w:val="left"/>
+            </w:pPr>
+            <w:r>
+              <w:t xml:space="preserve">8.16</w:t>
+            </w:r>
+          </w:p>
+        </w:tc>
+        <w:tc>
+          <w:tcPr>
+            <w:tcW w:type="dxa" w:w="1700"/>
+            <w:tcBorders>
+              <w:top w:val="single" w:color="999999" w:sz="4"/>
+              <w:left w:val="single" w:color="999999" w:sz="4"/>
+              <w:bottom w:val="single" w:color="999999" w:sz="4"/>
+              <w:right w:val="single" w:color="999999" w:sz="4"/>
+            </w:tcBorders>
+            <w:tcMar>
+              <w:top w:type="dxa" w:w="60"/>
+              <w:left w:type="dxa" w:w="100"/>
+              <w:bottom w:type="dxa" w:w="60"/>
+              <w:right w:type="dxa" w:w="100"/>
+            </w:tcMar>
+          </w:tcPr>
+          <w:p>
+            <w:pPr>
+              <w:jc w:val="left"/>
+            </w:pPr>
+            <w:r>
+              <w:t xml:space="preserve">364.08</w:t>
+            </w:r>
+          </w:p>
+        </w:tc>
+      </w:tr>
+      <w:tr>
+        <w:trPr>
+          <w:tblHeader w:val="false"/>
+        </w:trPr>
+        <w:tc>
+          <w:tcPr>
+            <w:tcW w:type="dxa" w:w="2560"/>
+            <w:tcBorders>
+              <w:top w:val="single" w:color="999999" w:sz="4"/>
+              <w:left w:val="single" w:color="999999" w:sz="4"/>
+              <w:bottom w:val="single" w:color="999999" w:sz="4"/>
+              <w:right w:val="single" w:color="999999" w:sz="4"/>
+            </w:tcBorders>
+            <w:tcMar>
+              <w:top w:type="dxa" w:w="60"/>
+              <w:left w:type="dxa" w:w="100"/>
+              <w:bottom w:type="dxa" w:w="60"/>
+              <w:right w:type="dxa" w:w="100"/>
+            </w:tcMar>
+          </w:tcPr>
+          <w:p>
+            <w:pPr>
+              <w:jc w:val="left"/>
+            </w:pPr>
+            <w:r>
+              <w:t xml:space="preserve">Sureste</w:t>
+            </w:r>
+          </w:p>
+        </w:tc>
+        <w:tc>
+          <w:tcPr>
+            <w:tcW w:type="dxa" w:w="1600"/>
+            <w:tcBorders>
+              <w:top w:val="single" w:color="999999" w:sz="4"/>
+              <w:left w:val="single" w:color="999999" w:sz="4"/>
+              <w:bottom w:val="single" w:color="999999" w:sz="4"/>
+              <w:right w:val="single" w:color="999999" w:sz="4"/>
+            </w:tcBorders>
+            <w:tcMar>
+              <w:top w:type="dxa" w:w="60"/>
+              <w:left w:type="dxa" w:w="100"/>
+              <w:bottom w:type="dxa" w:w="60"/>
+              <w:right w:type="dxa" w:w="100"/>
+            </w:tcMar>
+          </w:tcPr>
+          <w:p>
+            <w:pPr>
+              <w:jc w:val="left"/>
+            </w:pPr>
+            <w:r>
+              <w:t xml:space="preserve">67.00</w:t>
+            </w:r>
+          </w:p>
+        </w:tc>
+        <w:tc>
+          <w:tcPr>
+            <w:tcW w:type="dxa" w:w="1800"/>
+            <w:tcBorders>
+              <w:top w:val="single" w:color="999999" w:sz="4"/>
+              <w:left w:val="single" w:color="999999" w:sz="4"/>
+              <w:bottom w:val="single" w:color="999999" w:sz="4"/>
+              <w:right w:val="single" w:color="999999" w:sz="4"/>
+            </w:tcBorders>
+            <w:tcMar>
+              <w:top w:type="dxa" w:w="60"/>
+              <w:left w:type="dxa" w:w="100"/>
+              <w:bottom w:type="dxa" w:w="60"/>
+              <w:right w:type="dxa" w:w="100"/>
+            </w:tcMar>
+          </w:tcPr>
+          <w:p>
+            <w:pPr>
+              <w:jc w:val="left"/>
+            </w:pPr>
+            <w:r>
+              <w:t xml:space="preserve">$3,949.32</w:t>
+            </w:r>
+          </w:p>
+        </w:tc>
+        <w:tc>
+          <w:tcPr>
+            <w:tcW w:type="dxa" w:w="1700"/>
+            <w:tcBorders>
+              <w:top w:val="single" w:color="999999" w:sz="4"/>
+              <w:left w:val="single" w:color="999999" w:sz="4"/>
+              <w:bottom w:val="single" w:color="999999" w:sz="4"/>
+              <w:right w:val="single" w:color="999999" w:sz="4"/>
+            </w:tcBorders>
+            <w:tcMar>
+              <w:top w:type="dxa" w:w="60"/>
+              <w:left w:type="dxa" w:w="100"/>
+              <w:bottom w:type="dxa" w:w="60"/>
+              <w:right w:type="dxa" w:w="100"/>
+            </w:tcMar>
+          </w:tcPr>
+          <w:p>
+            <w:pPr>
+              <w:jc w:val="left"/>
+            </w:pPr>
+            <w:r>
+              <w:t xml:space="preserve">6.58</w:t>
+            </w:r>
+          </w:p>
+        </w:tc>
+        <w:tc>
+          <w:tcPr>
+            <w:tcW w:type="dxa" w:w="1700"/>
+            <w:tcBorders>
+              <w:top w:val="single" w:color="999999" w:sz="4"/>
+              <w:left w:val="single" w:color="999999" w:sz="4"/>
+              <w:bottom w:val="single" w:color="999999" w:sz="4"/>
+              <w:right w:val="single" w:color="999999" w:sz="4"/>
+            </w:tcBorders>
+            <w:tcMar>
+              <w:top w:type="dxa" w:w="60"/>
+              <w:left w:type="dxa" w:w="100"/>
+              <w:bottom w:type="dxa" w:w="60"/>
+              <w:right w:type="dxa" w:w="100"/>
+            </w:tcMar>
+          </w:tcPr>
+          <w:p>
+            <w:pPr>
+              <w:jc w:val="left"/>
+            </w:pPr>
+            <w:r>
+              <w:t xml:space="preserve">472.26</w:t>
+            </w:r>
+          </w:p>
+        </w:tc>
+      </w:tr>
+    </w:tbl>
     <w:p>
       <w:pPr>
         <w:spacing w:after="120"/>
       </w:pPr>
       <w:r>
-        <w:t xml:space="preserve">Ninguna variable continua sigue una distribución normal: en todas la media es mayor que la mediana (sesgo a la derecha), con la mayoría de los valores en la parte baja y una cola de valores altos. Los valores fuera de ±3.5σ son menos del 1.5% en todos los casos y corresponden a casos reales del negocio (compras grandes, clientes de alto valor, productos con muy baja rotación), por lo que no se eliminan.</w:t>
-      </w:r>
-    </w:p>
-    <w:p>
-      <w:pPr>
-        <w:pStyle w:val="Heading1"/>
-        <w:spacing w:after="120" w:before="240"/>
-      </w:pPr>
-      <w:r>
-        <w:t xml:space="preserve">V. Análisis de variables cuantitativas respecto a variables cualitativas</w:t>
-      </w:r>
-    </w:p>
-    <w:p>
-      <w:pPr>
-        <w:spacing w:after="120"/>
-      </w:pPr>
-      <w:r>
-        <w:t xml:space="preserve">Para cada variable cualitativa se graficaron boxplots de las variables cuantitativas de su mismo nivel, incluyendo una caja de "Todos los datos" como referencia. En subcategory se aplicó la regla del 70% de las unidades vendidas.</w:t>
-      </w:r>
-    </w:p>
-    <w:p>
-      <w:pPr>
-        <w:pStyle w:val="Heading2"/>
-        <w:spacing w:after="100" w:before="180"/>
-      </w:pPr>
-      <w:r>
-        <w:t xml:space="preserve">5.1 Nivel Macro (category, subcategory, region)</w:t>
+        <w:t xml:space="preserve">Medianas por registro mensual (producto-región-mes).</w:t>
       </w:r>
     </w:p>
     <w:p>
@@ -5021,16 +8089,7 @@
         <w:t xml:space="preserve">region – units_sold y sales_amount:</w:t>
       </w:r>
       <w:r>
-        <w:t xml:space="preserve"> jerarquía clara en ambas variables: Ciudad de México tiene la mediana más alta, seguida de Monterrey y Guadalajara; Bajío, Noroeste, Sur y Sureste venden mucho menos (Sureste es la más baja). Todas las regiones presentan outliers en la parte alta. </w:t>
-      </w:r>
-      <w:r>
-        <w:rPr>
-          <w:b/>
-          <w:bCs/>
-          <w:highlight w:val="yellow"/>
-          <w:highlightCs w:val="yellow"/>
-        </w:rPr>
-        <w:t xml:space="preserve">[Revisar en el código: medianas y límites de outliers por región]</w:t>
+        <w:t xml:space="preserve"> jerarquía clara: Ciudad de México vende 7.6 veces más unidades que Sureste (mediana 512.5 vs. 67) y casi 8 veces más en monto. Outliers generales a partir de 593.5 unidades y $39,299.74 al mes.</w:t>
       </w:r>
     </w:p>
     <w:p>
@@ -5050,16 +8109,7 @@
         <w:t xml:space="preserve">region – Cumplimiento_Venta_Esperada:</w:t>
       </w:r>
       <w:r>
-        <w:t xml:space="preserve"> mismo orden: Ciudad de México tiene el cumplimiento más alto y Sureste el más bajo. Las regiones pequeñas son las peor planeadas. </w:t>
-      </w:r>
-      <w:r>
-        <w:rPr>
-          <w:b/>
-          <w:bCs/>
-          <w:highlight w:val="yellow"/>
-          <w:highlightCs w:val="yellow"/>
-        </w:rPr>
-        <w:t xml:space="preserve">[Revisar en el código: medianas por región]</w:t>
+        <w:t xml:space="preserve"> mismo orden: de 33.29% en Ciudad de México a 6.58% en Sureste. Outliers generales a partir de 40.97%.</w:t>
       </w:r>
     </w:p>
     <w:p>
@@ -5079,7 +8129,7 @@
         <w:t xml:space="preserve">region – Dias_Cobertura_Inventario:</w:t>
       </w:r>
       <w:r>
-        <w:t xml:space="preserve"> comportamiento inverso: Ciudad de México tiene la menor cobertura y Sureste la mayor, con outliers que llegan hasta el máximo de 1,377 días. </w:t>
+        <w:t xml:space="preserve"> comportamiento inverso: de 109 días en Ciudad de México a 472 días en Sureste. Outliers generales a partir de 710.25 días (276 registros) y extremos a partir de 1,037.21 días (16 registros). </w:t>
       </w:r>
       <w:r>
         <w:rPr>
@@ -5089,18 +8139,719 @@
         <w:t xml:space="preserve">Conclusión:</w:t>
       </w:r>
       <w:r>
-        <w:t xml:space="preserve"> las regiones con menos venta reciben inventario proporcionalmente excesivo; conviene redistribuirlo hacia las zonas metropolitanas. </w:t>
-      </w:r>
-      <w:r>
-        <w:rPr>
-          <w:b/>
-          <w:bCs/>
-          <w:highlight w:val="yellow"/>
-          <w:highlightCs w:val="yellow"/>
-        </w:rPr>
-        <w:t xml:space="preserve">[Revisar en el código: medianas por región]</w:t>
+        <w:t xml:space="preserve"> las regiones con menos venta reciben inventario proporcionalmente excesivo; conviene redistribuirlo hacia las zonas metropolitanas.</w:t>
       </w:r>
     </w:p>
+    <w:tbl>
+      <w:tblPr>
+        <w:tblW w:type="dxa" w:w="9360"/>
+        <w:tblBorders>
+          <w:top w:val="single" w:color="auto" w:sz="4"/>
+          <w:left w:val="single" w:color="auto" w:sz="4"/>
+          <w:bottom w:val="single" w:color="auto" w:sz="4"/>
+          <w:right w:val="single" w:color="auto" w:sz="4"/>
+          <w:insideH w:val="single" w:color="auto" w:sz="4"/>
+          <w:insideV w:val="single" w:color="auto" w:sz="4"/>
+        </w:tblBorders>
+      </w:tblPr>
+      <w:tblGrid>
+        <w:gridCol w:w="2560"/>
+        <w:gridCol w:w="1600"/>
+        <w:gridCol w:w="1800"/>
+        <w:gridCol w:w="1700"/>
+        <w:gridCol w:w="1700"/>
+      </w:tblGrid>
+      <w:tr>
+        <w:trPr>
+          <w:tblHeader/>
+        </w:trPr>
+        <w:tc>
+          <w:tcPr>
+            <w:tcW w:type="dxa" w:w="2560"/>
+            <w:tcBorders>
+              <w:top w:val="single" w:color="999999" w:sz="4"/>
+              <w:left w:val="single" w:color="999999" w:sz="4"/>
+              <w:bottom w:val="single" w:color="999999" w:sz="4"/>
+              <w:right w:val="single" w:color="999999" w:sz="4"/>
+            </w:tcBorders>
+            <w:shd w:fill="1F4E79" w:color="auto" w:val="clear"/>
+            <w:tcMar>
+              <w:top w:type="dxa" w:w="60"/>
+              <w:left w:type="dxa" w:w="100"/>
+              <w:bottom w:type="dxa" w:w="60"/>
+              <w:right w:type="dxa" w:w="100"/>
+            </w:tcMar>
+          </w:tcPr>
+          <w:p>
+            <w:pPr>
+              <w:jc w:val="left"/>
+            </w:pPr>
+            <w:r>
+              <w:rPr>
+                <w:b/>
+                <w:bCs/>
+                <w:color w:val="FFFFFF"/>
+                <w:sz w:val="18"/>
+                <w:szCs w:val="18"/>
+              </w:rPr>
+              <w:t xml:space="preserve">Categoría</w:t>
+            </w:r>
+          </w:p>
+        </w:tc>
+        <w:tc>
+          <w:tcPr>
+            <w:tcW w:type="dxa" w:w="1600"/>
+            <w:tcBorders>
+              <w:top w:val="single" w:color="999999" w:sz="4"/>
+              <w:left w:val="single" w:color="999999" w:sz="4"/>
+              <w:bottom w:val="single" w:color="999999" w:sz="4"/>
+              <w:right w:val="single" w:color="999999" w:sz="4"/>
+            </w:tcBorders>
+            <w:shd w:fill="1F4E79" w:color="auto" w:val="clear"/>
+            <w:tcMar>
+              <w:top w:type="dxa" w:w="60"/>
+              <w:left w:type="dxa" w:w="100"/>
+              <w:bottom w:type="dxa" w:w="60"/>
+              <w:right w:type="dxa" w:w="100"/>
+            </w:tcMar>
+          </w:tcPr>
+          <w:p>
+            <w:pPr>
+              <w:jc w:val="left"/>
+            </w:pPr>
+            <w:r>
+              <w:rPr>
+                <w:b/>
+                <w:bCs/>
+                <w:color w:val="FFFFFF"/>
+                <w:sz w:val="18"/>
+                <w:szCs w:val="18"/>
+              </w:rPr>
+              <w:t xml:space="preserve">units_sold</w:t>
+            </w:r>
+          </w:p>
+        </w:tc>
+        <w:tc>
+          <w:tcPr>
+            <w:tcW w:type="dxa" w:w="1800"/>
+            <w:tcBorders>
+              <w:top w:val="single" w:color="999999" w:sz="4"/>
+              <w:left w:val="single" w:color="999999" w:sz="4"/>
+              <w:bottom w:val="single" w:color="999999" w:sz="4"/>
+              <w:right w:val="single" w:color="999999" w:sz="4"/>
+            </w:tcBorders>
+            <w:shd w:fill="1F4E79" w:color="auto" w:val="clear"/>
+            <w:tcMar>
+              <w:top w:type="dxa" w:w="60"/>
+              <w:left w:type="dxa" w:w="100"/>
+              <w:bottom w:type="dxa" w:w="60"/>
+              <w:right w:type="dxa" w:w="100"/>
+            </w:tcMar>
+          </w:tcPr>
+          <w:p>
+            <w:pPr>
+              <w:jc w:val="left"/>
+            </w:pPr>
+            <w:r>
+              <w:rPr>
+                <w:b/>
+                <w:bCs/>
+                <w:color w:val="FFFFFF"/>
+                <w:sz w:val="18"/>
+                <w:szCs w:val="18"/>
+              </w:rPr>
+              <w:t xml:space="preserve">sales_amount</w:t>
+            </w:r>
+          </w:p>
+        </w:tc>
+        <w:tc>
+          <w:tcPr>
+            <w:tcW w:type="dxa" w:w="1700"/>
+            <w:tcBorders>
+              <w:top w:val="single" w:color="999999" w:sz="4"/>
+              <w:left w:val="single" w:color="999999" w:sz="4"/>
+              <w:bottom w:val="single" w:color="999999" w:sz="4"/>
+              <w:right w:val="single" w:color="999999" w:sz="4"/>
+            </w:tcBorders>
+            <w:shd w:fill="1F4E79" w:color="auto" w:val="clear"/>
+            <w:tcMar>
+              <w:top w:type="dxa" w:w="60"/>
+              <w:left w:type="dxa" w:w="100"/>
+              <w:bottom w:type="dxa" w:w="60"/>
+              <w:right w:type="dxa" w:w="100"/>
+            </w:tcMar>
+          </w:tcPr>
+          <w:p>
+            <w:pPr>
+              <w:jc w:val="left"/>
+            </w:pPr>
+            <w:r>
+              <w:rPr>
+                <w:b/>
+                <w:bCs/>
+                <w:color w:val="FFFFFF"/>
+                <w:sz w:val="18"/>
+                <w:szCs w:val="18"/>
+              </w:rPr>
+              <w:t xml:space="preserve">Cumplimiento %</w:t>
+            </w:r>
+          </w:p>
+        </w:tc>
+        <w:tc>
+          <w:tcPr>
+            <w:tcW w:type="dxa" w:w="1700"/>
+            <w:tcBorders>
+              <w:top w:val="single" w:color="999999" w:sz="4"/>
+              <w:left w:val="single" w:color="999999" w:sz="4"/>
+              <w:bottom w:val="single" w:color="999999" w:sz="4"/>
+              <w:right w:val="single" w:color="999999" w:sz="4"/>
+            </w:tcBorders>
+            <w:shd w:fill="1F4E79" w:color="auto" w:val="clear"/>
+            <w:tcMar>
+              <w:top w:type="dxa" w:w="60"/>
+              <w:left w:type="dxa" w:w="100"/>
+              <w:bottom w:type="dxa" w:w="60"/>
+              <w:right w:type="dxa" w:w="100"/>
+            </w:tcMar>
+          </w:tcPr>
+          <w:p>
+            <w:pPr>
+              <w:jc w:val="left"/>
+            </w:pPr>
+            <w:r>
+              <w:rPr>
+                <w:b/>
+                <w:bCs/>
+                <w:color w:val="FFFFFF"/>
+                <w:sz w:val="18"/>
+                <w:szCs w:val="18"/>
+              </w:rPr>
+              <w:t xml:space="preserve">Días cobertura</w:t>
+            </w:r>
+          </w:p>
+        </w:tc>
+      </w:tr>
+      <w:tr>
+        <w:trPr>
+          <w:tblHeader w:val="false"/>
+        </w:trPr>
+        <w:tc>
+          <w:tcPr>
+            <w:tcW w:type="dxa" w:w="2560"/>
+            <w:tcBorders>
+              <w:top w:val="single" w:color="999999" w:sz="4"/>
+              <w:left w:val="single" w:color="999999" w:sz="4"/>
+              <w:bottom w:val="single" w:color="999999" w:sz="4"/>
+              <w:right w:val="single" w:color="999999" w:sz="4"/>
+            </w:tcBorders>
+            <w:tcMar>
+              <w:top w:type="dxa" w:w="60"/>
+              <w:left w:type="dxa" w:w="100"/>
+              <w:bottom w:type="dxa" w:w="60"/>
+              <w:right w:type="dxa" w:w="100"/>
+            </w:tcMar>
+          </w:tcPr>
+          <w:p>
+            <w:pPr>
+              <w:jc w:val="left"/>
+            </w:pPr>
+            <w:r>
+              <w:t xml:space="preserve">Casual Wear</w:t>
+            </w:r>
+          </w:p>
+        </w:tc>
+        <w:tc>
+          <w:tcPr>
+            <w:tcW w:type="dxa" w:w="1600"/>
+            <w:tcBorders>
+              <w:top w:val="single" w:color="999999" w:sz="4"/>
+              <w:left w:val="single" w:color="999999" w:sz="4"/>
+              <w:bottom w:val="single" w:color="999999" w:sz="4"/>
+              <w:right w:val="single" w:color="999999" w:sz="4"/>
+            </w:tcBorders>
+            <w:tcMar>
+              <w:top w:type="dxa" w:w="60"/>
+              <w:left w:type="dxa" w:w="100"/>
+              <w:bottom w:type="dxa" w:w="60"/>
+              <w:right w:type="dxa" w:w="100"/>
+            </w:tcMar>
+          </w:tcPr>
+          <w:p>
+            <w:pPr>
+              <w:jc w:val="left"/>
+            </w:pPr>
+            <w:r>
+              <w:t xml:space="preserve">155.50</w:t>
+            </w:r>
+          </w:p>
+        </w:tc>
+        <w:tc>
+          <w:tcPr>
+            <w:tcW w:type="dxa" w:w="1800"/>
+            <w:tcBorders>
+              <w:top w:val="single" w:color="999999" w:sz="4"/>
+              <w:left w:val="single" w:color="999999" w:sz="4"/>
+              <w:bottom w:val="single" w:color="999999" w:sz="4"/>
+              <w:right w:val="single" w:color="999999" w:sz="4"/>
+            </w:tcBorders>
+            <w:tcMar>
+              <w:top w:type="dxa" w:w="60"/>
+              <w:left w:type="dxa" w:w="100"/>
+              <w:bottom w:type="dxa" w:w="60"/>
+              <w:right w:type="dxa" w:w="100"/>
+            </w:tcMar>
+          </w:tcPr>
+          <w:p>
+            <w:pPr>
+              <w:jc w:val="left"/>
+            </w:pPr>
+            <w:r>
+              <w:t xml:space="preserve">$8,659.83</w:t>
+            </w:r>
+          </w:p>
+        </w:tc>
+        <w:tc>
+          <w:tcPr>
+            <w:tcW w:type="dxa" w:w="1700"/>
+            <w:tcBorders>
+              <w:top w:val="single" w:color="999999" w:sz="4"/>
+              <w:left w:val="single" w:color="999999" w:sz="4"/>
+              <w:bottom w:val="single" w:color="999999" w:sz="4"/>
+              <w:right w:val="single" w:color="999999" w:sz="4"/>
+            </w:tcBorders>
+            <w:tcMar>
+              <w:top w:type="dxa" w:w="60"/>
+              <w:left w:type="dxa" w:w="100"/>
+              <w:bottom w:type="dxa" w:w="60"/>
+              <w:right w:type="dxa" w:w="100"/>
+            </w:tcMar>
+          </w:tcPr>
+          <w:p>
+            <w:pPr>
+              <w:jc w:val="left"/>
+            </w:pPr>
+            <w:r>
+              <w:t xml:space="preserve">12.52</w:t>
+            </w:r>
+          </w:p>
+        </w:tc>
+        <w:tc>
+          <w:tcPr>
+            <w:tcW w:type="dxa" w:w="1700"/>
+            <w:tcBorders>
+              <w:top w:val="single" w:color="999999" w:sz="4"/>
+              <w:left w:val="single" w:color="999999" w:sz="4"/>
+              <w:bottom w:val="single" w:color="999999" w:sz="4"/>
+              <w:right w:val="single" w:color="999999" w:sz="4"/>
+            </w:tcBorders>
+            <w:tcMar>
+              <w:top w:type="dxa" w:w="60"/>
+              <w:left w:type="dxa" w:w="100"/>
+              <w:bottom w:type="dxa" w:w="60"/>
+              <w:right w:type="dxa" w:w="100"/>
+            </w:tcMar>
+          </w:tcPr>
+          <w:p>
+            <w:pPr>
+              <w:jc w:val="left"/>
+            </w:pPr>
+            <w:r>
+              <w:t xml:space="preserve">253.27</w:t>
+            </w:r>
+          </w:p>
+        </w:tc>
+      </w:tr>
+      <w:tr>
+        <w:trPr>
+          <w:tblHeader w:val="false"/>
+        </w:trPr>
+        <w:tc>
+          <w:tcPr>
+            <w:tcW w:type="dxa" w:w="2560"/>
+            <w:tcBorders>
+              <w:top w:val="single" w:color="999999" w:sz="4"/>
+              <w:left w:val="single" w:color="999999" w:sz="4"/>
+              <w:bottom w:val="single" w:color="999999" w:sz="4"/>
+              <w:right w:val="single" w:color="999999" w:sz="4"/>
+            </w:tcBorders>
+            <w:tcMar>
+              <w:top w:type="dxa" w:w="60"/>
+              <w:left w:type="dxa" w:w="100"/>
+              <w:bottom w:type="dxa" w:w="60"/>
+              <w:right w:type="dxa" w:w="100"/>
+            </w:tcMar>
+          </w:tcPr>
+          <w:p>
+            <w:pPr>
+              <w:jc w:val="left"/>
+            </w:pPr>
+            <w:r>
+              <w:t xml:space="preserve">Fitness Wear</w:t>
+            </w:r>
+          </w:p>
+        </w:tc>
+        <w:tc>
+          <w:tcPr>
+            <w:tcW w:type="dxa" w:w="1600"/>
+            <w:tcBorders>
+              <w:top w:val="single" w:color="999999" w:sz="4"/>
+              <w:left w:val="single" w:color="999999" w:sz="4"/>
+              <w:bottom w:val="single" w:color="999999" w:sz="4"/>
+              <w:right w:val="single" w:color="999999" w:sz="4"/>
+            </w:tcBorders>
+            <w:tcMar>
+              <w:top w:type="dxa" w:w="60"/>
+              <w:left w:type="dxa" w:w="100"/>
+              <w:bottom w:type="dxa" w:w="60"/>
+              <w:right w:type="dxa" w:w="100"/>
+            </w:tcMar>
+          </w:tcPr>
+          <w:p>
+            <w:pPr>
+              <w:jc w:val="left"/>
+            </w:pPr>
+            <w:r>
+              <w:t xml:space="preserve">137.00</w:t>
+            </w:r>
+          </w:p>
+        </w:tc>
+        <w:tc>
+          <w:tcPr>
+            <w:tcW w:type="dxa" w:w="1800"/>
+            <w:tcBorders>
+              <w:top w:val="single" w:color="999999" w:sz="4"/>
+              <w:left w:val="single" w:color="999999" w:sz="4"/>
+              <w:bottom w:val="single" w:color="999999" w:sz="4"/>
+              <w:right w:val="single" w:color="999999" w:sz="4"/>
+            </w:tcBorders>
+            <w:tcMar>
+              <w:top w:type="dxa" w:w="60"/>
+              <w:left w:type="dxa" w:w="100"/>
+              <w:bottom w:type="dxa" w:w="60"/>
+              <w:right w:type="dxa" w:w="100"/>
+            </w:tcMar>
+          </w:tcPr>
+          <w:p>
+            <w:pPr>
+              <w:jc w:val="left"/>
+            </w:pPr>
+            <w:r>
+              <w:t xml:space="preserve">$7,673.12</w:t>
+            </w:r>
+          </w:p>
+        </w:tc>
+        <w:tc>
+          <w:tcPr>
+            <w:tcW w:type="dxa" w:w="1700"/>
+            <w:tcBorders>
+              <w:top w:val="single" w:color="999999" w:sz="4"/>
+              <w:left w:val="single" w:color="999999" w:sz="4"/>
+              <w:bottom w:val="single" w:color="999999" w:sz="4"/>
+              <w:right w:val="single" w:color="999999" w:sz="4"/>
+            </w:tcBorders>
+            <w:tcMar>
+              <w:top w:type="dxa" w:w="60"/>
+              <w:left w:type="dxa" w:w="100"/>
+              <w:bottom w:type="dxa" w:w="60"/>
+              <w:right w:type="dxa" w:w="100"/>
+            </w:tcMar>
+          </w:tcPr>
+          <w:p>
+            <w:pPr>
+              <w:jc w:val="left"/>
+            </w:pPr>
+            <w:r>
+              <w:t xml:space="preserve">12.57</w:t>
+            </w:r>
+          </w:p>
+        </w:tc>
+        <w:tc>
+          <w:tcPr>
+            <w:tcW w:type="dxa" w:w="1700"/>
+            <w:tcBorders>
+              <w:top w:val="single" w:color="999999" w:sz="4"/>
+              <w:left w:val="single" w:color="999999" w:sz="4"/>
+              <w:bottom w:val="single" w:color="999999" w:sz="4"/>
+              <w:right w:val="single" w:color="999999" w:sz="4"/>
+            </w:tcBorders>
+            <w:tcMar>
+              <w:top w:type="dxa" w:w="60"/>
+              <w:left w:type="dxa" w:w="100"/>
+              <w:bottom w:type="dxa" w:w="60"/>
+              <w:right w:type="dxa" w:w="100"/>
+            </w:tcMar>
+          </w:tcPr>
+          <w:p>
+            <w:pPr>
+              <w:jc w:val="left"/>
+            </w:pPr>
+            <w:r>
+              <w:t xml:space="preserve">254.02</w:t>
+            </w:r>
+          </w:p>
+        </w:tc>
+      </w:tr>
+      <w:tr>
+        <w:trPr>
+          <w:tblHeader w:val="false"/>
+        </w:trPr>
+        <w:tc>
+          <w:tcPr>
+            <w:tcW w:type="dxa" w:w="2560"/>
+            <w:tcBorders>
+              <w:top w:val="single" w:color="999999" w:sz="4"/>
+              <w:left w:val="single" w:color="999999" w:sz="4"/>
+              <w:bottom w:val="single" w:color="999999" w:sz="4"/>
+              <w:right w:val="single" w:color="999999" w:sz="4"/>
+            </w:tcBorders>
+            <w:tcMar>
+              <w:top w:type="dxa" w:w="60"/>
+              <w:left w:type="dxa" w:w="100"/>
+              <w:bottom w:type="dxa" w:w="60"/>
+              <w:right w:type="dxa" w:w="100"/>
+            </w:tcMar>
+          </w:tcPr>
+          <w:p>
+            <w:pPr>
+              <w:jc w:val="left"/>
+            </w:pPr>
+            <w:r>
+              <w:t xml:space="preserve">Footwear</w:t>
+            </w:r>
+          </w:p>
+        </w:tc>
+        <w:tc>
+          <w:tcPr>
+            <w:tcW w:type="dxa" w:w="1600"/>
+            <w:tcBorders>
+              <w:top w:val="single" w:color="999999" w:sz="4"/>
+              <w:left w:val="single" w:color="999999" w:sz="4"/>
+              <w:bottom w:val="single" w:color="999999" w:sz="4"/>
+              <w:right w:val="single" w:color="999999" w:sz="4"/>
+            </w:tcBorders>
+            <w:tcMar>
+              <w:top w:type="dxa" w:w="60"/>
+              <w:left w:type="dxa" w:w="100"/>
+              <w:bottom w:type="dxa" w:w="60"/>
+              <w:right w:type="dxa" w:w="100"/>
+            </w:tcMar>
+          </w:tcPr>
+          <w:p>
+            <w:pPr>
+              <w:jc w:val="left"/>
+            </w:pPr>
+            <w:r>
+              <w:t xml:space="preserve">133.00</w:t>
+            </w:r>
+          </w:p>
+        </w:tc>
+        <w:tc>
+          <w:tcPr>
+            <w:tcW w:type="dxa" w:w="1800"/>
+            <w:tcBorders>
+              <w:top w:val="single" w:color="999999" w:sz="4"/>
+              <w:left w:val="single" w:color="999999" w:sz="4"/>
+              <w:bottom w:val="single" w:color="999999" w:sz="4"/>
+              <w:right w:val="single" w:color="999999" w:sz="4"/>
+            </w:tcBorders>
+            <w:tcMar>
+              <w:top w:type="dxa" w:w="60"/>
+              <w:left w:type="dxa" w:w="100"/>
+              <w:bottom w:type="dxa" w:w="60"/>
+              <w:right w:type="dxa" w:w="100"/>
+            </w:tcMar>
+          </w:tcPr>
+          <w:p>
+            <w:pPr>
+              <w:jc w:val="left"/>
+            </w:pPr>
+            <w:r>
+              <w:t xml:space="preserve">$12,910.62</w:t>
+            </w:r>
+          </w:p>
+        </w:tc>
+        <w:tc>
+          <w:tcPr>
+            <w:tcW w:type="dxa" w:w="1700"/>
+            <w:tcBorders>
+              <w:top w:val="single" w:color="999999" w:sz="4"/>
+              <w:left w:val="single" w:color="999999" w:sz="4"/>
+              <w:bottom w:val="single" w:color="999999" w:sz="4"/>
+              <w:right w:val="single" w:color="999999" w:sz="4"/>
+            </w:tcBorders>
+            <w:tcMar>
+              <w:top w:type="dxa" w:w="60"/>
+              <w:left w:type="dxa" w:w="100"/>
+              <w:bottom w:type="dxa" w:w="60"/>
+              <w:right w:type="dxa" w:w="100"/>
+            </w:tcMar>
+          </w:tcPr>
+          <w:p>
+            <w:pPr>
+              <w:jc w:val="left"/>
+            </w:pPr>
+            <w:r>
+              <w:t xml:space="preserve">10.99</w:t>
+            </w:r>
+          </w:p>
+        </w:tc>
+        <w:tc>
+          <w:tcPr>
+            <w:tcW w:type="dxa" w:w="1700"/>
+            <w:tcBorders>
+              <w:top w:val="single" w:color="999999" w:sz="4"/>
+              <w:left w:val="single" w:color="999999" w:sz="4"/>
+              <w:bottom w:val="single" w:color="999999" w:sz="4"/>
+              <w:right w:val="single" w:color="999999" w:sz="4"/>
+            </w:tcBorders>
+            <w:tcMar>
+              <w:top w:type="dxa" w:w="60"/>
+              <w:left w:type="dxa" w:w="100"/>
+              <w:bottom w:type="dxa" w:w="60"/>
+              <w:right w:type="dxa" w:w="100"/>
+            </w:tcMar>
+          </w:tcPr>
+          <w:p>
+            <w:pPr>
+              <w:jc w:val="left"/>
+            </w:pPr>
+            <w:r>
+              <w:t xml:space="preserve">288.05</w:t>
+            </w:r>
+          </w:p>
+        </w:tc>
+      </w:tr>
+      <w:tr>
+        <w:trPr>
+          <w:tblHeader w:val="false"/>
+        </w:trPr>
+        <w:tc>
+          <w:tcPr>
+            <w:tcW w:type="dxa" w:w="2560"/>
+            <w:tcBorders>
+              <w:top w:val="single" w:color="999999" w:sz="4"/>
+              <w:left w:val="single" w:color="999999" w:sz="4"/>
+              <w:bottom w:val="single" w:color="999999" w:sz="4"/>
+              <w:right w:val="single" w:color="999999" w:sz="4"/>
+            </w:tcBorders>
+            <w:tcMar>
+              <w:top w:type="dxa" w:w="60"/>
+              <w:left w:type="dxa" w:w="100"/>
+              <w:bottom w:type="dxa" w:w="60"/>
+              <w:right w:type="dxa" w:w="100"/>
+            </w:tcMar>
+          </w:tcPr>
+          <w:p>
+            <w:pPr>
+              <w:jc w:val="left"/>
+            </w:pPr>
+            <w:r>
+              <w:t xml:space="preserve">Accessories</w:t>
+            </w:r>
+          </w:p>
+        </w:tc>
+        <w:tc>
+          <w:tcPr>
+            <w:tcW w:type="dxa" w:w="1600"/>
+            <w:tcBorders>
+              <w:top w:val="single" w:color="999999" w:sz="4"/>
+              <w:left w:val="single" w:color="999999" w:sz="4"/>
+              <w:bottom w:val="single" w:color="999999" w:sz="4"/>
+              <w:right w:val="single" w:color="999999" w:sz="4"/>
+            </w:tcBorders>
+            <w:tcMar>
+              <w:top w:type="dxa" w:w="60"/>
+              <w:left w:type="dxa" w:w="100"/>
+              <w:bottom w:type="dxa" w:w="60"/>
+              <w:right w:type="dxa" w:w="100"/>
+            </w:tcMar>
+          </w:tcPr>
+          <w:p>
+            <w:pPr>
+              <w:jc w:val="left"/>
+            </w:pPr>
+            <w:r>
+              <w:t xml:space="preserve">127.50</w:t>
+            </w:r>
+          </w:p>
+        </w:tc>
+        <w:tc>
+          <w:tcPr>
+            <w:tcW w:type="dxa" w:w="1800"/>
+            <w:tcBorders>
+              <w:top w:val="single" w:color="999999" w:sz="4"/>
+              <w:left w:val="single" w:color="999999" w:sz="4"/>
+              <w:bottom w:val="single" w:color="999999" w:sz="4"/>
+              <w:right w:val="single" w:color="999999" w:sz="4"/>
+            </w:tcBorders>
+            <w:tcMar>
+              <w:top w:type="dxa" w:w="60"/>
+              <w:left w:type="dxa" w:w="100"/>
+              <w:bottom w:type="dxa" w:w="60"/>
+              <w:right w:type="dxa" w:w="100"/>
+            </w:tcMar>
+          </w:tcPr>
+          <w:p>
+            <w:pPr>
+              <w:jc w:val="left"/>
+            </w:pPr>
+            <w:r>
+              <w:t xml:space="preserve">$6,900.57</w:t>
+            </w:r>
+          </w:p>
+        </w:tc>
+        <w:tc>
+          <w:tcPr>
+            <w:tcW w:type="dxa" w:w="1700"/>
+            <w:tcBorders>
+              <w:top w:val="single" w:color="999999" w:sz="4"/>
+              <w:left w:val="single" w:color="999999" w:sz="4"/>
+              <w:bottom w:val="single" w:color="999999" w:sz="4"/>
+              <w:right w:val="single" w:color="999999" w:sz="4"/>
+            </w:tcBorders>
+            <w:tcMar>
+              <w:top w:type="dxa" w:w="60"/>
+              <w:left w:type="dxa" w:w="100"/>
+              <w:bottom w:type="dxa" w:w="60"/>
+              <w:right w:type="dxa" w:w="100"/>
+            </w:tcMar>
+          </w:tcPr>
+          <w:p>
+            <w:pPr>
+              <w:jc w:val="left"/>
+            </w:pPr>
+            <w:r>
+              <w:t xml:space="preserve">11.91</w:t>
+            </w:r>
+          </w:p>
+        </w:tc>
+        <w:tc>
+          <w:tcPr>
+            <w:tcW w:type="dxa" w:w="1700"/>
+            <w:tcBorders>
+              <w:top w:val="single" w:color="999999" w:sz="4"/>
+              <w:left w:val="single" w:color="999999" w:sz="4"/>
+              <w:bottom w:val="single" w:color="999999" w:sz="4"/>
+              <w:right w:val="single" w:color="999999" w:sz="4"/>
+            </w:tcBorders>
+            <w:tcMar>
+              <w:top w:type="dxa" w:w="60"/>
+              <w:left w:type="dxa" w:w="100"/>
+              <w:bottom w:type="dxa" w:w="60"/>
+              <w:right w:type="dxa" w:w="100"/>
+            </w:tcMar>
+          </w:tcPr>
+          <w:p>
+            <w:pPr>
+              <w:jc w:val="left"/>
+            </w:pPr>
+            <w:r>
+              <w:t xml:space="preserve">270.53</w:t>
+            </w:r>
+          </w:p>
+        </w:tc>
+      </w:tr>
+    </w:tbl>
     <w:p>
       <w:pPr>
         <w:pStyle w:val="ListParagraph"/>
@@ -5114,19 +8865,11 @@
         <w:rPr>
           <w:b/>
           <w:bCs/>
-          <w:highlight w:val="yellow"/>
-          <w:highlightCs w:val="yellow"/>
         </w:rPr>
-        <w:t xml:space="preserve">[Revisar en el código: category y subcategory – las 4 variables]</w:t>
-      </w:r>
-    </w:p>
-    <w:p>
-      <w:pPr>
-        <w:pStyle w:val="Heading2"/>
-        <w:spacing w:after="100" w:before="180"/>
-      </w:pPr>
-      <w:r>
-        <w:t xml:space="preserve">5.2 Nivel Micro (6 cualitativas + Rango_Edad)</w:t>
+        <w:t xml:space="preserve">category:</w:t>
+      </w:r>
+      <w:r>
+        <w:t xml:space="preserve"> las diferencias son pequeñas. Casual Wear tiene la mediana más alta de unidades (155.5), pero Footwear genera más monto ($12,910.62) por su mayor precio; a la vez, Footwear tiene el menor cumplimiento (10.99%) y la mayor cobertura (288 días).</w:t>
       </w:r>
     </w:p>
     <w:p>
@@ -5142,10 +8885,28 @@
         <w:rPr>
           <w:b/>
           <w:bCs/>
-          <w:highlight w:val="yellow"/>
-          <w:highlightCs w:val="yellow"/>
         </w:rPr>
-        <w:t xml:space="preserve">[Revisar en el código: category, subcategory, region, Client_Category, Preferred_Channel]</w:t>
+        <w:t xml:space="preserve">subcategory (regla del 70% por unidades vendidas: Sneakers, Bottoms, Shirts, Pants, Dresses, Tops, Boots y Sandals; el resto en "Otras"):</w:t>
+      </w:r>
+      <w:r>
+        <w:t xml:space="preserve"> Bottoms tiene la mediana más alta de unidades (165) y Boots la de monto ($19,624.73). Las subcategorías de mayor precio (Boots, Sneakers y Bags) tienen el menor cumplimiento (10.17–10.29%) y la mayor cobertura (305–312 días): son las que más sobrestock acumulan.</w:t>
+      </w:r>
+    </w:p>
+    <w:p>
+      <w:pPr>
+        <w:pStyle w:val="Heading2"/>
+        <w:spacing w:after="100" w:before="180"/>
+      </w:pPr>
+      <w:r>
+        <w:t xml:space="preserve">5.2 Nivel Micro (6 cualitativas + Rango_Edad)</w:t>
+      </w:r>
+    </w:p>
+    <w:p>
+      <w:pPr>
+        <w:spacing w:after="120"/>
+      </w:pPr>
+      <w:r>
+        <w:t xml:space="preserve">Medianas por transacción. En todas las variables cualitativas, units_sold tiene mediana 2 y outliers a partir de 4 piezas (límite 3.5).</w:t>
       </w:r>
     </w:p>
     <w:p>
@@ -5162,10 +8923,10 @@
           <w:b/>
           <w:bCs/>
         </w:rPr>
-        <w:t xml:space="preserve">Socioeconomic_Level – units_sold:</w:t>
-      </w:r>
-      <w:r>
-        <w:t xml:space="preserve"> sin diferencias: en todos los niveles la caja va de 1 a 2 piezas, con outliers en 4, 5 y 6 piezas.</w:t>
+        <w:t xml:space="preserve">category y subcategory:</w:t>
+      </w:r>
+      <w:r>
+        <w:t xml:space="preserve"> solo cambia el monto por transacción, por el precio de cada producto: Footwear tiene mediana de $159.74 contra ~$90–92 del resto; por subcategoría va de $59.83 (Shirts) a $209.54 (Boots). La frecuencia (mediana 5) y el gasto anual (~$6,600–6,780) son iguales en todas.</w:t>
       </w:r>
     </w:p>
     <w:p>
@@ -5182,19 +8943,10 @@
           <w:b/>
           <w:bCs/>
         </w:rPr>
-        <w:t xml:space="preserve">Socioeconomic_Level – Annual_Purchase_Frequency:</w:t>
-      </w:r>
-      <w:r>
-        <w:t xml:space="preserve"> la mediana aumenta en cada nivel, de Bajo (la más baja) a Alto (la más alta). Todos los niveles tienen outliers en la parte alta. </w:t>
-      </w:r>
-      <w:r>
-        <w:rPr>
-          <w:b/>
-          <w:bCs/>
-          <w:highlight w:val="yellow"/>
-          <w:highlightCs w:val="yellow"/>
-        </w:rPr>
-        <w:t xml:space="preserve">[Revisar en el código: medianas por nivel]</w:t>
+        <w:t xml:space="preserve">region:</w:t>
+      </w:r>
+      <w:r>
+        <w:t xml:space="preserve"> el monto por transacción es igual en todas (~$108–110) y la frecuencia también (mediana 5). Cambia el gasto anual: Ciudad de México ($7,155.00) y Monterrey ($6,953.96) contra Sur ($5,960.64) y Bajío ($5,967.45).</w:t>
       </w:r>
     </w:p>
     <w:p>
@@ -5211,19 +8963,10 @@
           <w:b/>
           <w:bCs/>
         </w:rPr>
-        <w:t xml:space="preserve">Socioeconomic_Level – sales_amount:</w:t>
-      </w:r>
-      <w:r>
-        <w:t xml:space="preserve"> el ticket por transacción es muy similar en todos los niveles, con outliers en la parte alta en todos. </w:t>
-      </w:r>
-      <w:r>
-        <w:rPr>
-          <w:b/>
-          <w:bCs/>
-          <w:highlight w:val="yellow"/>
-          <w:highlightCs w:val="yellow"/>
-        </w:rPr>
-        <w:t xml:space="preserve">[Revisar en el código: medianas y límite de outliers]</w:t>
+        <w:t xml:space="preserve">Client_Category:</w:t>
+      </w:r>
+      <w:r>
+        <w:t xml:space="preserve"> gran diferencia en valor del cliente: la frecuencia anual mediana es 4 en Básico, 7 en Silver, 12 en Gold y 11 en Premium, y el gasto anual mediano es $2,938.50, $13,040.24, $38,239.08 y $57,971.16 respectivamente. El ticket por transacción casi no cambia ($105–120). El programa de lealtad sí separa a los clientes de mayor valor.</w:t>
       </w:r>
     </w:p>
     <w:p>
@@ -5240,29 +8983,10 @@
           <w:b/>
           <w:bCs/>
         </w:rPr>
-        <w:t xml:space="preserve">Socioeconomic_Level – Annual_Total_Spend (escala log):</w:t>
-      </w:r>
-      <w:r>
-        <w:t xml:space="preserve"> fuerte gradiente: el gasto anual sube en cada nivel, de Bajo a Alto. </w:t>
-      </w:r>
-      <w:r>
-        <w:rPr>
-          <w:b/>
-          <w:bCs/>
-        </w:rPr>
-        <w:t xml:space="preserve">Conclusión:</w:t>
-      </w:r>
-      <w:r>
-        <w:t xml:space="preserve"> los clientes de nivel alto no gastan más por compra, sino que compran con mayor frecuencia. </w:t>
-      </w:r>
-      <w:r>
-        <w:rPr>
-          <w:b/>
-          <w:bCs/>
-          <w:highlight w:val="yellow"/>
-          <w:highlightCs w:val="yellow"/>
-        </w:rPr>
-        <w:t xml:space="preserve">[Revisar en el código: medianas por nivel]</w:t>
+        <w:t xml:space="preserve">Preferred_Channel:</w:t>
+      </w:r>
+      <w:r>
+        <w:t xml:space="preserve"> sin diferencias relevantes: App, Online y Tienda física tienen mediana de 5 compras al año, ~$110 por transacción y ~$6,600–6,810 de gasto anual.</w:t>
       </w:r>
     </w:p>
     <w:p>
@@ -5279,26 +9003,10 @@
           <w:b/>
           <w:bCs/>
         </w:rPr>
-        <w:t xml:space="preserve">Rango_Edad:</w:t>
-      </w:r>
-      <w:r>
-        <w:t xml:space="preserve"> las cuatro variables (units_sold, Annual_Purchase_Frequency, sales_amount, Annual_Total_Spend) tienen distribuciones prácticamente iguales en todos los rangos, y todos presentan outliers de sales_amount en la parte alta. </w:t>
-      </w:r>
-      <w:r>
-        <w:rPr>
-          <w:b/>
-          <w:bCs/>
-        </w:rPr>
-        <w:t xml:space="preserve">La edad no diferencia el comportamiento de compra.</w:t>
-      </w:r>
-    </w:p>
-    <w:p>
-      <w:pPr>
-        <w:pStyle w:val="Heading2"/>
-        <w:spacing w:after="100" w:before="180"/>
-      </w:pPr>
-      <w:r>
-        <w:t xml:space="preserve">Análisis adicional: Stock vs. Esperado vs. Vendido</w:t>
+        <w:t xml:space="preserve">Socioeconomic_Level – units_sold:</w:t>
+      </w:r>
+      <w:r>
+        <w:t xml:space="preserve"> sin diferencias: en todos los niveles la caja va de 1 a 2 piezas, con outliers en 4, 5 y 6 piezas.</w:t>
       </w:r>
     </w:p>
     <w:p>
@@ -5311,7 +9019,14 @@
         <w:spacing w:after="60"/>
       </w:pPr>
       <w:r>
-        <w:t xml:space="preserve">En todos los meses de 2024 y 2025 las unidades vendidas son muy inferiores a la demanda esperada y al stock; en el nivel macro el cumplimiento promedio es de 15.69%.</w:t>
+        <w:rPr>
+          <w:b/>
+          <w:bCs/>
+        </w:rPr>
+        <w:t xml:space="preserve">Socioeconomic_Level – Annual_Purchase_Frequency:</w:t>
+      </w:r>
+      <w:r>
+        <w:t xml:space="preserve"> la mediana aumenta en cada nivel: 3 compras al año en Bajo, 4 en Medio-Bajo, 7 en Medio, 9 en Medio-Alto y 12 en Alto. Todos los niveles tienen outliers en la parte alta.</w:t>
       </w:r>
     </w:p>
     <w:p>
@@ -5324,7 +9039,14 @@
         <w:spacing w:after="60"/>
       </w:pPr>
       <w:r>
-        <w:t xml:space="preserve">El stock es mayor que la demanda esperada en todos los meses.</w:t>
+        <w:rPr>
+          <w:b/>
+          <w:bCs/>
+        </w:rPr>
+        <w:t xml:space="preserve">Socioeconomic_Level – sales_amount:</w:t>
+      </w:r>
+      <w:r>
+        <w:t xml:space="preserve"> el ticket por transacción es muy similar: mediana de $103.06 en Bajo a $119.94 en Alto. Outliers en todos los niveles; el límite general es $333.93.</w:t>
       </w:r>
     </w:p>
     <w:p>
@@ -5337,7 +9059,24 @@
         <w:spacing w:after="60"/>
       </w:pPr>
       <w:r>
-        <w:t xml:space="preserve">En enero de 2025 la demanda esperada y el stock suben de nivel, mientras que las ventas se mantienen en un nivel similar al de 2024.</w:t>
+        <w:rPr>
+          <w:b/>
+          <w:bCs/>
+        </w:rPr>
+        <w:t xml:space="preserve">Socioeconomic_Level – Annual_Total_Spend (escala log):</w:t>
+      </w:r>
+      <w:r>
+        <w:t xml:space="preserve"> fuerte gradiente: mediana de $1,769.32 en Bajo, $4,804.98 en Medio-Bajo, $12,001.62 en Medio, $21,154.40 en Medio-Alto y $41,275.52 en Alto (23 veces más que Bajo). </w:t>
+      </w:r>
+      <w:r>
+        <w:rPr>
+          <w:b/>
+          <w:bCs/>
+        </w:rPr>
+        <w:t xml:space="preserve">Conclusión:</w:t>
+      </w:r>
+      <w:r>
+        <w:t xml:space="preserve"> los clientes de nivel alto no gastan mucho más por compra, sino que compran con mayor frecuencia.</w:t>
       </w:r>
     </w:p>
     <w:p>
@@ -5350,7 +9089,30 @@
         <w:spacing w:after="60"/>
       </w:pPr>
       <w:r>
-        <w:t xml:space="preserve">Las ventas tienen picos en noviembre y diciembre, mientras que la demanda esperada se mantiene casi plana.</w:t>
+        <w:rPr>
+          <w:b/>
+          <w:bCs/>
+        </w:rPr>
+        <w:t xml:space="preserve">Rango_Edad:</w:t>
+      </w:r>
+      <w:r>
+        <w:t xml:space="preserve"> las cuatro variables tienen distribuciones prácticamente iguales: mediana de 2 piezas y 5 compras al año en todos los rangos, ticket mediano de $109.38 a $110.16 y gasto anual mediano de $6,566.55 a $6,838.72. Todos presentan outliers de sales_amount por arriba de $333.93. </w:t>
+      </w:r>
+      <w:r>
+        <w:rPr>
+          <w:b/>
+          <w:bCs/>
+        </w:rPr>
+        <w:t xml:space="preserve">La edad no diferencia el comportamiento de compra.</w:t>
+      </w:r>
+    </w:p>
+    <w:p>
+      <w:pPr>
+        <w:pStyle w:val="Heading2"/>
+        <w:spacing w:after="100" w:before="180"/>
+      </w:pPr>
+      <w:r>
+        <w:t xml:space="preserve">Análisis adicional: Stock vs. Esperado vs. Vendido</w:t>
       </w:r>
     </w:p>
     <w:p>
@@ -5363,13 +9125,46 @@
         <w:spacing w:after="60"/>
       </w:pPr>
       <w:r>
-        <w:rPr>
-          <w:b/>
-          <w:bCs/>
-          <w:highlight w:val="yellow"/>
-          <w:highlightCs w:val="yellow"/>
-        </w:rPr>
-        <w:t xml:space="preserve">[Revisar en el código: cifras mensuales exactas en la tabla print(por_mes)]</w:t>
+        <w:t xml:space="preserve">Se venden entre 160,918 (febrero 2024) y 231,237 (diciembre 2025) unidades al mes, contra una demanda esperada de 1.07 a 1.16 millones: el cumplimiento mensual va de 14.15% a 21.28% (17.49% en promedio en 2024 y 16.49% en 2025).</w:t>
+      </w:r>
+    </w:p>
+    <w:p>
+      <w:pPr>
+        <w:pStyle w:val="ListParagraph"/>
+        <w:numPr>
+          <w:ilvl w:val="0"/>
+          <w:numId w:val="2"/>
+        </w:numPr>
+        <w:spacing w:after="60"/>
+      </w:pPr>
+      <w:r>
+        <w:t xml:space="preserve">El stock es mayor que la demanda esperada en todos los meses, entre 110.05% y 112.28% de lo esperado.</w:t>
+      </w:r>
+    </w:p>
+    <w:p>
+      <w:pPr>
+        <w:pStyle w:val="ListParagraph"/>
+        <w:numPr>
+          <w:ilvl w:val="0"/>
+          <w:numId w:val="2"/>
+        </w:numPr>
+        <w:spacing w:after="60"/>
+      </w:pPr>
+      <w:r>
+        <w:t xml:space="preserve">De 2024 a 2025 la demanda esperada mensual promedio subió 6.35% (de 1,078,219 a 1,146,720 unidades) y el stock 6.26%, pero las ventas solo 0.29% (de 188,592 a 189,143).</w:t>
+      </w:r>
+    </w:p>
+    <w:p>
+      <w:pPr>
+        <w:pStyle w:val="ListParagraph"/>
+        <w:numPr>
+          <w:ilvl w:val="0"/>
+          <w:numId w:val="2"/>
+        </w:numPr>
+        <w:spacing w:after="60"/>
+      </w:pPr>
+      <w:r>
+        <w:t xml:space="preserve">Las ventas tienen estacionalidad: picos en noviembre y diciembre (~230 mil unidades, 20–21% de cumplimiento) y mínimo en febrero (~161 mil), mientras que la demanda esperada se mantiene casi plana.</w:t>
       </w:r>
     </w:p>
     <w:p>
@@ -6981,7 +10776,7 @@
         <w:spacing w:after="60"/>
       </w:pPr>
       <w:r>
-        <w:t xml:space="preserve">Ciudad de México, Monterrey y Guadalajara concentran el 73.64% de las transacciones y tienen el mejor cumplimiento; las regiones pequeñas (sobre todo Sureste) acumulan el sobrestock.</w:t>
+        <w:t xml:space="preserve">Ciudad de México, Monterrey y Guadalajara concentran el 73.64% de las transacciones y tienen el mejor cumplimiento (33.29%, 22.44% y 17.41%); Sureste solo cumple el 6.58% y su inventario cubre 472 días.</w:t>
       </w:r>
     </w:p>
     <w:p>
@@ -7007,7 +10802,7 @@
         <w:spacing w:after="60"/>
       </w:pPr>
       <w:r>
-        <w:t xml:space="preserve">El nivel socioeconómico es el principal diferenciador del valor del cliente: el gasto anual sube de Bajo a Alto por mayor frecuencia de compra, no por un ticket más alto.</w:t>
+        <w:t xml:space="preserve">El nivel socioeconómico es el principal diferenciador del valor del cliente: el gasto anual mediano sube de $1,769.32 (Bajo) a $41,275.52 (Alto) por mayor frecuencia de compra (3 vs. 12 compras al año), no por un ticket más alto.</w:t>
       </w:r>
     </w:p>
     <w:p>
@@ -7020,7 +10815,7 @@
         <w:spacing w:after="60"/>
       </w:pPr>
       <w:r>
-        <w:t xml:space="preserve">La edad no cambia el comportamiento de compra: todos los rangos tienen distribuciones casi idénticas; el rango 35-44 es el que más vende (23.0% de las ventas).</w:t>
+        <w:t xml:space="preserve">El 61.95% de los clientes tiene entre 25 y 54 años; el rango 35-44 es el que más vende (22.99%), pero la edad no cambia el comportamiento: todos los rangos gastan ~$7,000 por cliente.</w:t>
       </w:r>
     </w:p>
     <w:p>
@@ -7033,7 +10828,20 @@
         <w:spacing w:after="60"/>
       </w:pPr>
       <w:r>
-        <w:t xml:space="preserve">En 2025 aumentaron la proyección y el stock sin que aumentaran las ventas; se recomienda proyectar con ventas históricas e incorporar la estacionalidad.</w:t>
+        <w:t xml:space="preserve">El programa de lealtad sí distingue a los clientes de mayor valor: el gasto anual mediano va de $2,938.50 (Básico) a $57,971.16 (Premium).</w:t>
+      </w:r>
+    </w:p>
+    <w:p>
+      <w:pPr>
+        <w:pStyle w:val="ListParagraph"/>
+        <w:numPr>
+          <w:ilvl w:val="0"/>
+          <w:numId w:val="2"/>
+        </w:numPr>
+        <w:spacing w:after="60"/>
+      </w:pPr>
+      <w:r>
+        <w:t xml:space="preserve">En 2025 la proyección y el stock subieron ~6.3% mientras las ventas solo 0.29%; se recomienda proyectar con ventas históricas e incorporar la estacionalidad.</w:t>
       </w:r>
     </w:p>
     <w:p>

</xml_diff>

<commit_message>
Fix inconsistent outlier limits and clarify figures in Word report
Co-Authored-By: Claude Opus 5.5 <noreply@anthropic.com>
Claude-Session: https://claude.ai/code/session_01Kk2nfkPg9B6EJa48cu7SnH
</commit_message>
<xml_diff>
--- a/TI3002C_Etapa_4.2_Equipo_6.docx
+++ b/TI3002C_Etapa_4.2_Equipo_6.docx
@@ -845,7 +845,7 @@
               <w:jc w:val="left"/>
             </w:pPr>
             <w:r>
-              <w:t xml:space="preserve">13</w:t>
+              <w:t xml:space="preserve">13 (incluye year)</w:t>
             </w:r>
           </w:p>
         </w:tc>
@@ -950,7 +950,7 @@
               <w:jc w:val="left"/>
             </w:pPr>
             <w:r>
-              <w:t xml:space="preserve">19</w:t>
+              <w:t xml:space="preserve">19 (incluye day y year)</w:t>
             </w:r>
           </w:p>
         </w:tc>
@@ -975,7 +975,7 @@
               <w:jc w:val="left"/>
             </w:pPr>
             <w:r>
-              <w:t xml:space="preserve">18 (incluye identificadores)</w:t>
+              <w:t xml:space="preserve">18 (incluye identificadores; 19 al crear Rango_Edad)</w:t>
             </w:r>
           </w:p>
         </w:tc>
@@ -6275,7 +6275,7 @@
               <w:jc w:val="left"/>
             </w:pPr>
             <w:r>
-              <w:t xml:space="preserve">Media 15.69%, σ 9.64. El 50% central está entre 8.11% y 21.25%; mediana 12.01%. Outliers a partir de 40.96%; 22 registros (0.10%) fuera de ±3.5σ y 0 atípicos extremos (&gt; 3 IQR). Máximo 57.81%.</w:t>
+              <w:t xml:space="preserve">Media 15.69%, σ 9.64. El 50% central está entre 8.11% y 21.25%; mediana 12.01%. Outliers a partir de 40.97%; 22 registros (0.10%) fuera de ±3.5σ y 0 atípicos extremos (&gt; 3 IQR). Máximo 57.81%.</w:t>
             </w:r>
           </w:p>
         </w:tc>
@@ -6330,7 +6330,7 @@
               <w:jc w:val="left"/>
             </w:pPr>
             <w:r>
-              <w:t xml:space="preserve">Media 289.35 días, σ 152.04. El 50% central está entre 165.30 y 383.27 días; mediana 266.59. Outliers a partir de 710.23 días; 93 registros (0.43%) fuera de ±3.5σ y 16 atípicos extremos (0.07%). Máximo 1,377.41 días.</w:t>
+              <w:t xml:space="preserve">Media 289.35 días, σ 152.04. El 50% central está entre 165.30 y 383.27 días; mediana 266.59. Outliers a partir de 710.25 días; 93 registros (0.43%) fuera de ±3.5σ y 16 atípicos extremos (0.07%). Máximo 1,377.41 días.</w:t>
             </w:r>
           </w:p>
         </w:tc>
@@ -9026,7 +9026,7 @@
         <w:t xml:space="preserve">Socioeconomic_Level – Annual_Purchase_Frequency:</w:t>
       </w:r>
       <w:r>
-        <w:t xml:space="preserve"> la mediana aumenta en cada nivel: 3 compras al año en Bajo, 4 en Medio-Bajo, 7 en Medio, 9 en Medio-Alto y 12 en Alto. Todos los niveles tienen outliers en la parte alta.</w:t>
+        <w:t xml:space="preserve"> la mediana aumenta en cada nivel: 3 compras al año en Bajo, 4 en Medio-Bajo, 7 en Medio, 9 en Medio-Alto y 12 en Alto. Todos los niveles tienen outliers en la parte alta: a partir de 10 compras en Bajo, 11 en Medio-Bajo, 16 en Medio, 20 en Medio-Alto y 22 en Alto.</w:t>
       </w:r>
     </w:p>
     <w:p>
@@ -9096,7 +9096,7 @@
         <w:t xml:space="preserve">Rango_Edad:</w:t>
       </w:r>
       <w:r>
-        <w:t xml:space="preserve"> las cuatro variables tienen distribuciones prácticamente iguales: mediana de 2 piezas y 5 compras al año en todos los rangos, ticket mediano de $109.38 a $110.16 y gasto anual mediano de $6,566.55 a $6,838.72. Todos presentan outliers de sales_amount por arriba de $333.93. </w:t>
+        <w:t xml:space="preserve"> las cuatro variables tienen distribuciones prácticamente iguales: mediana de 2 piezas y 5 compras al año en todos los rangos, ticket mediano de $109.38 a $110.16 y gasto anual mediano de $6,566.55 a $6,838.72. Todos presentan outliers de sales_amount en la parte alta (límite general $333.93). </w:t>
       </w:r>
       <w:r>
         <w:rPr>
@@ -10763,7 +10763,7 @@
         <w:spacing w:after="60"/>
       </w:pPr>
       <w:r>
-        <w:t xml:space="preserve">DanuStore solo vende en promedio el 15.69% de las unidades esperadas y su inventario cubre en promedio 289 días: existe una sobreestimación sistemática de la demanda.</w:t>
+        <w:t xml:space="preserve">DanuStore solo vende en promedio el 15.69% de las unidades esperadas por producto-región-mes (16–17% al sumar todo el mes) y su inventario cubre en promedio 289 días: existe una sobreestimación sistemática de la demanda.</w:t>
       </w:r>
     </w:p>
     <w:p>
@@ -10776,7 +10776,7 @@
         <w:spacing w:after="60"/>
       </w:pPr>
       <w:r>
-        <w:t xml:space="preserve">Ciudad de México, Monterrey y Guadalajara concentran el 73.64% de las transacciones y tienen el mejor cumplimiento (33.29%, 22.44% y 17.41%); Sureste solo cumple el 6.58% y su inventario cubre 472 días.</w:t>
+        <w:t xml:space="preserve">Ciudad de México, Monterrey y Guadalajara concentran el 73.64% de las transacciones y tienen el mejor cumplimiento mediano (33.29%, 22.44% y 17.41%); Sureste tiene una mediana de solo 6.58% y su inventario cubre 472 días.</w:t>
       </w:r>
     </w:p>
     <w:p>

</xml_diff>

<commit_message>
Add outlier limits for all variables and per category in Word report
Co-Authored-By: Claude Opus 5.5 <noreply@anthropic.com>
Claude-Session: https://claude.ai/code/session_01Kk2nfkPg9B6EJa48cu7SnH
</commit_message>
<xml_diff>
--- a/TI3002C_Etapa_4.2_Equipo_6.docx
+++ b/TI3002C_Etapa_4.2_Equipo_6.docx
@@ -6330,7 +6330,7 @@
               <w:jc w:val="left"/>
             </w:pPr>
             <w:r>
-              <w:t xml:space="preserve">Media 289.35 días, σ 152.04. El 50% central está entre 165.30 y 383.27 días; mediana 266.59. Outliers a partir de 710.25 días; 93 registros (0.43%) fuera de ±3.5σ y 16 atípicos extremos (0.07%). Máximo 1,377.41 días.</w:t>
+              <w:t xml:space="preserve">Media 289.35 días, σ 152.04. El 50% central está entre 165.30 y 383.27 días; mediana 266.59. Outliers a partir de 710.24 días; 93 registros (0.43%) fuera de ±3.5σ y 16 atípicos extremos (0.07%). Máximo 1,377.41 días.</w:t>
             </w:r>
           </w:p>
         </w:tc>
@@ -6921,6 +6921,3389 @@
         </w:tc>
       </w:tr>
     </w:tbl>
+    <w:p>
+      <w:pPr>
+        <w:pStyle w:val="Heading2"/>
+        <w:spacing w:after="100" w:before="180"/>
+      </w:pPr>
+      <w:r>
+        <w:t xml:space="preserve">E. Boxplots de todas las variables cuantitativas</w:t>
+      </w:r>
+    </w:p>
+    <w:p>
+      <w:pPr>
+        <w:spacing w:after="120"/>
+      </w:pPr>
+      <w:r>
+        <w:t xml:space="preserve">Límites de outliers (Q1 − 1.5·IQR y Q3 + 1.5·IQR) de todas las variables cuantitativas graficadas en la sección 4.4.</w:t>
+      </w:r>
+    </w:p>
+    <w:tbl>
+      <w:tblPr>
+        <w:tblW w:type="dxa" w:w="9360"/>
+        <w:tblBorders>
+          <w:top w:val="single" w:color="auto" w:sz="4"/>
+          <w:left w:val="single" w:color="auto" w:sz="4"/>
+          <w:bottom w:val="single" w:color="auto" w:sz="4"/>
+          <w:right w:val="single" w:color="auto" w:sz="4"/>
+          <w:insideH w:val="single" w:color="auto" w:sz="4"/>
+          <w:insideV w:val="single" w:color="auto" w:sz="4"/>
+        </w:tblBorders>
+      </w:tblPr>
+      <w:tblGrid>
+        <w:gridCol w:w="3200"/>
+        <w:gridCol w:w="2560"/>
+        <w:gridCol w:w="1800"/>
+        <w:gridCol w:w="1800"/>
+      </w:tblGrid>
+      <w:tr>
+        <w:trPr>
+          <w:tblHeader/>
+        </w:trPr>
+        <w:tc>
+          <w:tcPr>
+            <w:tcW w:type="dxa" w:w="3200"/>
+            <w:tcBorders>
+              <w:top w:val="single" w:color="999999" w:sz="4"/>
+              <w:left w:val="single" w:color="999999" w:sz="4"/>
+              <w:bottom w:val="single" w:color="999999" w:sz="4"/>
+              <w:right w:val="single" w:color="999999" w:sz="4"/>
+            </w:tcBorders>
+            <w:shd w:fill="1F4E79" w:color="auto" w:val="clear"/>
+            <w:tcMar>
+              <w:top w:type="dxa" w:w="60"/>
+              <w:left w:type="dxa" w:w="100"/>
+              <w:bottom w:type="dxa" w:w="60"/>
+              <w:right w:type="dxa" w:w="100"/>
+            </w:tcMar>
+          </w:tcPr>
+          <w:p>
+            <w:pPr>
+              <w:jc w:val="left"/>
+            </w:pPr>
+            <w:r>
+              <w:rPr>
+                <w:b/>
+                <w:bCs/>
+                <w:color w:val="FFFFFF"/>
+                <w:sz w:val="18"/>
+                <w:szCs w:val="18"/>
+              </w:rPr>
+              <w:t xml:space="preserve">Variable (Macro)</w:t>
+            </w:r>
+          </w:p>
+        </w:tc>
+        <w:tc>
+          <w:tcPr>
+            <w:tcW w:type="dxa" w:w="2560"/>
+            <w:tcBorders>
+              <w:top w:val="single" w:color="999999" w:sz="4"/>
+              <w:left w:val="single" w:color="999999" w:sz="4"/>
+              <w:bottom w:val="single" w:color="999999" w:sz="4"/>
+              <w:right w:val="single" w:color="999999" w:sz="4"/>
+            </w:tcBorders>
+            <w:shd w:fill="1F4E79" w:color="auto" w:val="clear"/>
+            <w:tcMar>
+              <w:top w:type="dxa" w:w="60"/>
+              <w:left w:type="dxa" w:w="100"/>
+              <w:bottom w:type="dxa" w:w="60"/>
+              <w:right w:type="dxa" w:w="100"/>
+            </w:tcMar>
+          </w:tcPr>
+          <w:p>
+            <w:pPr>
+              <w:jc w:val="left"/>
+            </w:pPr>
+            <w:r>
+              <w:rPr>
+                <w:b/>
+                <w:bCs/>
+                <w:color w:val="FFFFFF"/>
+                <w:sz w:val="18"/>
+                <w:szCs w:val="18"/>
+              </w:rPr>
+              <w:t xml:space="preserve">Outliers desde</w:t>
+            </w:r>
+          </w:p>
+        </w:tc>
+        <w:tc>
+          <w:tcPr>
+            <w:tcW w:type="dxa" w:w="1800"/>
+            <w:tcBorders>
+              <w:top w:val="single" w:color="999999" w:sz="4"/>
+              <w:left w:val="single" w:color="999999" w:sz="4"/>
+              <w:bottom w:val="single" w:color="999999" w:sz="4"/>
+              <w:right w:val="single" w:color="999999" w:sz="4"/>
+            </w:tcBorders>
+            <w:shd w:fill="1F4E79" w:color="auto" w:val="clear"/>
+            <w:tcMar>
+              <w:top w:type="dxa" w:w="60"/>
+              <w:left w:type="dxa" w:w="100"/>
+              <w:bottom w:type="dxa" w:w="60"/>
+              <w:right w:type="dxa" w:w="100"/>
+            </w:tcMar>
+          </w:tcPr>
+          <w:p>
+            <w:pPr>
+              <w:jc w:val="left"/>
+            </w:pPr>
+            <w:r>
+              <w:rPr>
+                <w:b/>
+                <w:bCs/>
+                <w:color w:val="FFFFFF"/>
+                <w:sz w:val="18"/>
+                <w:szCs w:val="18"/>
+              </w:rPr>
+              <w:t xml:space="preserve">N.º outliers</w:t>
+            </w:r>
+          </w:p>
+        </w:tc>
+        <w:tc>
+          <w:tcPr>
+            <w:tcW w:type="dxa" w:w="1800"/>
+            <w:tcBorders>
+              <w:top w:val="single" w:color="999999" w:sz="4"/>
+              <w:left w:val="single" w:color="999999" w:sz="4"/>
+              <w:bottom w:val="single" w:color="999999" w:sz="4"/>
+              <w:right w:val="single" w:color="999999" w:sz="4"/>
+            </w:tcBorders>
+            <w:shd w:fill="1F4E79" w:color="auto" w:val="clear"/>
+            <w:tcMar>
+              <w:top w:type="dxa" w:w="60"/>
+              <w:left w:type="dxa" w:w="100"/>
+              <w:bottom w:type="dxa" w:w="60"/>
+              <w:right w:type="dxa" w:w="100"/>
+            </w:tcMar>
+          </w:tcPr>
+          <w:p>
+            <w:pPr>
+              <w:jc w:val="left"/>
+            </w:pPr>
+            <w:r>
+              <w:rPr>
+                <w:b/>
+                <w:bCs/>
+                <w:color w:val="FFFFFF"/>
+                <w:sz w:val="18"/>
+                <w:szCs w:val="18"/>
+              </w:rPr>
+              <w:t xml:space="preserve">%</w:t>
+            </w:r>
+          </w:p>
+        </w:tc>
+      </w:tr>
+      <w:tr>
+        <w:trPr>
+          <w:tblHeader w:val="false"/>
+        </w:trPr>
+        <w:tc>
+          <w:tcPr>
+            <w:tcW w:type="dxa" w:w="3200"/>
+            <w:tcBorders>
+              <w:top w:val="single" w:color="999999" w:sz="4"/>
+              <w:left w:val="single" w:color="999999" w:sz="4"/>
+              <w:bottom w:val="single" w:color="999999" w:sz="4"/>
+              <w:right w:val="single" w:color="999999" w:sz="4"/>
+            </w:tcBorders>
+            <w:tcMar>
+              <w:top w:type="dxa" w:w="60"/>
+              <w:left w:type="dxa" w:w="100"/>
+              <w:bottom w:type="dxa" w:w="60"/>
+              <w:right w:type="dxa" w:w="100"/>
+            </w:tcMar>
+          </w:tcPr>
+          <w:p>
+            <w:pPr>
+              <w:jc w:val="left"/>
+            </w:pPr>
+            <w:r>
+              <w:t xml:space="preserve">units_expected</w:t>
+            </w:r>
+          </w:p>
+        </w:tc>
+        <w:tc>
+          <w:tcPr>
+            <w:tcW w:type="dxa" w:w="2560"/>
+            <w:tcBorders>
+              <w:top w:val="single" w:color="999999" w:sz="4"/>
+              <w:left w:val="single" w:color="999999" w:sz="4"/>
+              <w:bottom w:val="single" w:color="999999" w:sz="4"/>
+              <w:right w:val="single" w:color="999999" w:sz="4"/>
+            </w:tcBorders>
+            <w:tcMar>
+              <w:top w:type="dxa" w:w="60"/>
+              <w:left w:type="dxa" w:w="100"/>
+              <w:bottom w:type="dxa" w:w="60"/>
+              <w:right w:type="dxa" w:w="100"/>
+            </w:tcMar>
+          </w:tcPr>
+          <w:p>
+            <w:pPr>
+              <w:jc w:val="left"/>
+            </w:pPr>
+            <w:r>
+              <w:t xml:space="preserve">&gt; 2,434.38</w:t>
+            </w:r>
+          </w:p>
+        </w:tc>
+        <w:tc>
+          <w:tcPr>
+            <w:tcW w:type="dxa" w:w="1800"/>
+            <w:tcBorders>
+              <w:top w:val="single" w:color="999999" w:sz="4"/>
+              <w:left w:val="single" w:color="999999" w:sz="4"/>
+              <w:bottom w:val="single" w:color="999999" w:sz="4"/>
+              <w:right w:val="single" w:color="999999" w:sz="4"/>
+            </w:tcBorders>
+            <w:tcMar>
+              <w:top w:type="dxa" w:w="60"/>
+              <w:left w:type="dxa" w:w="100"/>
+              <w:bottom w:type="dxa" w:w="60"/>
+              <w:right w:type="dxa" w:w="100"/>
+            </w:tcMar>
+          </w:tcPr>
+          <w:p>
+            <w:pPr>
+              <w:jc w:val="left"/>
+            </w:pPr>
+            <w:r>
+              <w:t xml:space="preserve">125</w:t>
+            </w:r>
+          </w:p>
+        </w:tc>
+        <w:tc>
+          <w:tcPr>
+            <w:tcW w:type="dxa" w:w="1800"/>
+            <w:tcBorders>
+              <w:top w:val="single" w:color="999999" w:sz="4"/>
+              <w:left w:val="single" w:color="999999" w:sz="4"/>
+              <w:bottom w:val="single" w:color="999999" w:sz="4"/>
+              <w:right w:val="single" w:color="999999" w:sz="4"/>
+            </w:tcBorders>
+            <w:tcMar>
+              <w:top w:type="dxa" w:w="60"/>
+              <w:left w:type="dxa" w:w="100"/>
+              <w:bottom w:type="dxa" w:w="60"/>
+              <w:right w:type="dxa" w:w="100"/>
+            </w:tcMar>
+          </w:tcPr>
+          <w:p>
+            <w:pPr>
+              <w:jc w:val="left"/>
+            </w:pPr>
+            <w:r>
+              <w:t xml:space="preserve">0.57%</w:t>
+            </w:r>
+          </w:p>
+        </w:tc>
+      </w:tr>
+      <w:tr>
+        <w:trPr>
+          <w:tblHeader w:val="false"/>
+        </w:trPr>
+        <w:tc>
+          <w:tcPr>
+            <w:tcW w:type="dxa" w:w="3200"/>
+            <w:tcBorders>
+              <w:top w:val="single" w:color="999999" w:sz="4"/>
+              <w:left w:val="single" w:color="999999" w:sz="4"/>
+              <w:bottom w:val="single" w:color="999999" w:sz="4"/>
+              <w:right w:val="single" w:color="999999" w:sz="4"/>
+            </w:tcBorders>
+            <w:tcMar>
+              <w:top w:type="dxa" w:w="60"/>
+              <w:left w:type="dxa" w:w="100"/>
+              <w:bottom w:type="dxa" w:w="60"/>
+              <w:right w:type="dxa" w:w="100"/>
+            </w:tcMar>
+          </w:tcPr>
+          <w:p>
+            <w:pPr>
+              <w:jc w:val="left"/>
+            </w:pPr>
+            <w:r>
+              <w:t xml:space="preserve">stock</w:t>
+            </w:r>
+          </w:p>
+        </w:tc>
+        <w:tc>
+          <w:tcPr>
+            <w:tcW w:type="dxa" w:w="2560"/>
+            <w:tcBorders>
+              <w:top w:val="single" w:color="999999" w:sz="4"/>
+              <w:left w:val="single" w:color="999999" w:sz="4"/>
+              <w:bottom w:val="single" w:color="999999" w:sz="4"/>
+              <w:right w:val="single" w:color="999999" w:sz="4"/>
+            </w:tcBorders>
+            <w:tcMar>
+              <w:top w:type="dxa" w:w="60"/>
+              <w:left w:type="dxa" w:w="100"/>
+              <w:bottom w:type="dxa" w:w="60"/>
+              <w:right w:type="dxa" w:w="100"/>
+            </w:tcMar>
+          </w:tcPr>
+          <w:p>
+            <w:pPr>
+              <w:jc w:val="left"/>
+            </w:pPr>
+            <w:r>
+              <w:t xml:space="preserve">&gt; 2,862.50</w:t>
+            </w:r>
+          </w:p>
+        </w:tc>
+        <w:tc>
+          <w:tcPr>
+            <w:tcW w:type="dxa" w:w="1800"/>
+            <w:tcBorders>
+              <w:top w:val="single" w:color="999999" w:sz="4"/>
+              <w:left w:val="single" w:color="999999" w:sz="4"/>
+              <w:bottom w:val="single" w:color="999999" w:sz="4"/>
+              <w:right w:val="single" w:color="999999" w:sz="4"/>
+            </w:tcBorders>
+            <w:tcMar>
+              <w:top w:type="dxa" w:w="60"/>
+              <w:left w:type="dxa" w:w="100"/>
+              <w:bottom w:type="dxa" w:w="60"/>
+              <w:right w:type="dxa" w:w="100"/>
+            </w:tcMar>
+          </w:tcPr>
+          <w:p>
+            <w:pPr>
+              <w:jc w:val="left"/>
+            </w:pPr>
+            <w:r>
+              <w:t xml:space="preserve">264</w:t>
+            </w:r>
+          </w:p>
+        </w:tc>
+        <w:tc>
+          <w:tcPr>
+            <w:tcW w:type="dxa" w:w="1800"/>
+            <w:tcBorders>
+              <w:top w:val="single" w:color="999999" w:sz="4"/>
+              <w:left w:val="single" w:color="999999" w:sz="4"/>
+              <w:bottom w:val="single" w:color="999999" w:sz="4"/>
+              <w:right w:val="single" w:color="999999" w:sz="4"/>
+            </w:tcBorders>
+            <w:tcMar>
+              <w:top w:type="dxa" w:w="60"/>
+              <w:left w:type="dxa" w:w="100"/>
+              <w:bottom w:type="dxa" w:w="60"/>
+              <w:right w:type="dxa" w:w="100"/>
+            </w:tcMar>
+          </w:tcPr>
+          <w:p>
+            <w:pPr>
+              <w:jc w:val="left"/>
+            </w:pPr>
+            <w:r>
+              <w:t xml:space="preserve">1.21%</w:t>
+            </w:r>
+          </w:p>
+        </w:tc>
+      </w:tr>
+      <w:tr>
+        <w:trPr>
+          <w:tblHeader w:val="false"/>
+        </w:trPr>
+        <w:tc>
+          <w:tcPr>
+            <w:tcW w:type="dxa" w:w="3200"/>
+            <w:tcBorders>
+              <w:top w:val="single" w:color="999999" w:sz="4"/>
+              <w:left w:val="single" w:color="999999" w:sz="4"/>
+              <w:bottom w:val="single" w:color="999999" w:sz="4"/>
+              <w:right w:val="single" w:color="999999" w:sz="4"/>
+            </w:tcBorders>
+            <w:tcMar>
+              <w:top w:type="dxa" w:w="60"/>
+              <w:left w:type="dxa" w:w="100"/>
+              <w:bottom w:type="dxa" w:w="60"/>
+              <w:right w:type="dxa" w:w="100"/>
+            </w:tcMar>
+          </w:tcPr>
+          <w:p>
+            <w:pPr>
+              <w:jc w:val="left"/>
+            </w:pPr>
+            <w:r>
+              <w:t xml:space="preserve">percentage</w:t>
+            </w:r>
+          </w:p>
+        </w:tc>
+        <w:tc>
+          <w:tcPr>
+            <w:tcW w:type="dxa" w:w="2560"/>
+            <w:tcBorders>
+              <w:top w:val="single" w:color="999999" w:sz="4"/>
+              <w:left w:val="single" w:color="999999" w:sz="4"/>
+              <w:bottom w:val="single" w:color="999999" w:sz="4"/>
+              <w:right w:val="single" w:color="999999" w:sz="4"/>
+            </w:tcBorders>
+            <w:tcMar>
+              <w:top w:type="dxa" w:w="60"/>
+              <w:left w:type="dxa" w:w="100"/>
+              <w:bottom w:type="dxa" w:w="60"/>
+              <w:right w:type="dxa" w:w="100"/>
+            </w:tcMar>
+          </w:tcPr>
+          <w:p>
+            <w:pPr>
+              <w:jc w:val="left"/>
+            </w:pPr>
+            <w:r>
+              <w:t xml:space="preserve">&lt; 67.45 y &gt; 152.14</w:t>
+            </w:r>
+          </w:p>
+        </w:tc>
+        <w:tc>
+          <w:tcPr>
+            <w:tcW w:type="dxa" w:w="1800"/>
+            <w:tcBorders>
+              <w:top w:val="single" w:color="999999" w:sz="4"/>
+              <w:left w:val="single" w:color="999999" w:sz="4"/>
+              <w:bottom w:val="single" w:color="999999" w:sz="4"/>
+              <w:right w:val="single" w:color="999999" w:sz="4"/>
+            </w:tcBorders>
+            <w:tcMar>
+              <w:top w:type="dxa" w:w="60"/>
+              <w:left w:type="dxa" w:w="100"/>
+              <w:bottom w:type="dxa" w:w="60"/>
+              <w:right w:type="dxa" w:w="100"/>
+            </w:tcMar>
+          </w:tcPr>
+          <w:p>
+            <w:pPr>
+              <w:jc w:val="left"/>
+            </w:pPr>
+            <w:r>
+              <w:t xml:space="preserve">118</w:t>
+            </w:r>
+          </w:p>
+        </w:tc>
+        <w:tc>
+          <w:tcPr>
+            <w:tcW w:type="dxa" w:w="1800"/>
+            <w:tcBorders>
+              <w:top w:val="single" w:color="999999" w:sz="4"/>
+              <w:left w:val="single" w:color="999999" w:sz="4"/>
+              <w:bottom w:val="single" w:color="999999" w:sz="4"/>
+              <w:right w:val="single" w:color="999999" w:sz="4"/>
+            </w:tcBorders>
+            <w:tcMar>
+              <w:top w:type="dxa" w:w="60"/>
+              <w:left w:type="dxa" w:w="100"/>
+              <w:bottom w:type="dxa" w:w="60"/>
+              <w:right w:type="dxa" w:w="100"/>
+            </w:tcMar>
+          </w:tcPr>
+          <w:p>
+            <w:pPr>
+              <w:jc w:val="left"/>
+            </w:pPr>
+            <w:r>
+              <w:t xml:space="preserve">0.54%</w:t>
+            </w:r>
+          </w:p>
+        </w:tc>
+      </w:tr>
+      <w:tr>
+        <w:trPr>
+          <w:tblHeader w:val="false"/>
+        </w:trPr>
+        <w:tc>
+          <w:tcPr>
+            <w:tcW w:type="dxa" w:w="3200"/>
+            <w:tcBorders>
+              <w:top w:val="single" w:color="999999" w:sz="4"/>
+              <w:left w:val="single" w:color="999999" w:sz="4"/>
+              <w:bottom w:val="single" w:color="999999" w:sz="4"/>
+              <w:right w:val="single" w:color="999999" w:sz="4"/>
+            </w:tcBorders>
+            <w:tcMar>
+              <w:top w:type="dxa" w:w="60"/>
+              <w:left w:type="dxa" w:w="100"/>
+              <w:bottom w:type="dxa" w:w="60"/>
+              <w:right w:type="dxa" w:w="100"/>
+            </w:tcMar>
+          </w:tcPr>
+          <w:p>
+            <w:pPr>
+              <w:jc w:val="left"/>
+            </w:pPr>
+            <w:r>
+              <w:t xml:space="preserve">units_sold</w:t>
+            </w:r>
+          </w:p>
+        </w:tc>
+        <w:tc>
+          <w:tcPr>
+            <w:tcW w:type="dxa" w:w="2560"/>
+            <w:tcBorders>
+              <w:top w:val="single" w:color="999999" w:sz="4"/>
+              <w:left w:val="single" w:color="999999" w:sz="4"/>
+              <w:bottom w:val="single" w:color="999999" w:sz="4"/>
+              <w:right w:val="single" w:color="999999" w:sz="4"/>
+            </w:tcBorders>
+            <w:tcMar>
+              <w:top w:type="dxa" w:w="60"/>
+              <w:left w:type="dxa" w:w="100"/>
+              <w:bottom w:type="dxa" w:w="60"/>
+              <w:right w:type="dxa" w:w="100"/>
+            </w:tcMar>
+          </w:tcPr>
+          <w:p>
+            <w:pPr>
+              <w:jc w:val="left"/>
+            </w:pPr>
+            <w:r>
+              <w:t xml:space="preserve">&gt; 593.50</w:t>
+            </w:r>
+          </w:p>
+        </w:tc>
+        <w:tc>
+          <w:tcPr>
+            <w:tcW w:type="dxa" w:w="1800"/>
+            <w:tcBorders>
+              <w:top w:val="single" w:color="999999" w:sz="4"/>
+              <w:left w:val="single" w:color="999999" w:sz="4"/>
+              <w:bottom w:val="single" w:color="999999" w:sz="4"/>
+              <w:right w:val="single" w:color="999999" w:sz="4"/>
+            </w:tcBorders>
+            <w:tcMar>
+              <w:top w:type="dxa" w:w="60"/>
+              <w:left w:type="dxa" w:w="100"/>
+              <w:bottom w:type="dxa" w:w="60"/>
+              <w:right w:type="dxa" w:w="100"/>
+            </w:tcMar>
+          </w:tcPr>
+          <w:p>
+            <w:pPr>
+              <w:jc w:val="left"/>
+            </w:pPr>
+            <w:r>
+              <w:t xml:space="preserve">1,046</w:t>
+            </w:r>
+          </w:p>
+        </w:tc>
+        <w:tc>
+          <w:tcPr>
+            <w:tcW w:type="dxa" w:w="1800"/>
+            <w:tcBorders>
+              <w:top w:val="single" w:color="999999" w:sz="4"/>
+              <w:left w:val="single" w:color="999999" w:sz="4"/>
+              <w:bottom w:val="single" w:color="999999" w:sz="4"/>
+              <w:right w:val="single" w:color="999999" w:sz="4"/>
+            </w:tcBorders>
+            <w:tcMar>
+              <w:top w:type="dxa" w:w="60"/>
+              <w:left w:type="dxa" w:w="100"/>
+              <w:bottom w:type="dxa" w:w="60"/>
+              <w:right w:type="dxa" w:w="100"/>
+            </w:tcMar>
+          </w:tcPr>
+          <w:p>
+            <w:pPr>
+              <w:jc w:val="left"/>
+            </w:pPr>
+            <w:r>
+              <w:t xml:space="preserve">4.79%</w:t>
+            </w:r>
+          </w:p>
+        </w:tc>
+      </w:tr>
+      <w:tr>
+        <w:trPr>
+          <w:tblHeader w:val="false"/>
+        </w:trPr>
+        <w:tc>
+          <w:tcPr>
+            <w:tcW w:type="dxa" w:w="3200"/>
+            <w:tcBorders>
+              <w:top w:val="single" w:color="999999" w:sz="4"/>
+              <w:left w:val="single" w:color="999999" w:sz="4"/>
+              <w:bottom w:val="single" w:color="999999" w:sz="4"/>
+              <w:right w:val="single" w:color="999999" w:sz="4"/>
+            </w:tcBorders>
+            <w:tcMar>
+              <w:top w:type="dxa" w:w="60"/>
+              <w:left w:type="dxa" w:w="100"/>
+              <w:bottom w:type="dxa" w:w="60"/>
+              <w:right w:type="dxa" w:w="100"/>
+            </w:tcMar>
+          </w:tcPr>
+          <w:p>
+            <w:pPr>
+              <w:jc w:val="left"/>
+            </w:pPr>
+            <w:r>
+              <w:t xml:space="preserve">sales_amount</w:t>
+            </w:r>
+          </w:p>
+        </w:tc>
+        <w:tc>
+          <w:tcPr>
+            <w:tcW w:type="dxa" w:w="2560"/>
+            <w:tcBorders>
+              <w:top w:val="single" w:color="999999" w:sz="4"/>
+              <w:left w:val="single" w:color="999999" w:sz="4"/>
+              <w:bottom w:val="single" w:color="999999" w:sz="4"/>
+              <w:right w:val="single" w:color="999999" w:sz="4"/>
+            </w:tcBorders>
+            <w:tcMar>
+              <w:top w:type="dxa" w:w="60"/>
+              <w:left w:type="dxa" w:w="100"/>
+              <w:bottom w:type="dxa" w:w="60"/>
+              <w:right w:type="dxa" w:w="100"/>
+            </w:tcMar>
+          </w:tcPr>
+          <w:p>
+            <w:pPr>
+              <w:jc w:val="left"/>
+            </w:pPr>
+            <w:r>
+              <w:t xml:space="preserve">&gt; $39,299.74</w:t>
+            </w:r>
+          </w:p>
+        </w:tc>
+        <w:tc>
+          <w:tcPr>
+            <w:tcW w:type="dxa" w:w="1800"/>
+            <w:tcBorders>
+              <w:top w:val="single" w:color="999999" w:sz="4"/>
+              <w:left w:val="single" w:color="999999" w:sz="4"/>
+              <w:bottom w:val="single" w:color="999999" w:sz="4"/>
+              <w:right w:val="single" w:color="999999" w:sz="4"/>
+            </w:tcBorders>
+            <w:tcMar>
+              <w:top w:type="dxa" w:w="60"/>
+              <w:left w:type="dxa" w:w="100"/>
+              <w:bottom w:type="dxa" w:w="60"/>
+              <w:right w:type="dxa" w:w="100"/>
+            </w:tcMar>
+          </w:tcPr>
+          <w:p>
+            <w:pPr>
+              <w:jc w:val="left"/>
+            </w:pPr>
+            <w:r>
+              <w:t xml:space="preserve">1,572</w:t>
+            </w:r>
+          </w:p>
+        </w:tc>
+        <w:tc>
+          <w:tcPr>
+            <w:tcW w:type="dxa" w:w="1800"/>
+            <w:tcBorders>
+              <w:top w:val="single" w:color="999999" w:sz="4"/>
+              <w:left w:val="single" w:color="999999" w:sz="4"/>
+              <w:bottom w:val="single" w:color="999999" w:sz="4"/>
+              <w:right w:val="single" w:color="999999" w:sz="4"/>
+            </w:tcBorders>
+            <w:tcMar>
+              <w:top w:type="dxa" w:w="60"/>
+              <w:left w:type="dxa" w:w="100"/>
+              <w:bottom w:type="dxa" w:w="60"/>
+              <w:right w:type="dxa" w:w="100"/>
+            </w:tcMar>
+          </w:tcPr>
+          <w:p>
+            <w:pPr>
+              <w:jc w:val="left"/>
+            </w:pPr>
+            <w:r>
+              <w:t xml:space="preserve">7.20%</w:t>
+            </w:r>
+          </w:p>
+        </w:tc>
+      </w:tr>
+      <w:tr>
+        <w:trPr>
+          <w:tblHeader w:val="false"/>
+        </w:trPr>
+        <w:tc>
+          <w:tcPr>
+            <w:tcW w:type="dxa" w:w="3200"/>
+            <w:tcBorders>
+              <w:top w:val="single" w:color="999999" w:sz="4"/>
+              <w:left w:val="single" w:color="999999" w:sz="4"/>
+              <w:bottom w:val="single" w:color="999999" w:sz="4"/>
+              <w:right w:val="single" w:color="999999" w:sz="4"/>
+            </w:tcBorders>
+            <w:tcMar>
+              <w:top w:type="dxa" w:w="60"/>
+              <w:left w:type="dxa" w:w="100"/>
+              <w:bottom w:type="dxa" w:w="60"/>
+              <w:right w:type="dxa" w:w="100"/>
+            </w:tcMar>
+          </w:tcPr>
+          <w:p>
+            <w:pPr>
+              <w:jc w:val="left"/>
+            </w:pPr>
+            <w:r>
+              <w:t xml:space="preserve">static_price</w:t>
+            </w:r>
+          </w:p>
+        </w:tc>
+        <w:tc>
+          <w:tcPr>
+            <w:tcW w:type="dxa" w:w="2560"/>
+            <w:tcBorders>
+              <w:top w:val="single" w:color="999999" w:sz="4"/>
+              <w:left w:val="single" w:color="999999" w:sz="4"/>
+              <w:bottom w:val="single" w:color="999999" w:sz="4"/>
+              <w:right w:val="single" w:color="999999" w:sz="4"/>
+            </w:tcBorders>
+            <w:tcMar>
+              <w:top w:type="dxa" w:w="60"/>
+              <w:left w:type="dxa" w:w="100"/>
+              <w:bottom w:type="dxa" w:w="60"/>
+              <w:right w:type="dxa" w:w="100"/>
+            </w:tcMar>
+          </w:tcPr>
+          <w:p>
+            <w:pPr>
+              <w:jc w:val="left"/>
+            </w:pPr>
+            <w:r>
+              <w:t xml:space="preserve">&gt; $188.25</w:t>
+            </w:r>
+          </w:p>
+        </w:tc>
+        <w:tc>
+          <w:tcPr>
+            <w:tcW w:type="dxa" w:w="1800"/>
+            <w:tcBorders>
+              <w:top w:val="single" w:color="999999" w:sz="4"/>
+              <w:left w:val="single" w:color="999999" w:sz="4"/>
+              <w:bottom w:val="single" w:color="999999" w:sz="4"/>
+              <w:right w:val="single" w:color="999999" w:sz="4"/>
+            </w:tcBorders>
+            <w:tcMar>
+              <w:top w:type="dxa" w:w="60"/>
+              <w:left w:type="dxa" w:w="100"/>
+              <w:bottom w:type="dxa" w:w="60"/>
+              <w:right w:type="dxa" w:w="100"/>
+            </w:tcMar>
+          </w:tcPr>
+          <w:p>
+            <w:pPr>
+              <w:jc w:val="left"/>
+            </w:pPr>
+            <w:r>
+              <w:t xml:space="preserve">840</w:t>
+            </w:r>
+          </w:p>
+        </w:tc>
+        <w:tc>
+          <w:tcPr>
+            <w:tcW w:type="dxa" w:w="1800"/>
+            <w:tcBorders>
+              <w:top w:val="single" w:color="999999" w:sz="4"/>
+              <w:left w:val="single" w:color="999999" w:sz="4"/>
+              <w:bottom w:val="single" w:color="999999" w:sz="4"/>
+              <w:right w:val="single" w:color="999999" w:sz="4"/>
+            </w:tcBorders>
+            <w:tcMar>
+              <w:top w:type="dxa" w:w="60"/>
+              <w:left w:type="dxa" w:w="100"/>
+              <w:bottom w:type="dxa" w:w="60"/>
+              <w:right w:type="dxa" w:w="100"/>
+            </w:tcMar>
+          </w:tcPr>
+          <w:p>
+            <w:pPr>
+              <w:jc w:val="left"/>
+            </w:pPr>
+            <w:r>
+              <w:t xml:space="preserve">3.85%</w:t>
+            </w:r>
+          </w:p>
+        </w:tc>
+      </w:tr>
+      <w:tr>
+        <w:trPr>
+          <w:tblHeader w:val="false"/>
+        </w:trPr>
+        <w:tc>
+          <w:tcPr>
+            <w:tcW w:type="dxa" w:w="3200"/>
+            <w:tcBorders>
+              <w:top w:val="single" w:color="999999" w:sz="4"/>
+              <w:left w:val="single" w:color="999999" w:sz="4"/>
+              <w:bottom w:val="single" w:color="999999" w:sz="4"/>
+              <w:right w:val="single" w:color="999999" w:sz="4"/>
+            </w:tcBorders>
+            <w:tcMar>
+              <w:top w:type="dxa" w:w="60"/>
+              <w:left w:type="dxa" w:w="100"/>
+              <w:bottom w:type="dxa" w:w="60"/>
+              <w:right w:type="dxa" w:w="100"/>
+            </w:tcMar>
+          </w:tcPr>
+          <w:p>
+            <w:pPr>
+              <w:jc w:val="left"/>
+            </w:pPr>
+            <w:r>
+              <w:t xml:space="preserve">Ventas_Acumuladas_Mensual</w:t>
+            </w:r>
+          </w:p>
+        </w:tc>
+        <w:tc>
+          <w:tcPr>
+            <w:tcW w:type="dxa" w:w="2560"/>
+            <w:tcBorders>
+              <w:top w:val="single" w:color="999999" w:sz="4"/>
+              <w:left w:val="single" w:color="999999" w:sz="4"/>
+              <w:bottom w:val="single" w:color="999999" w:sz="4"/>
+              <w:right w:val="single" w:color="999999" w:sz="4"/>
+            </w:tcBorders>
+            <w:tcMar>
+              <w:top w:type="dxa" w:w="60"/>
+              <w:left w:type="dxa" w:w="100"/>
+              <w:bottom w:type="dxa" w:w="60"/>
+              <w:right w:type="dxa" w:w="100"/>
+            </w:tcMar>
+          </w:tcPr>
+          <w:p>
+            <w:pPr>
+              <w:jc w:val="left"/>
+            </w:pPr>
+            <w:r>
+              <w:t xml:space="preserve">&gt; 593.50</w:t>
+            </w:r>
+          </w:p>
+        </w:tc>
+        <w:tc>
+          <w:tcPr>
+            <w:tcW w:type="dxa" w:w="1800"/>
+            <w:tcBorders>
+              <w:top w:val="single" w:color="999999" w:sz="4"/>
+              <w:left w:val="single" w:color="999999" w:sz="4"/>
+              <w:bottom w:val="single" w:color="999999" w:sz="4"/>
+              <w:right w:val="single" w:color="999999" w:sz="4"/>
+            </w:tcBorders>
+            <w:tcMar>
+              <w:top w:type="dxa" w:w="60"/>
+              <w:left w:type="dxa" w:w="100"/>
+              <w:bottom w:type="dxa" w:w="60"/>
+              <w:right w:type="dxa" w:w="100"/>
+            </w:tcMar>
+          </w:tcPr>
+          <w:p>
+            <w:pPr>
+              <w:jc w:val="left"/>
+            </w:pPr>
+            <w:r>
+              <w:t xml:space="preserve">1,046</w:t>
+            </w:r>
+          </w:p>
+        </w:tc>
+        <w:tc>
+          <w:tcPr>
+            <w:tcW w:type="dxa" w:w="1800"/>
+            <w:tcBorders>
+              <w:top w:val="single" w:color="999999" w:sz="4"/>
+              <w:left w:val="single" w:color="999999" w:sz="4"/>
+              <w:bottom w:val="single" w:color="999999" w:sz="4"/>
+              <w:right w:val="single" w:color="999999" w:sz="4"/>
+            </w:tcBorders>
+            <w:tcMar>
+              <w:top w:type="dxa" w:w="60"/>
+              <w:left w:type="dxa" w:w="100"/>
+              <w:bottom w:type="dxa" w:w="60"/>
+              <w:right w:type="dxa" w:w="100"/>
+            </w:tcMar>
+          </w:tcPr>
+          <w:p>
+            <w:pPr>
+              <w:jc w:val="left"/>
+            </w:pPr>
+            <w:r>
+              <w:t xml:space="preserve">4.79%</w:t>
+            </w:r>
+          </w:p>
+        </w:tc>
+      </w:tr>
+      <w:tr>
+        <w:trPr>
+          <w:tblHeader w:val="false"/>
+        </w:trPr>
+        <w:tc>
+          <w:tcPr>
+            <w:tcW w:type="dxa" w:w="3200"/>
+            <w:tcBorders>
+              <w:top w:val="single" w:color="999999" w:sz="4"/>
+              <w:left w:val="single" w:color="999999" w:sz="4"/>
+              <w:bottom w:val="single" w:color="999999" w:sz="4"/>
+              <w:right w:val="single" w:color="999999" w:sz="4"/>
+            </w:tcBorders>
+            <w:tcMar>
+              <w:top w:type="dxa" w:w="60"/>
+              <w:left w:type="dxa" w:w="100"/>
+              <w:bottom w:type="dxa" w:w="60"/>
+              <w:right w:type="dxa" w:w="100"/>
+            </w:tcMar>
+          </w:tcPr>
+          <w:p>
+            <w:pPr>
+              <w:jc w:val="left"/>
+            </w:pPr>
+            <w:r>
+              <w:t xml:space="preserve">Stock_Restante_Mensual</w:t>
+            </w:r>
+          </w:p>
+        </w:tc>
+        <w:tc>
+          <w:tcPr>
+            <w:tcW w:type="dxa" w:w="2560"/>
+            <w:tcBorders>
+              <w:top w:val="single" w:color="999999" w:sz="4"/>
+              <w:left w:val="single" w:color="999999" w:sz="4"/>
+              <w:bottom w:val="single" w:color="999999" w:sz="4"/>
+              <w:right w:val="single" w:color="999999" w:sz="4"/>
+            </w:tcBorders>
+            <w:tcMar>
+              <w:top w:type="dxa" w:w="60"/>
+              <w:left w:type="dxa" w:w="100"/>
+              <w:bottom w:type="dxa" w:w="60"/>
+              <w:right w:type="dxa" w:w="100"/>
+            </w:tcMar>
+          </w:tcPr>
+          <w:p>
+            <w:pPr>
+              <w:jc w:val="left"/>
+            </w:pPr>
+            <w:r>
+              <w:t xml:space="preserve">&gt; 2,371.00</w:t>
+            </w:r>
+          </w:p>
+        </w:tc>
+        <w:tc>
+          <w:tcPr>
+            <w:tcW w:type="dxa" w:w="1800"/>
+            <w:tcBorders>
+              <w:top w:val="single" w:color="999999" w:sz="4"/>
+              <w:left w:val="single" w:color="999999" w:sz="4"/>
+              <w:bottom w:val="single" w:color="999999" w:sz="4"/>
+              <w:right w:val="single" w:color="999999" w:sz="4"/>
+            </w:tcBorders>
+            <w:tcMar>
+              <w:top w:type="dxa" w:w="60"/>
+              <w:left w:type="dxa" w:w="100"/>
+              <w:bottom w:type="dxa" w:w="60"/>
+              <w:right w:type="dxa" w:w="100"/>
+            </w:tcMar>
+          </w:tcPr>
+          <w:p>
+            <w:pPr>
+              <w:jc w:val="left"/>
+            </w:pPr>
+            <w:r>
+              <w:t xml:space="preserve">214</w:t>
+            </w:r>
+          </w:p>
+        </w:tc>
+        <w:tc>
+          <w:tcPr>
+            <w:tcW w:type="dxa" w:w="1800"/>
+            <w:tcBorders>
+              <w:top w:val="single" w:color="999999" w:sz="4"/>
+              <w:left w:val="single" w:color="999999" w:sz="4"/>
+              <w:bottom w:val="single" w:color="999999" w:sz="4"/>
+              <w:right w:val="single" w:color="999999" w:sz="4"/>
+            </w:tcBorders>
+            <w:tcMar>
+              <w:top w:type="dxa" w:w="60"/>
+              <w:left w:type="dxa" w:w="100"/>
+              <w:bottom w:type="dxa" w:w="60"/>
+              <w:right w:type="dxa" w:w="100"/>
+            </w:tcMar>
+          </w:tcPr>
+          <w:p>
+            <w:pPr>
+              <w:jc w:val="left"/>
+            </w:pPr>
+            <w:r>
+              <w:t xml:space="preserve">0.98%</w:t>
+            </w:r>
+          </w:p>
+        </w:tc>
+      </w:tr>
+      <w:tr>
+        <w:trPr>
+          <w:tblHeader w:val="false"/>
+        </w:trPr>
+        <w:tc>
+          <w:tcPr>
+            <w:tcW w:type="dxa" w:w="3200"/>
+            <w:tcBorders>
+              <w:top w:val="single" w:color="999999" w:sz="4"/>
+              <w:left w:val="single" w:color="999999" w:sz="4"/>
+              <w:bottom w:val="single" w:color="999999" w:sz="4"/>
+              <w:right w:val="single" w:color="999999" w:sz="4"/>
+            </w:tcBorders>
+            <w:tcMar>
+              <w:top w:type="dxa" w:w="60"/>
+              <w:left w:type="dxa" w:w="100"/>
+              <w:bottom w:type="dxa" w:w="60"/>
+              <w:right w:type="dxa" w:w="100"/>
+            </w:tcMar>
+          </w:tcPr>
+          <w:p>
+            <w:pPr>
+              <w:jc w:val="left"/>
+            </w:pPr>
+            <w:r>
+              <w:t xml:space="preserve">Cumplimiento_Venta_Esperada</w:t>
+            </w:r>
+          </w:p>
+        </w:tc>
+        <w:tc>
+          <w:tcPr>
+            <w:tcW w:type="dxa" w:w="2560"/>
+            <w:tcBorders>
+              <w:top w:val="single" w:color="999999" w:sz="4"/>
+              <w:left w:val="single" w:color="999999" w:sz="4"/>
+              <w:bottom w:val="single" w:color="999999" w:sz="4"/>
+              <w:right w:val="single" w:color="999999" w:sz="4"/>
+            </w:tcBorders>
+            <w:tcMar>
+              <w:top w:type="dxa" w:w="60"/>
+              <w:left w:type="dxa" w:w="100"/>
+              <w:bottom w:type="dxa" w:w="60"/>
+              <w:right w:type="dxa" w:w="100"/>
+            </w:tcMar>
+          </w:tcPr>
+          <w:p>
+            <w:pPr>
+              <w:jc w:val="left"/>
+            </w:pPr>
+            <w:r>
+              <w:t xml:space="preserve">&gt; 40.97%</w:t>
+            </w:r>
+          </w:p>
+        </w:tc>
+        <w:tc>
+          <w:tcPr>
+            <w:tcW w:type="dxa" w:w="1800"/>
+            <w:tcBorders>
+              <w:top w:val="single" w:color="999999" w:sz="4"/>
+              <w:left w:val="single" w:color="999999" w:sz="4"/>
+              <w:bottom w:val="single" w:color="999999" w:sz="4"/>
+              <w:right w:val="single" w:color="999999" w:sz="4"/>
+            </w:tcBorders>
+            <w:tcMar>
+              <w:top w:type="dxa" w:w="60"/>
+              <w:left w:type="dxa" w:w="100"/>
+              <w:bottom w:type="dxa" w:w="60"/>
+              <w:right w:type="dxa" w:w="100"/>
+            </w:tcMar>
+          </w:tcPr>
+          <w:p>
+            <w:pPr>
+              <w:jc w:val="left"/>
+            </w:pPr>
+            <w:r>
+              <w:t xml:space="preserve">363</w:t>
+            </w:r>
+          </w:p>
+        </w:tc>
+        <w:tc>
+          <w:tcPr>
+            <w:tcW w:type="dxa" w:w="1800"/>
+            <w:tcBorders>
+              <w:top w:val="single" w:color="999999" w:sz="4"/>
+              <w:left w:val="single" w:color="999999" w:sz="4"/>
+              <w:bottom w:val="single" w:color="999999" w:sz="4"/>
+              <w:right w:val="single" w:color="999999" w:sz="4"/>
+            </w:tcBorders>
+            <w:tcMar>
+              <w:top w:type="dxa" w:w="60"/>
+              <w:left w:type="dxa" w:w="100"/>
+              <w:bottom w:type="dxa" w:w="60"/>
+              <w:right w:type="dxa" w:w="100"/>
+            </w:tcMar>
+          </w:tcPr>
+          <w:p>
+            <w:pPr>
+              <w:jc w:val="left"/>
+            </w:pPr>
+            <w:r>
+              <w:t xml:space="preserve">1.66%</w:t>
+            </w:r>
+          </w:p>
+        </w:tc>
+      </w:tr>
+      <w:tr>
+        <w:trPr>
+          <w:tblHeader w:val="false"/>
+        </w:trPr>
+        <w:tc>
+          <w:tcPr>
+            <w:tcW w:type="dxa" w:w="3200"/>
+            <w:tcBorders>
+              <w:top w:val="single" w:color="999999" w:sz="4"/>
+              <w:left w:val="single" w:color="999999" w:sz="4"/>
+              <w:bottom w:val="single" w:color="999999" w:sz="4"/>
+              <w:right w:val="single" w:color="999999" w:sz="4"/>
+            </w:tcBorders>
+            <w:tcMar>
+              <w:top w:type="dxa" w:w="60"/>
+              <w:left w:type="dxa" w:w="100"/>
+              <w:bottom w:type="dxa" w:w="60"/>
+              <w:right w:type="dxa" w:w="100"/>
+            </w:tcMar>
+          </w:tcPr>
+          <w:p>
+            <w:pPr>
+              <w:jc w:val="left"/>
+            </w:pPr>
+            <w:r>
+              <w:t xml:space="preserve">Product_Repeat_Purchase_Rate</w:t>
+            </w:r>
+          </w:p>
+        </w:tc>
+        <w:tc>
+          <w:tcPr>
+            <w:tcW w:type="dxa" w:w="2560"/>
+            <w:tcBorders>
+              <w:top w:val="single" w:color="999999" w:sz="4"/>
+              <w:left w:val="single" w:color="999999" w:sz="4"/>
+              <w:bottom w:val="single" w:color="999999" w:sz="4"/>
+              <w:right w:val="single" w:color="999999" w:sz="4"/>
+            </w:tcBorders>
+            <w:tcMar>
+              <w:top w:type="dxa" w:w="60"/>
+              <w:left w:type="dxa" w:w="100"/>
+              <w:bottom w:type="dxa" w:w="60"/>
+              <w:right w:type="dxa" w:w="100"/>
+            </w:tcMar>
+          </w:tcPr>
+          <w:p>
+            <w:pPr>
+              <w:jc w:val="left"/>
+            </w:pPr>
+            <w:r>
+              <w:t xml:space="preserve">&lt; 99.80</w:t>
+            </w:r>
+          </w:p>
+        </w:tc>
+        <w:tc>
+          <w:tcPr>
+            <w:tcW w:type="dxa" w:w="1800"/>
+            <w:tcBorders>
+              <w:top w:val="single" w:color="999999" w:sz="4"/>
+              <w:left w:val="single" w:color="999999" w:sz="4"/>
+              <w:bottom w:val="single" w:color="999999" w:sz="4"/>
+              <w:right w:val="single" w:color="999999" w:sz="4"/>
+            </w:tcBorders>
+            <w:tcMar>
+              <w:top w:type="dxa" w:w="60"/>
+              <w:left w:type="dxa" w:w="100"/>
+              <w:bottom w:type="dxa" w:w="60"/>
+              <w:right w:type="dxa" w:w="100"/>
+            </w:tcMar>
+          </w:tcPr>
+          <w:p>
+            <w:pPr>
+              <w:jc w:val="left"/>
+            </w:pPr>
+            <w:r>
+              <w:t xml:space="preserve">2,352</w:t>
+            </w:r>
+          </w:p>
+        </w:tc>
+        <w:tc>
+          <w:tcPr>
+            <w:tcW w:type="dxa" w:w="1800"/>
+            <w:tcBorders>
+              <w:top w:val="single" w:color="999999" w:sz="4"/>
+              <w:left w:val="single" w:color="999999" w:sz="4"/>
+              <w:bottom w:val="single" w:color="999999" w:sz="4"/>
+              <w:right w:val="single" w:color="999999" w:sz="4"/>
+            </w:tcBorders>
+            <w:tcMar>
+              <w:top w:type="dxa" w:w="60"/>
+              <w:left w:type="dxa" w:w="100"/>
+              <w:bottom w:type="dxa" w:w="60"/>
+              <w:right w:type="dxa" w:w="100"/>
+            </w:tcMar>
+          </w:tcPr>
+          <w:p>
+            <w:pPr>
+              <w:jc w:val="left"/>
+            </w:pPr>
+            <w:r>
+              <w:t xml:space="preserve">10.77%</w:t>
+            </w:r>
+          </w:p>
+        </w:tc>
+      </w:tr>
+      <w:tr>
+        <w:trPr>
+          <w:tblHeader w:val="false"/>
+        </w:trPr>
+        <w:tc>
+          <w:tcPr>
+            <w:tcW w:type="dxa" w:w="3200"/>
+            <w:tcBorders>
+              <w:top w:val="single" w:color="999999" w:sz="4"/>
+              <w:left w:val="single" w:color="999999" w:sz="4"/>
+              <w:bottom w:val="single" w:color="999999" w:sz="4"/>
+              <w:right w:val="single" w:color="999999" w:sz="4"/>
+            </w:tcBorders>
+            <w:tcMar>
+              <w:top w:type="dxa" w:w="60"/>
+              <w:left w:type="dxa" w:w="100"/>
+              <w:bottom w:type="dxa" w:w="60"/>
+              <w:right w:type="dxa" w:w="100"/>
+            </w:tcMar>
+          </w:tcPr>
+          <w:p>
+            <w:pPr>
+              <w:jc w:val="left"/>
+            </w:pPr>
+            <w:r>
+              <w:t xml:space="preserve">Venta_Promedio_Diaria</w:t>
+            </w:r>
+          </w:p>
+        </w:tc>
+        <w:tc>
+          <w:tcPr>
+            <w:tcW w:type="dxa" w:w="2560"/>
+            <w:tcBorders>
+              <w:top w:val="single" w:color="999999" w:sz="4"/>
+              <w:left w:val="single" w:color="999999" w:sz="4"/>
+              <w:bottom w:val="single" w:color="999999" w:sz="4"/>
+              <w:right w:val="single" w:color="999999" w:sz="4"/>
+            </w:tcBorders>
+            <w:tcMar>
+              <w:top w:type="dxa" w:w="60"/>
+              <w:left w:type="dxa" w:w="100"/>
+              <w:bottom w:type="dxa" w:w="60"/>
+              <w:right w:type="dxa" w:w="100"/>
+            </w:tcMar>
+          </w:tcPr>
+          <w:p>
+            <w:pPr>
+              <w:jc w:val="left"/>
+            </w:pPr>
+            <w:r>
+              <w:t xml:space="preserve">&gt; 19.48</w:t>
+            </w:r>
+          </w:p>
+        </w:tc>
+        <w:tc>
+          <w:tcPr>
+            <w:tcW w:type="dxa" w:w="1800"/>
+            <w:tcBorders>
+              <w:top w:val="single" w:color="999999" w:sz="4"/>
+              <w:left w:val="single" w:color="999999" w:sz="4"/>
+              <w:bottom w:val="single" w:color="999999" w:sz="4"/>
+              <w:right w:val="single" w:color="999999" w:sz="4"/>
+            </w:tcBorders>
+            <w:tcMar>
+              <w:top w:type="dxa" w:w="60"/>
+              <w:left w:type="dxa" w:w="100"/>
+              <w:bottom w:type="dxa" w:w="60"/>
+              <w:right w:type="dxa" w:w="100"/>
+            </w:tcMar>
+          </w:tcPr>
+          <w:p>
+            <w:pPr>
+              <w:jc w:val="left"/>
+            </w:pPr>
+            <w:r>
+              <w:t xml:space="preserve">1,042</w:t>
+            </w:r>
+          </w:p>
+        </w:tc>
+        <w:tc>
+          <w:tcPr>
+            <w:tcW w:type="dxa" w:w="1800"/>
+            <w:tcBorders>
+              <w:top w:val="single" w:color="999999" w:sz="4"/>
+              <w:left w:val="single" w:color="999999" w:sz="4"/>
+              <w:bottom w:val="single" w:color="999999" w:sz="4"/>
+              <w:right w:val="single" w:color="999999" w:sz="4"/>
+            </w:tcBorders>
+            <w:tcMar>
+              <w:top w:type="dxa" w:w="60"/>
+              <w:left w:type="dxa" w:w="100"/>
+              <w:bottom w:type="dxa" w:w="60"/>
+              <w:right w:type="dxa" w:w="100"/>
+            </w:tcMar>
+          </w:tcPr>
+          <w:p>
+            <w:pPr>
+              <w:jc w:val="left"/>
+            </w:pPr>
+            <w:r>
+              <w:t xml:space="preserve">4.77%</w:t>
+            </w:r>
+          </w:p>
+        </w:tc>
+      </w:tr>
+      <w:tr>
+        <w:trPr>
+          <w:tblHeader w:val="false"/>
+        </w:trPr>
+        <w:tc>
+          <w:tcPr>
+            <w:tcW w:type="dxa" w:w="3200"/>
+            <w:tcBorders>
+              <w:top w:val="single" w:color="999999" w:sz="4"/>
+              <w:left w:val="single" w:color="999999" w:sz="4"/>
+              <w:bottom w:val="single" w:color="999999" w:sz="4"/>
+              <w:right w:val="single" w:color="999999" w:sz="4"/>
+            </w:tcBorders>
+            <w:tcMar>
+              <w:top w:type="dxa" w:w="60"/>
+              <w:left w:type="dxa" w:w="100"/>
+              <w:bottom w:type="dxa" w:w="60"/>
+              <w:right w:type="dxa" w:w="100"/>
+            </w:tcMar>
+          </w:tcPr>
+          <w:p>
+            <w:pPr>
+              <w:jc w:val="left"/>
+            </w:pPr>
+            <w:r>
+              <w:t xml:space="preserve">Dias_Cobertura_Inventario</w:t>
+            </w:r>
+          </w:p>
+        </w:tc>
+        <w:tc>
+          <w:tcPr>
+            <w:tcW w:type="dxa" w:w="2560"/>
+            <w:tcBorders>
+              <w:top w:val="single" w:color="999999" w:sz="4"/>
+              <w:left w:val="single" w:color="999999" w:sz="4"/>
+              <w:bottom w:val="single" w:color="999999" w:sz="4"/>
+              <w:right w:val="single" w:color="999999" w:sz="4"/>
+            </w:tcBorders>
+            <w:tcMar>
+              <w:top w:type="dxa" w:w="60"/>
+              <w:left w:type="dxa" w:w="100"/>
+              <w:bottom w:type="dxa" w:w="60"/>
+              <w:right w:type="dxa" w:w="100"/>
+            </w:tcMar>
+          </w:tcPr>
+          <w:p>
+            <w:pPr>
+              <w:jc w:val="left"/>
+            </w:pPr>
+            <w:r>
+              <w:t xml:space="preserve">&gt; 710.24 días</w:t>
+            </w:r>
+          </w:p>
+        </w:tc>
+        <w:tc>
+          <w:tcPr>
+            <w:tcW w:type="dxa" w:w="1800"/>
+            <w:tcBorders>
+              <w:top w:val="single" w:color="999999" w:sz="4"/>
+              <w:left w:val="single" w:color="999999" w:sz="4"/>
+              <w:bottom w:val="single" w:color="999999" w:sz="4"/>
+              <w:right w:val="single" w:color="999999" w:sz="4"/>
+            </w:tcBorders>
+            <w:tcMar>
+              <w:top w:type="dxa" w:w="60"/>
+              <w:left w:type="dxa" w:w="100"/>
+              <w:bottom w:type="dxa" w:w="60"/>
+              <w:right w:type="dxa" w:w="100"/>
+            </w:tcMar>
+          </w:tcPr>
+          <w:p>
+            <w:pPr>
+              <w:jc w:val="left"/>
+            </w:pPr>
+            <w:r>
+              <w:t xml:space="preserve">276</w:t>
+            </w:r>
+          </w:p>
+        </w:tc>
+        <w:tc>
+          <w:tcPr>
+            <w:tcW w:type="dxa" w:w="1800"/>
+            <w:tcBorders>
+              <w:top w:val="single" w:color="999999" w:sz="4"/>
+              <w:left w:val="single" w:color="999999" w:sz="4"/>
+              <w:bottom w:val="single" w:color="999999" w:sz="4"/>
+              <w:right w:val="single" w:color="999999" w:sz="4"/>
+            </w:tcBorders>
+            <w:tcMar>
+              <w:top w:type="dxa" w:w="60"/>
+              <w:left w:type="dxa" w:w="100"/>
+              <w:bottom w:type="dxa" w:w="60"/>
+              <w:right w:type="dxa" w:w="100"/>
+            </w:tcMar>
+          </w:tcPr>
+          <w:p>
+            <w:pPr>
+              <w:jc w:val="left"/>
+            </w:pPr>
+            <w:r>
+              <w:t xml:space="preserve">1.26%</w:t>
+            </w:r>
+          </w:p>
+        </w:tc>
+      </w:tr>
+    </w:tbl>
+    <w:p/>
+    <w:tbl>
+      <w:tblPr>
+        <w:tblW w:type="dxa" w:w="9360"/>
+        <w:tblBorders>
+          <w:top w:val="single" w:color="auto" w:sz="4"/>
+          <w:left w:val="single" w:color="auto" w:sz="4"/>
+          <w:bottom w:val="single" w:color="auto" w:sz="4"/>
+          <w:right w:val="single" w:color="auto" w:sz="4"/>
+          <w:insideH w:val="single" w:color="auto" w:sz="4"/>
+          <w:insideV w:val="single" w:color="auto" w:sz="4"/>
+        </w:tblBorders>
+      </w:tblPr>
+      <w:tblGrid>
+        <w:gridCol w:w="3200"/>
+        <w:gridCol w:w="2560"/>
+        <w:gridCol w:w="1800"/>
+        <w:gridCol w:w="1800"/>
+      </w:tblGrid>
+      <w:tr>
+        <w:trPr>
+          <w:tblHeader/>
+        </w:trPr>
+        <w:tc>
+          <w:tcPr>
+            <w:tcW w:type="dxa" w:w="3200"/>
+            <w:tcBorders>
+              <w:top w:val="single" w:color="999999" w:sz="4"/>
+              <w:left w:val="single" w:color="999999" w:sz="4"/>
+              <w:bottom w:val="single" w:color="999999" w:sz="4"/>
+              <w:right w:val="single" w:color="999999" w:sz="4"/>
+            </w:tcBorders>
+            <w:shd w:fill="1F4E79" w:color="auto" w:val="clear"/>
+            <w:tcMar>
+              <w:top w:type="dxa" w:w="60"/>
+              <w:left w:type="dxa" w:w="100"/>
+              <w:bottom w:type="dxa" w:w="60"/>
+              <w:right w:type="dxa" w:w="100"/>
+            </w:tcMar>
+          </w:tcPr>
+          <w:p>
+            <w:pPr>
+              <w:jc w:val="left"/>
+            </w:pPr>
+            <w:r>
+              <w:rPr>
+                <w:b/>
+                <w:bCs/>
+                <w:color w:val="FFFFFF"/>
+                <w:sz w:val="18"/>
+                <w:szCs w:val="18"/>
+              </w:rPr>
+              <w:t xml:space="preserve">Variable (Micro)</w:t>
+            </w:r>
+          </w:p>
+        </w:tc>
+        <w:tc>
+          <w:tcPr>
+            <w:tcW w:type="dxa" w:w="2560"/>
+            <w:tcBorders>
+              <w:top w:val="single" w:color="999999" w:sz="4"/>
+              <w:left w:val="single" w:color="999999" w:sz="4"/>
+              <w:bottom w:val="single" w:color="999999" w:sz="4"/>
+              <w:right w:val="single" w:color="999999" w:sz="4"/>
+            </w:tcBorders>
+            <w:shd w:fill="1F4E79" w:color="auto" w:val="clear"/>
+            <w:tcMar>
+              <w:top w:type="dxa" w:w="60"/>
+              <w:left w:type="dxa" w:w="100"/>
+              <w:bottom w:type="dxa" w:w="60"/>
+              <w:right w:type="dxa" w:w="100"/>
+            </w:tcMar>
+          </w:tcPr>
+          <w:p>
+            <w:pPr>
+              <w:jc w:val="left"/>
+            </w:pPr>
+            <w:r>
+              <w:rPr>
+                <w:b/>
+                <w:bCs/>
+                <w:color w:val="FFFFFF"/>
+                <w:sz w:val="18"/>
+                <w:szCs w:val="18"/>
+              </w:rPr>
+              <w:t xml:space="preserve">Outliers desde</w:t>
+            </w:r>
+          </w:p>
+        </w:tc>
+        <w:tc>
+          <w:tcPr>
+            <w:tcW w:type="dxa" w:w="1800"/>
+            <w:tcBorders>
+              <w:top w:val="single" w:color="999999" w:sz="4"/>
+              <w:left w:val="single" w:color="999999" w:sz="4"/>
+              <w:bottom w:val="single" w:color="999999" w:sz="4"/>
+              <w:right w:val="single" w:color="999999" w:sz="4"/>
+            </w:tcBorders>
+            <w:shd w:fill="1F4E79" w:color="auto" w:val="clear"/>
+            <w:tcMar>
+              <w:top w:type="dxa" w:w="60"/>
+              <w:left w:type="dxa" w:w="100"/>
+              <w:bottom w:type="dxa" w:w="60"/>
+              <w:right w:type="dxa" w:w="100"/>
+            </w:tcMar>
+          </w:tcPr>
+          <w:p>
+            <w:pPr>
+              <w:jc w:val="left"/>
+            </w:pPr>
+            <w:r>
+              <w:rPr>
+                <w:b/>
+                <w:bCs/>
+                <w:color w:val="FFFFFF"/>
+                <w:sz w:val="18"/>
+                <w:szCs w:val="18"/>
+              </w:rPr>
+              <w:t xml:space="preserve">N.º outliers</w:t>
+            </w:r>
+          </w:p>
+        </w:tc>
+        <w:tc>
+          <w:tcPr>
+            <w:tcW w:type="dxa" w:w="1800"/>
+            <w:tcBorders>
+              <w:top w:val="single" w:color="999999" w:sz="4"/>
+              <w:left w:val="single" w:color="999999" w:sz="4"/>
+              <w:bottom w:val="single" w:color="999999" w:sz="4"/>
+              <w:right w:val="single" w:color="999999" w:sz="4"/>
+            </w:tcBorders>
+            <w:shd w:fill="1F4E79" w:color="auto" w:val="clear"/>
+            <w:tcMar>
+              <w:top w:type="dxa" w:w="60"/>
+              <w:left w:type="dxa" w:w="100"/>
+              <w:bottom w:type="dxa" w:w="60"/>
+              <w:right w:type="dxa" w:w="100"/>
+            </w:tcMar>
+          </w:tcPr>
+          <w:p>
+            <w:pPr>
+              <w:jc w:val="left"/>
+            </w:pPr>
+            <w:r>
+              <w:rPr>
+                <w:b/>
+                <w:bCs/>
+                <w:color w:val="FFFFFF"/>
+                <w:sz w:val="18"/>
+                <w:szCs w:val="18"/>
+              </w:rPr>
+              <w:t xml:space="preserve">%</w:t>
+            </w:r>
+          </w:p>
+        </w:tc>
+      </w:tr>
+      <w:tr>
+        <w:trPr>
+          <w:tblHeader w:val="false"/>
+        </w:trPr>
+        <w:tc>
+          <w:tcPr>
+            <w:tcW w:type="dxa" w:w="3200"/>
+            <w:tcBorders>
+              <w:top w:val="single" w:color="999999" w:sz="4"/>
+              <w:left w:val="single" w:color="999999" w:sz="4"/>
+              <w:bottom w:val="single" w:color="999999" w:sz="4"/>
+              <w:right w:val="single" w:color="999999" w:sz="4"/>
+            </w:tcBorders>
+            <w:tcMar>
+              <w:top w:type="dxa" w:w="60"/>
+              <w:left w:type="dxa" w:w="100"/>
+              <w:bottom w:type="dxa" w:w="60"/>
+              <w:right w:type="dxa" w:w="100"/>
+            </w:tcMar>
+          </w:tcPr>
+          <w:p>
+            <w:pPr>
+              <w:jc w:val="left"/>
+            </w:pPr>
+            <w:r>
+              <w:t xml:space="preserve">static_price</w:t>
+            </w:r>
+          </w:p>
+        </w:tc>
+        <w:tc>
+          <w:tcPr>
+            <w:tcW w:type="dxa" w:w="2560"/>
+            <w:tcBorders>
+              <w:top w:val="single" w:color="999999" w:sz="4"/>
+              <w:left w:val="single" w:color="999999" w:sz="4"/>
+              <w:bottom w:val="single" w:color="999999" w:sz="4"/>
+              <w:right w:val="single" w:color="999999" w:sz="4"/>
+            </w:tcBorders>
+            <w:tcMar>
+              <w:top w:type="dxa" w:w="60"/>
+              <w:left w:type="dxa" w:w="100"/>
+              <w:bottom w:type="dxa" w:w="60"/>
+              <w:right w:type="dxa" w:w="100"/>
+            </w:tcMar>
+          </w:tcPr>
+          <w:p>
+            <w:pPr>
+              <w:jc w:val="left"/>
+            </w:pPr>
+            <w:r>
+              <w:t xml:space="preserve">&gt; $193.82</w:t>
+            </w:r>
+          </w:p>
+        </w:tc>
+        <w:tc>
+          <w:tcPr>
+            <w:tcW w:type="dxa" w:w="1800"/>
+            <w:tcBorders>
+              <w:top w:val="single" w:color="999999" w:sz="4"/>
+              <w:left w:val="single" w:color="999999" w:sz="4"/>
+              <w:bottom w:val="single" w:color="999999" w:sz="4"/>
+              <w:right w:val="single" w:color="999999" w:sz="4"/>
+            </w:tcBorders>
+            <w:tcMar>
+              <w:top w:type="dxa" w:w="60"/>
+              <w:left w:type="dxa" w:w="100"/>
+              <w:bottom w:type="dxa" w:w="60"/>
+              <w:right w:type="dxa" w:w="100"/>
+            </w:tcMar>
+          </w:tcPr>
+          <w:p>
+            <w:pPr>
+              <w:jc w:val="left"/>
+            </w:pPr>
+            <w:r>
+              <w:t xml:space="preserve">100,839</w:t>
+            </w:r>
+          </w:p>
+        </w:tc>
+        <w:tc>
+          <w:tcPr>
+            <w:tcW w:type="dxa" w:w="1800"/>
+            <w:tcBorders>
+              <w:top w:val="single" w:color="999999" w:sz="4"/>
+              <w:left w:val="single" w:color="999999" w:sz="4"/>
+              <w:bottom w:val="single" w:color="999999" w:sz="4"/>
+              <w:right w:val="single" w:color="999999" w:sz="4"/>
+            </w:tcBorders>
+            <w:tcMar>
+              <w:top w:type="dxa" w:w="60"/>
+              <w:left w:type="dxa" w:w="100"/>
+              <w:bottom w:type="dxa" w:w="60"/>
+              <w:right w:type="dxa" w:w="100"/>
+            </w:tcMar>
+          </w:tcPr>
+          <w:p>
+            <w:pPr>
+              <w:jc w:val="left"/>
+            </w:pPr>
+            <w:r>
+              <w:t xml:space="preserve">4.21%</w:t>
+            </w:r>
+          </w:p>
+        </w:tc>
+      </w:tr>
+      <w:tr>
+        <w:trPr>
+          <w:tblHeader w:val="false"/>
+        </w:trPr>
+        <w:tc>
+          <w:tcPr>
+            <w:tcW w:type="dxa" w:w="3200"/>
+            <w:tcBorders>
+              <w:top w:val="single" w:color="999999" w:sz="4"/>
+              <w:left w:val="single" w:color="999999" w:sz="4"/>
+              <w:bottom w:val="single" w:color="999999" w:sz="4"/>
+              <w:right w:val="single" w:color="999999" w:sz="4"/>
+            </w:tcBorders>
+            <w:tcMar>
+              <w:top w:type="dxa" w:w="60"/>
+              <w:left w:type="dxa" w:w="100"/>
+              <w:bottom w:type="dxa" w:w="60"/>
+              <w:right w:type="dxa" w:w="100"/>
+            </w:tcMar>
+          </w:tcPr>
+          <w:p>
+            <w:pPr>
+              <w:jc w:val="left"/>
+            </w:pPr>
+            <w:r>
+              <w:t xml:space="preserve">units_expected</w:t>
+            </w:r>
+          </w:p>
+        </w:tc>
+        <w:tc>
+          <w:tcPr>
+            <w:tcW w:type="dxa" w:w="2560"/>
+            <w:tcBorders>
+              <w:top w:val="single" w:color="999999" w:sz="4"/>
+              <w:left w:val="single" w:color="999999" w:sz="4"/>
+              <w:bottom w:val="single" w:color="999999" w:sz="4"/>
+              <w:right w:val="single" w:color="999999" w:sz="4"/>
+            </w:tcBorders>
+            <w:tcMar>
+              <w:top w:type="dxa" w:w="60"/>
+              <w:left w:type="dxa" w:w="100"/>
+              <w:bottom w:type="dxa" w:w="60"/>
+              <w:right w:type="dxa" w:w="100"/>
+            </w:tcMar>
+          </w:tcPr>
+          <w:p>
+            <w:pPr>
+              <w:jc w:val="left"/>
+            </w:pPr>
+            <w:r>
+              <w:t xml:space="preserve">&gt; 2,797.00</w:t>
+            </w:r>
+          </w:p>
+        </w:tc>
+        <w:tc>
+          <w:tcPr>
+            <w:tcW w:type="dxa" w:w="1800"/>
+            <w:tcBorders>
+              <w:top w:val="single" w:color="999999" w:sz="4"/>
+              <w:left w:val="single" w:color="999999" w:sz="4"/>
+              <w:bottom w:val="single" w:color="999999" w:sz="4"/>
+              <w:right w:val="single" w:color="999999" w:sz="4"/>
+            </w:tcBorders>
+            <w:tcMar>
+              <w:top w:type="dxa" w:w="60"/>
+              <w:left w:type="dxa" w:w="100"/>
+              <w:bottom w:type="dxa" w:w="60"/>
+              <w:right w:type="dxa" w:w="100"/>
+            </w:tcMar>
+          </w:tcPr>
+          <w:p>
+            <w:pPr>
+              <w:jc w:val="left"/>
+            </w:pPr>
+            <w:r>
+              <w:t xml:space="preserve">1,006</w:t>
+            </w:r>
+          </w:p>
+        </w:tc>
+        <w:tc>
+          <w:tcPr>
+            <w:tcW w:type="dxa" w:w="1800"/>
+            <w:tcBorders>
+              <w:top w:val="single" w:color="999999" w:sz="4"/>
+              <w:left w:val="single" w:color="999999" w:sz="4"/>
+              <w:bottom w:val="single" w:color="999999" w:sz="4"/>
+              <w:right w:val="single" w:color="999999" w:sz="4"/>
+            </w:tcBorders>
+            <w:tcMar>
+              <w:top w:type="dxa" w:w="60"/>
+              <w:left w:type="dxa" w:w="100"/>
+              <w:bottom w:type="dxa" w:w="60"/>
+              <w:right w:type="dxa" w:w="100"/>
+            </w:tcMar>
+          </w:tcPr>
+          <w:p>
+            <w:pPr>
+              <w:jc w:val="left"/>
+            </w:pPr>
+            <w:r>
+              <w:t xml:space="preserve">0.04%</w:t>
+            </w:r>
+          </w:p>
+        </w:tc>
+      </w:tr>
+      <w:tr>
+        <w:trPr>
+          <w:tblHeader w:val="false"/>
+        </w:trPr>
+        <w:tc>
+          <w:tcPr>
+            <w:tcW w:type="dxa" w:w="3200"/>
+            <w:tcBorders>
+              <w:top w:val="single" w:color="999999" w:sz="4"/>
+              <w:left w:val="single" w:color="999999" w:sz="4"/>
+              <w:bottom w:val="single" w:color="999999" w:sz="4"/>
+              <w:right w:val="single" w:color="999999" w:sz="4"/>
+            </w:tcBorders>
+            <w:tcMar>
+              <w:top w:type="dxa" w:w="60"/>
+              <w:left w:type="dxa" w:w="100"/>
+              <w:bottom w:type="dxa" w:w="60"/>
+              <w:right w:type="dxa" w:w="100"/>
+            </w:tcMar>
+          </w:tcPr>
+          <w:p>
+            <w:pPr>
+              <w:jc w:val="left"/>
+            </w:pPr>
+            <w:r>
+              <w:t xml:space="preserve">stock</w:t>
+            </w:r>
+          </w:p>
+        </w:tc>
+        <w:tc>
+          <w:tcPr>
+            <w:tcW w:type="dxa" w:w="2560"/>
+            <w:tcBorders>
+              <w:top w:val="single" w:color="999999" w:sz="4"/>
+              <w:left w:val="single" w:color="999999" w:sz="4"/>
+              <w:bottom w:val="single" w:color="999999" w:sz="4"/>
+              <w:right w:val="single" w:color="999999" w:sz="4"/>
+            </w:tcBorders>
+            <w:tcMar>
+              <w:top w:type="dxa" w:w="60"/>
+              <w:left w:type="dxa" w:w="100"/>
+              <w:bottom w:type="dxa" w:w="60"/>
+              <w:right w:type="dxa" w:w="100"/>
+            </w:tcMar>
+          </w:tcPr>
+          <w:p>
+            <w:pPr>
+              <w:jc w:val="left"/>
+            </w:pPr>
+            <w:r>
+              <w:t xml:space="preserve">&gt; 3,458.00</w:t>
+            </w:r>
+          </w:p>
+        </w:tc>
+        <w:tc>
+          <w:tcPr>
+            <w:tcW w:type="dxa" w:w="1800"/>
+            <w:tcBorders>
+              <w:top w:val="single" w:color="999999" w:sz="4"/>
+              <w:left w:val="single" w:color="999999" w:sz="4"/>
+              <w:bottom w:val="single" w:color="999999" w:sz="4"/>
+              <w:right w:val="single" w:color="999999" w:sz="4"/>
+            </w:tcBorders>
+            <w:tcMar>
+              <w:top w:type="dxa" w:w="60"/>
+              <w:left w:type="dxa" w:w="100"/>
+              <w:bottom w:type="dxa" w:w="60"/>
+              <w:right w:type="dxa" w:w="100"/>
+            </w:tcMar>
+          </w:tcPr>
+          <w:p>
+            <w:pPr>
+              <w:jc w:val="left"/>
+            </w:pPr>
+            <w:r>
+              <w:t xml:space="preserve">10,976</w:t>
+            </w:r>
+          </w:p>
+        </w:tc>
+        <w:tc>
+          <w:tcPr>
+            <w:tcW w:type="dxa" w:w="1800"/>
+            <w:tcBorders>
+              <w:top w:val="single" w:color="999999" w:sz="4"/>
+              <w:left w:val="single" w:color="999999" w:sz="4"/>
+              <w:bottom w:val="single" w:color="999999" w:sz="4"/>
+              <w:right w:val="single" w:color="999999" w:sz="4"/>
+            </w:tcBorders>
+            <w:tcMar>
+              <w:top w:type="dxa" w:w="60"/>
+              <w:left w:type="dxa" w:w="100"/>
+              <w:bottom w:type="dxa" w:w="60"/>
+              <w:right w:type="dxa" w:w="100"/>
+            </w:tcMar>
+          </w:tcPr>
+          <w:p>
+            <w:pPr>
+              <w:jc w:val="left"/>
+            </w:pPr>
+            <w:r>
+              <w:t xml:space="preserve">0.46%</w:t>
+            </w:r>
+          </w:p>
+        </w:tc>
+      </w:tr>
+      <w:tr>
+        <w:trPr>
+          <w:tblHeader w:val="false"/>
+        </w:trPr>
+        <w:tc>
+          <w:tcPr>
+            <w:tcW w:type="dxa" w:w="3200"/>
+            <w:tcBorders>
+              <w:top w:val="single" w:color="999999" w:sz="4"/>
+              <w:left w:val="single" w:color="999999" w:sz="4"/>
+              <w:bottom w:val="single" w:color="999999" w:sz="4"/>
+              <w:right w:val="single" w:color="999999" w:sz="4"/>
+            </w:tcBorders>
+            <w:tcMar>
+              <w:top w:type="dxa" w:w="60"/>
+              <w:left w:type="dxa" w:w="100"/>
+              <w:bottom w:type="dxa" w:w="60"/>
+              <w:right w:type="dxa" w:w="100"/>
+            </w:tcMar>
+          </w:tcPr>
+          <w:p>
+            <w:pPr>
+              <w:jc w:val="left"/>
+            </w:pPr>
+            <w:r>
+              <w:t xml:space="preserve">percentage</w:t>
+            </w:r>
+          </w:p>
+        </w:tc>
+        <w:tc>
+          <w:tcPr>
+            <w:tcW w:type="dxa" w:w="2560"/>
+            <w:tcBorders>
+              <w:top w:val="single" w:color="999999" w:sz="4"/>
+              <w:left w:val="single" w:color="999999" w:sz="4"/>
+              <w:bottom w:val="single" w:color="999999" w:sz="4"/>
+              <w:right w:val="single" w:color="999999" w:sz="4"/>
+            </w:tcBorders>
+            <w:tcMar>
+              <w:top w:type="dxa" w:w="60"/>
+              <w:left w:type="dxa" w:w="100"/>
+              <w:bottom w:type="dxa" w:w="60"/>
+              <w:right w:type="dxa" w:w="100"/>
+            </w:tcMar>
+          </w:tcPr>
+          <w:p>
+            <w:pPr>
+              <w:jc w:val="left"/>
+            </w:pPr>
+            <w:r>
+              <w:t xml:space="preserve">&lt; 74.84 y &gt; 154.89</w:t>
+            </w:r>
+          </w:p>
+        </w:tc>
+        <w:tc>
+          <w:tcPr>
+            <w:tcW w:type="dxa" w:w="1800"/>
+            <w:tcBorders>
+              <w:top w:val="single" w:color="999999" w:sz="4"/>
+              <w:left w:val="single" w:color="999999" w:sz="4"/>
+              <w:bottom w:val="single" w:color="999999" w:sz="4"/>
+              <w:right w:val="single" w:color="999999" w:sz="4"/>
+            </w:tcBorders>
+            <w:tcMar>
+              <w:top w:type="dxa" w:w="60"/>
+              <w:left w:type="dxa" w:w="100"/>
+              <w:bottom w:type="dxa" w:w="60"/>
+              <w:right w:type="dxa" w:w="100"/>
+            </w:tcMar>
+          </w:tcPr>
+          <w:p>
+            <w:pPr>
+              <w:jc w:val="left"/>
+            </w:pPr>
+            <w:r>
+              <w:t xml:space="preserve">20,073</w:t>
+            </w:r>
+          </w:p>
+        </w:tc>
+        <w:tc>
+          <w:tcPr>
+            <w:tcW w:type="dxa" w:w="1800"/>
+            <w:tcBorders>
+              <w:top w:val="single" w:color="999999" w:sz="4"/>
+              <w:left w:val="single" w:color="999999" w:sz="4"/>
+              <w:bottom w:val="single" w:color="999999" w:sz="4"/>
+              <w:right w:val="single" w:color="999999" w:sz="4"/>
+            </w:tcBorders>
+            <w:tcMar>
+              <w:top w:type="dxa" w:w="60"/>
+              <w:left w:type="dxa" w:w="100"/>
+              <w:bottom w:type="dxa" w:w="60"/>
+              <w:right w:type="dxa" w:w="100"/>
+            </w:tcMar>
+          </w:tcPr>
+          <w:p>
+            <w:pPr>
+              <w:jc w:val="left"/>
+            </w:pPr>
+            <w:r>
+              <w:t xml:space="preserve">0.84%</w:t>
+            </w:r>
+          </w:p>
+        </w:tc>
+      </w:tr>
+      <w:tr>
+        <w:trPr>
+          <w:tblHeader w:val="false"/>
+        </w:trPr>
+        <w:tc>
+          <w:tcPr>
+            <w:tcW w:type="dxa" w:w="3200"/>
+            <w:tcBorders>
+              <w:top w:val="single" w:color="999999" w:sz="4"/>
+              <w:left w:val="single" w:color="999999" w:sz="4"/>
+              <w:bottom w:val="single" w:color="999999" w:sz="4"/>
+              <w:right w:val="single" w:color="999999" w:sz="4"/>
+            </w:tcBorders>
+            <w:tcMar>
+              <w:top w:type="dxa" w:w="60"/>
+              <w:left w:type="dxa" w:w="100"/>
+              <w:bottom w:type="dxa" w:w="60"/>
+              <w:right w:type="dxa" w:w="100"/>
+            </w:tcMar>
+          </w:tcPr>
+          <w:p>
+            <w:pPr>
+              <w:jc w:val="left"/>
+            </w:pPr>
+            <w:r>
+              <w:t xml:space="preserve">units_sold</w:t>
+            </w:r>
+          </w:p>
+        </w:tc>
+        <w:tc>
+          <w:tcPr>
+            <w:tcW w:type="dxa" w:w="2560"/>
+            <w:tcBorders>
+              <w:top w:val="single" w:color="999999" w:sz="4"/>
+              <w:left w:val="single" w:color="999999" w:sz="4"/>
+              <w:bottom w:val="single" w:color="999999" w:sz="4"/>
+              <w:right w:val="single" w:color="999999" w:sz="4"/>
+            </w:tcBorders>
+            <w:tcMar>
+              <w:top w:type="dxa" w:w="60"/>
+              <w:left w:type="dxa" w:w="100"/>
+              <w:bottom w:type="dxa" w:w="60"/>
+              <w:right w:type="dxa" w:w="100"/>
+            </w:tcMar>
+          </w:tcPr>
+          <w:p>
+            <w:pPr>
+              <w:jc w:val="left"/>
+            </w:pPr>
+            <w:r>
+              <w:t xml:space="preserve">&gt; 3.5 (4 piezas o más)</w:t>
+            </w:r>
+          </w:p>
+        </w:tc>
+        <w:tc>
+          <w:tcPr>
+            <w:tcW w:type="dxa" w:w="1800"/>
+            <w:tcBorders>
+              <w:top w:val="single" w:color="999999" w:sz="4"/>
+              <w:left w:val="single" w:color="999999" w:sz="4"/>
+              <w:bottom w:val="single" w:color="999999" w:sz="4"/>
+              <w:right w:val="single" w:color="999999" w:sz="4"/>
+            </w:tcBorders>
+            <w:tcMar>
+              <w:top w:type="dxa" w:w="60"/>
+              <w:left w:type="dxa" w:w="100"/>
+              <w:bottom w:type="dxa" w:w="60"/>
+              <w:right w:type="dxa" w:w="100"/>
+            </w:tcMar>
+          </w:tcPr>
+          <w:p>
+            <w:pPr>
+              <w:jc w:val="left"/>
+            </w:pPr>
+            <w:r>
+              <w:t xml:space="preserve">129,302</w:t>
+            </w:r>
+          </w:p>
+        </w:tc>
+        <w:tc>
+          <w:tcPr>
+            <w:tcW w:type="dxa" w:w="1800"/>
+            <w:tcBorders>
+              <w:top w:val="single" w:color="999999" w:sz="4"/>
+              <w:left w:val="single" w:color="999999" w:sz="4"/>
+              <w:bottom w:val="single" w:color="999999" w:sz="4"/>
+              <w:right w:val="single" w:color="999999" w:sz="4"/>
+            </w:tcBorders>
+            <w:tcMar>
+              <w:top w:type="dxa" w:w="60"/>
+              <w:left w:type="dxa" w:w="100"/>
+              <w:bottom w:type="dxa" w:w="60"/>
+              <w:right w:type="dxa" w:w="100"/>
+            </w:tcMar>
+          </w:tcPr>
+          <w:p>
+            <w:pPr>
+              <w:jc w:val="left"/>
+            </w:pPr>
+            <w:r>
+              <w:t xml:space="preserve">5.40%</w:t>
+            </w:r>
+          </w:p>
+        </w:tc>
+      </w:tr>
+      <w:tr>
+        <w:trPr>
+          <w:tblHeader w:val="false"/>
+        </w:trPr>
+        <w:tc>
+          <w:tcPr>
+            <w:tcW w:type="dxa" w:w="3200"/>
+            <w:tcBorders>
+              <w:top w:val="single" w:color="999999" w:sz="4"/>
+              <w:left w:val="single" w:color="999999" w:sz="4"/>
+              <w:bottom w:val="single" w:color="999999" w:sz="4"/>
+              <w:right w:val="single" w:color="999999" w:sz="4"/>
+            </w:tcBorders>
+            <w:tcMar>
+              <w:top w:type="dxa" w:w="60"/>
+              <w:left w:type="dxa" w:w="100"/>
+              <w:bottom w:type="dxa" w:w="60"/>
+              <w:right w:type="dxa" w:w="100"/>
+            </w:tcMar>
+          </w:tcPr>
+          <w:p>
+            <w:pPr>
+              <w:jc w:val="left"/>
+            </w:pPr>
+            <w:r>
+              <w:t xml:space="preserve">sales_amount</w:t>
+            </w:r>
+          </w:p>
+        </w:tc>
+        <w:tc>
+          <w:tcPr>
+            <w:tcW w:type="dxa" w:w="2560"/>
+            <w:tcBorders>
+              <w:top w:val="single" w:color="999999" w:sz="4"/>
+              <w:left w:val="single" w:color="999999" w:sz="4"/>
+              <w:bottom w:val="single" w:color="999999" w:sz="4"/>
+              <w:right w:val="single" w:color="999999" w:sz="4"/>
+            </w:tcBorders>
+            <w:tcMar>
+              <w:top w:type="dxa" w:w="60"/>
+              <w:left w:type="dxa" w:w="100"/>
+              <w:bottom w:type="dxa" w:w="60"/>
+              <w:right w:type="dxa" w:w="100"/>
+            </w:tcMar>
+          </w:tcPr>
+          <w:p>
+            <w:pPr>
+              <w:jc w:val="left"/>
+            </w:pPr>
+            <w:r>
+              <w:t xml:space="preserve">&gt; $333.93</w:t>
+            </w:r>
+          </w:p>
+        </w:tc>
+        <w:tc>
+          <w:tcPr>
+            <w:tcW w:type="dxa" w:w="1800"/>
+            <w:tcBorders>
+              <w:top w:val="single" w:color="999999" w:sz="4"/>
+              <w:left w:val="single" w:color="999999" w:sz="4"/>
+              <w:bottom w:val="single" w:color="999999" w:sz="4"/>
+              <w:right w:val="single" w:color="999999" w:sz="4"/>
+            </w:tcBorders>
+            <w:tcMar>
+              <w:top w:type="dxa" w:w="60"/>
+              <w:left w:type="dxa" w:w="100"/>
+              <w:bottom w:type="dxa" w:w="60"/>
+              <w:right w:type="dxa" w:w="100"/>
+            </w:tcMar>
+          </w:tcPr>
+          <w:p>
+            <w:pPr>
+              <w:jc w:val="left"/>
+            </w:pPr>
+            <w:r>
+              <w:t xml:space="preserve">91,973</w:t>
+            </w:r>
+          </w:p>
+        </w:tc>
+        <w:tc>
+          <w:tcPr>
+            <w:tcW w:type="dxa" w:w="1800"/>
+            <w:tcBorders>
+              <w:top w:val="single" w:color="999999" w:sz="4"/>
+              <w:left w:val="single" w:color="999999" w:sz="4"/>
+              <w:bottom w:val="single" w:color="999999" w:sz="4"/>
+              <w:right w:val="single" w:color="999999" w:sz="4"/>
+            </w:tcBorders>
+            <w:tcMar>
+              <w:top w:type="dxa" w:w="60"/>
+              <w:left w:type="dxa" w:w="100"/>
+              <w:bottom w:type="dxa" w:w="60"/>
+              <w:right w:type="dxa" w:w="100"/>
+            </w:tcMar>
+          </w:tcPr>
+          <w:p>
+            <w:pPr>
+              <w:jc w:val="left"/>
+            </w:pPr>
+            <w:r>
+              <w:t xml:space="preserve">3.84%</w:t>
+            </w:r>
+          </w:p>
+        </w:tc>
+      </w:tr>
+      <w:tr>
+        <w:trPr>
+          <w:tblHeader w:val="false"/>
+        </w:trPr>
+        <w:tc>
+          <w:tcPr>
+            <w:tcW w:type="dxa" w:w="3200"/>
+            <w:tcBorders>
+              <w:top w:val="single" w:color="999999" w:sz="4"/>
+              <w:left w:val="single" w:color="999999" w:sz="4"/>
+              <w:bottom w:val="single" w:color="999999" w:sz="4"/>
+              <w:right w:val="single" w:color="999999" w:sz="4"/>
+            </w:tcBorders>
+            <w:tcMar>
+              <w:top w:type="dxa" w:w="60"/>
+              <w:left w:type="dxa" w:w="100"/>
+              <w:bottom w:type="dxa" w:w="60"/>
+              <w:right w:type="dxa" w:w="100"/>
+            </w:tcMar>
+          </w:tcPr>
+          <w:p>
+            <w:pPr>
+              <w:jc w:val="left"/>
+            </w:pPr>
+            <w:r>
+              <w:t xml:space="preserve">Age</w:t>
+            </w:r>
+          </w:p>
+        </w:tc>
+        <w:tc>
+          <w:tcPr>
+            <w:tcW w:type="dxa" w:w="2560"/>
+            <w:tcBorders>
+              <w:top w:val="single" w:color="999999" w:sz="4"/>
+              <w:left w:val="single" w:color="999999" w:sz="4"/>
+              <w:bottom w:val="single" w:color="999999" w:sz="4"/>
+              <w:right w:val="single" w:color="999999" w:sz="4"/>
+            </w:tcBorders>
+            <w:tcMar>
+              <w:top w:type="dxa" w:w="60"/>
+              <w:left w:type="dxa" w:w="100"/>
+              <w:bottom w:type="dxa" w:w="60"/>
+              <w:right w:type="dxa" w:w="100"/>
+            </w:tcMar>
+          </w:tcPr>
+          <w:p>
+            <w:pPr>
+              <w:jc w:val="left"/>
+            </w:pPr>
+            <w:r>
+              <w:t xml:space="preserve">Sin outliers (18 a 85 años)</w:t>
+            </w:r>
+          </w:p>
+        </w:tc>
+        <w:tc>
+          <w:tcPr>
+            <w:tcW w:type="dxa" w:w="1800"/>
+            <w:tcBorders>
+              <w:top w:val="single" w:color="999999" w:sz="4"/>
+              <w:left w:val="single" w:color="999999" w:sz="4"/>
+              <w:bottom w:val="single" w:color="999999" w:sz="4"/>
+              <w:right w:val="single" w:color="999999" w:sz="4"/>
+            </w:tcBorders>
+            <w:tcMar>
+              <w:top w:type="dxa" w:w="60"/>
+              <w:left w:type="dxa" w:w="100"/>
+              <w:bottom w:type="dxa" w:w="60"/>
+              <w:right w:type="dxa" w:w="100"/>
+            </w:tcMar>
+          </w:tcPr>
+          <w:p>
+            <w:pPr>
+              <w:jc w:val="left"/>
+            </w:pPr>
+            <w:r>
+              <w:t xml:space="preserve">0</w:t>
+            </w:r>
+          </w:p>
+        </w:tc>
+        <w:tc>
+          <w:tcPr>
+            <w:tcW w:type="dxa" w:w="1800"/>
+            <w:tcBorders>
+              <w:top w:val="single" w:color="999999" w:sz="4"/>
+              <w:left w:val="single" w:color="999999" w:sz="4"/>
+              <w:bottom w:val="single" w:color="999999" w:sz="4"/>
+              <w:right w:val="single" w:color="999999" w:sz="4"/>
+            </w:tcBorders>
+            <w:tcMar>
+              <w:top w:type="dxa" w:w="60"/>
+              <w:left w:type="dxa" w:w="100"/>
+              <w:bottom w:type="dxa" w:w="60"/>
+              <w:right w:type="dxa" w:w="100"/>
+            </w:tcMar>
+          </w:tcPr>
+          <w:p>
+            <w:pPr>
+              <w:jc w:val="left"/>
+            </w:pPr>
+            <w:r>
+              <w:t xml:space="preserve">0.00%</w:t>
+            </w:r>
+          </w:p>
+        </w:tc>
+      </w:tr>
+      <w:tr>
+        <w:trPr>
+          <w:tblHeader w:val="false"/>
+        </w:trPr>
+        <w:tc>
+          <w:tcPr>
+            <w:tcW w:type="dxa" w:w="3200"/>
+            <w:tcBorders>
+              <w:top w:val="single" w:color="999999" w:sz="4"/>
+              <w:left w:val="single" w:color="999999" w:sz="4"/>
+              <w:bottom w:val="single" w:color="999999" w:sz="4"/>
+              <w:right w:val="single" w:color="999999" w:sz="4"/>
+            </w:tcBorders>
+            <w:tcMar>
+              <w:top w:type="dxa" w:w="60"/>
+              <w:left w:type="dxa" w:w="100"/>
+              <w:bottom w:type="dxa" w:w="60"/>
+              <w:right w:type="dxa" w:w="100"/>
+            </w:tcMar>
+          </w:tcPr>
+          <w:p>
+            <w:pPr>
+              <w:jc w:val="left"/>
+            </w:pPr>
+            <w:r>
+              <w:t xml:space="preserve">Num_Children</w:t>
+            </w:r>
+          </w:p>
+        </w:tc>
+        <w:tc>
+          <w:tcPr>
+            <w:tcW w:type="dxa" w:w="2560"/>
+            <w:tcBorders>
+              <w:top w:val="single" w:color="999999" w:sz="4"/>
+              <w:left w:val="single" w:color="999999" w:sz="4"/>
+              <w:bottom w:val="single" w:color="999999" w:sz="4"/>
+              <w:right w:val="single" w:color="999999" w:sz="4"/>
+            </w:tcBorders>
+            <w:tcMar>
+              <w:top w:type="dxa" w:w="60"/>
+              <w:left w:type="dxa" w:w="100"/>
+              <w:bottom w:type="dxa" w:w="60"/>
+              <w:right w:type="dxa" w:w="100"/>
+            </w:tcMar>
+          </w:tcPr>
+          <w:p>
+            <w:pPr>
+              <w:jc w:val="left"/>
+            </w:pPr>
+            <w:r>
+              <w:t xml:space="preserve">Sin outliers (0 a 4)</w:t>
+            </w:r>
+          </w:p>
+        </w:tc>
+        <w:tc>
+          <w:tcPr>
+            <w:tcW w:type="dxa" w:w="1800"/>
+            <w:tcBorders>
+              <w:top w:val="single" w:color="999999" w:sz="4"/>
+              <w:left w:val="single" w:color="999999" w:sz="4"/>
+              <w:bottom w:val="single" w:color="999999" w:sz="4"/>
+              <w:right w:val="single" w:color="999999" w:sz="4"/>
+            </w:tcBorders>
+            <w:tcMar>
+              <w:top w:type="dxa" w:w="60"/>
+              <w:left w:type="dxa" w:w="100"/>
+              <w:bottom w:type="dxa" w:w="60"/>
+              <w:right w:type="dxa" w:w="100"/>
+            </w:tcMar>
+          </w:tcPr>
+          <w:p>
+            <w:pPr>
+              <w:jc w:val="left"/>
+            </w:pPr>
+            <w:r>
+              <w:t xml:space="preserve">0</w:t>
+            </w:r>
+          </w:p>
+        </w:tc>
+        <w:tc>
+          <w:tcPr>
+            <w:tcW w:type="dxa" w:w="1800"/>
+            <w:tcBorders>
+              <w:top w:val="single" w:color="999999" w:sz="4"/>
+              <w:left w:val="single" w:color="999999" w:sz="4"/>
+              <w:bottom w:val="single" w:color="999999" w:sz="4"/>
+              <w:right w:val="single" w:color="999999" w:sz="4"/>
+            </w:tcBorders>
+            <w:tcMar>
+              <w:top w:type="dxa" w:w="60"/>
+              <w:left w:type="dxa" w:w="100"/>
+              <w:bottom w:type="dxa" w:w="60"/>
+              <w:right w:type="dxa" w:w="100"/>
+            </w:tcMar>
+          </w:tcPr>
+          <w:p>
+            <w:pPr>
+              <w:jc w:val="left"/>
+            </w:pPr>
+            <w:r>
+              <w:t xml:space="preserve">0.00%</w:t>
+            </w:r>
+          </w:p>
+        </w:tc>
+      </w:tr>
+      <w:tr>
+        <w:trPr>
+          <w:tblHeader w:val="false"/>
+        </w:trPr>
+        <w:tc>
+          <w:tcPr>
+            <w:tcW w:type="dxa" w:w="3200"/>
+            <w:tcBorders>
+              <w:top w:val="single" w:color="999999" w:sz="4"/>
+              <w:left w:val="single" w:color="999999" w:sz="4"/>
+              <w:bottom w:val="single" w:color="999999" w:sz="4"/>
+              <w:right w:val="single" w:color="999999" w:sz="4"/>
+            </w:tcBorders>
+            <w:tcMar>
+              <w:top w:type="dxa" w:w="60"/>
+              <w:left w:type="dxa" w:w="100"/>
+              <w:bottom w:type="dxa" w:w="60"/>
+              <w:right w:type="dxa" w:w="100"/>
+            </w:tcMar>
+          </w:tcPr>
+          <w:p>
+            <w:pPr>
+              <w:jc w:val="left"/>
+            </w:pPr>
+            <w:r>
+              <w:t xml:space="preserve">Monthly_Salary</w:t>
+            </w:r>
+          </w:p>
+        </w:tc>
+        <w:tc>
+          <w:tcPr>
+            <w:tcW w:type="dxa" w:w="2560"/>
+            <w:tcBorders>
+              <w:top w:val="single" w:color="999999" w:sz="4"/>
+              <w:left w:val="single" w:color="999999" w:sz="4"/>
+              <w:bottom w:val="single" w:color="999999" w:sz="4"/>
+              <w:right w:val="single" w:color="999999" w:sz="4"/>
+            </w:tcBorders>
+            <w:tcMar>
+              <w:top w:type="dxa" w:w="60"/>
+              <w:left w:type="dxa" w:w="100"/>
+              <w:bottom w:type="dxa" w:w="60"/>
+              <w:right w:type="dxa" w:w="100"/>
+            </w:tcMar>
+          </w:tcPr>
+          <w:p>
+            <w:pPr>
+              <w:jc w:val="left"/>
+            </w:pPr>
+            <w:r>
+              <w:t xml:space="preserve">&gt; $64,656.32</w:t>
+            </w:r>
+          </w:p>
+        </w:tc>
+        <w:tc>
+          <w:tcPr>
+            <w:tcW w:type="dxa" w:w="1800"/>
+            <w:tcBorders>
+              <w:top w:val="single" w:color="999999" w:sz="4"/>
+              <w:left w:val="single" w:color="999999" w:sz="4"/>
+              <w:bottom w:val="single" w:color="999999" w:sz="4"/>
+              <w:right w:val="single" w:color="999999" w:sz="4"/>
+            </w:tcBorders>
+            <w:tcMar>
+              <w:top w:type="dxa" w:w="60"/>
+              <w:left w:type="dxa" w:w="100"/>
+              <w:bottom w:type="dxa" w:w="60"/>
+              <w:right w:type="dxa" w:w="100"/>
+            </w:tcMar>
+          </w:tcPr>
+          <w:p>
+            <w:pPr>
+              <w:jc w:val="left"/>
+            </w:pPr>
+            <w:r>
+              <w:t xml:space="preserve">55,277</w:t>
+            </w:r>
+          </w:p>
+        </w:tc>
+        <w:tc>
+          <w:tcPr>
+            <w:tcW w:type="dxa" w:w="1800"/>
+            <w:tcBorders>
+              <w:top w:val="single" w:color="999999" w:sz="4"/>
+              <w:left w:val="single" w:color="999999" w:sz="4"/>
+              <w:bottom w:val="single" w:color="999999" w:sz="4"/>
+              <w:right w:val="single" w:color="999999" w:sz="4"/>
+            </w:tcBorders>
+            <w:tcMar>
+              <w:top w:type="dxa" w:w="60"/>
+              <w:left w:type="dxa" w:w="100"/>
+              <w:bottom w:type="dxa" w:w="60"/>
+              <w:right w:type="dxa" w:w="100"/>
+            </w:tcMar>
+          </w:tcPr>
+          <w:p>
+            <w:pPr>
+              <w:jc w:val="left"/>
+            </w:pPr>
+            <w:r>
+              <w:t xml:space="preserve">2.31%</w:t>
+            </w:r>
+          </w:p>
+        </w:tc>
+      </w:tr>
+      <w:tr>
+        <w:trPr>
+          <w:tblHeader w:val="false"/>
+        </w:trPr>
+        <w:tc>
+          <w:tcPr>
+            <w:tcW w:type="dxa" w:w="3200"/>
+            <w:tcBorders>
+              <w:top w:val="single" w:color="999999" w:sz="4"/>
+              <w:left w:val="single" w:color="999999" w:sz="4"/>
+              <w:bottom w:val="single" w:color="999999" w:sz="4"/>
+              <w:right w:val="single" w:color="999999" w:sz="4"/>
+            </w:tcBorders>
+            <w:tcMar>
+              <w:top w:type="dxa" w:w="60"/>
+              <w:left w:type="dxa" w:w="100"/>
+              <w:bottom w:type="dxa" w:w="60"/>
+              <w:right w:type="dxa" w:w="100"/>
+            </w:tcMar>
+          </w:tcPr>
+          <w:p>
+            <w:pPr>
+              <w:jc w:val="left"/>
+            </w:pPr>
+            <w:r>
+              <w:t xml:space="preserve">Client_Seniority_Years</w:t>
+            </w:r>
+          </w:p>
+        </w:tc>
+        <w:tc>
+          <w:tcPr>
+            <w:tcW w:type="dxa" w:w="2560"/>
+            <w:tcBorders>
+              <w:top w:val="single" w:color="999999" w:sz="4"/>
+              <w:left w:val="single" w:color="999999" w:sz="4"/>
+              <w:bottom w:val="single" w:color="999999" w:sz="4"/>
+              <w:right w:val="single" w:color="999999" w:sz="4"/>
+            </w:tcBorders>
+            <w:tcMar>
+              <w:top w:type="dxa" w:w="60"/>
+              <w:left w:type="dxa" w:w="100"/>
+              <w:bottom w:type="dxa" w:w="60"/>
+              <w:right w:type="dxa" w:w="100"/>
+            </w:tcMar>
+          </w:tcPr>
+          <w:p>
+            <w:pPr>
+              <w:jc w:val="left"/>
+            </w:pPr>
+            <w:r>
+              <w:t xml:space="preserve">Sin outliers (0.01 a 10.01)</w:t>
+            </w:r>
+          </w:p>
+        </w:tc>
+        <w:tc>
+          <w:tcPr>
+            <w:tcW w:type="dxa" w:w="1800"/>
+            <w:tcBorders>
+              <w:top w:val="single" w:color="999999" w:sz="4"/>
+              <w:left w:val="single" w:color="999999" w:sz="4"/>
+              <w:bottom w:val="single" w:color="999999" w:sz="4"/>
+              <w:right w:val="single" w:color="999999" w:sz="4"/>
+            </w:tcBorders>
+            <w:tcMar>
+              <w:top w:type="dxa" w:w="60"/>
+              <w:left w:type="dxa" w:w="100"/>
+              <w:bottom w:type="dxa" w:w="60"/>
+              <w:right w:type="dxa" w:w="100"/>
+            </w:tcMar>
+          </w:tcPr>
+          <w:p>
+            <w:pPr>
+              <w:jc w:val="left"/>
+            </w:pPr>
+            <w:r>
+              <w:t xml:space="preserve">0</w:t>
+            </w:r>
+          </w:p>
+        </w:tc>
+        <w:tc>
+          <w:tcPr>
+            <w:tcW w:type="dxa" w:w="1800"/>
+            <w:tcBorders>
+              <w:top w:val="single" w:color="999999" w:sz="4"/>
+              <w:left w:val="single" w:color="999999" w:sz="4"/>
+              <w:bottom w:val="single" w:color="999999" w:sz="4"/>
+              <w:right w:val="single" w:color="999999" w:sz="4"/>
+            </w:tcBorders>
+            <w:tcMar>
+              <w:top w:type="dxa" w:w="60"/>
+              <w:left w:type="dxa" w:w="100"/>
+              <w:bottom w:type="dxa" w:w="60"/>
+              <w:right w:type="dxa" w:w="100"/>
+            </w:tcMar>
+          </w:tcPr>
+          <w:p>
+            <w:pPr>
+              <w:jc w:val="left"/>
+            </w:pPr>
+            <w:r>
+              <w:t xml:space="preserve">0.00%</w:t>
+            </w:r>
+          </w:p>
+        </w:tc>
+      </w:tr>
+      <w:tr>
+        <w:trPr>
+          <w:tblHeader w:val="false"/>
+        </w:trPr>
+        <w:tc>
+          <w:tcPr>
+            <w:tcW w:type="dxa" w:w="3200"/>
+            <w:tcBorders>
+              <w:top w:val="single" w:color="999999" w:sz="4"/>
+              <w:left w:val="single" w:color="999999" w:sz="4"/>
+              <w:bottom w:val="single" w:color="999999" w:sz="4"/>
+              <w:right w:val="single" w:color="999999" w:sz="4"/>
+            </w:tcBorders>
+            <w:tcMar>
+              <w:top w:type="dxa" w:w="60"/>
+              <w:left w:type="dxa" w:w="100"/>
+              <w:bottom w:type="dxa" w:w="60"/>
+              <w:right w:type="dxa" w:w="100"/>
+            </w:tcMar>
+          </w:tcPr>
+          <w:p>
+            <w:pPr>
+              <w:jc w:val="left"/>
+            </w:pPr>
+            <w:r>
+              <w:t xml:space="preserve">Annual_Purchase_Frequency</w:t>
+            </w:r>
+          </w:p>
+        </w:tc>
+        <w:tc>
+          <w:tcPr>
+            <w:tcW w:type="dxa" w:w="2560"/>
+            <w:tcBorders>
+              <w:top w:val="single" w:color="999999" w:sz="4"/>
+              <w:left w:val="single" w:color="999999" w:sz="4"/>
+              <w:bottom w:val="single" w:color="999999" w:sz="4"/>
+              <w:right w:val="single" w:color="999999" w:sz="4"/>
+            </w:tcBorders>
+            <w:tcMar>
+              <w:top w:type="dxa" w:w="60"/>
+              <w:left w:type="dxa" w:w="100"/>
+              <w:bottom w:type="dxa" w:w="60"/>
+              <w:right w:type="dxa" w:w="100"/>
+            </w:tcMar>
+          </w:tcPr>
+          <w:p>
+            <w:pPr>
+              <w:jc w:val="left"/>
+            </w:pPr>
+            <w:r>
+              <w:t xml:space="preserve">&gt; 15.5 (16 compras o más)</w:t>
+            </w:r>
+          </w:p>
+        </w:tc>
+        <w:tc>
+          <w:tcPr>
+            <w:tcW w:type="dxa" w:w="1800"/>
+            <w:tcBorders>
+              <w:top w:val="single" w:color="999999" w:sz="4"/>
+              <w:left w:val="single" w:color="999999" w:sz="4"/>
+              <w:bottom w:val="single" w:color="999999" w:sz="4"/>
+              <w:right w:val="single" w:color="999999" w:sz="4"/>
+            </w:tcBorders>
+            <w:tcMar>
+              <w:top w:type="dxa" w:w="60"/>
+              <w:left w:type="dxa" w:w="100"/>
+              <w:bottom w:type="dxa" w:w="60"/>
+              <w:right w:type="dxa" w:w="100"/>
+            </w:tcMar>
+          </w:tcPr>
+          <w:p>
+            <w:pPr>
+              <w:jc w:val="left"/>
+            </w:pPr>
+            <w:r>
+              <w:t xml:space="preserve">31,996</w:t>
+            </w:r>
+          </w:p>
+        </w:tc>
+        <w:tc>
+          <w:tcPr>
+            <w:tcW w:type="dxa" w:w="1800"/>
+            <w:tcBorders>
+              <w:top w:val="single" w:color="999999" w:sz="4"/>
+              <w:left w:val="single" w:color="999999" w:sz="4"/>
+              <w:bottom w:val="single" w:color="999999" w:sz="4"/>
+              <w:right w:val="single" w:color="999999" w:sz="4"/>
+            </w:tcBorders>
+            <w:tcMar>
+              <w:top w:type="dxa" w:w="60"/>
+              <w:left w:type="dxa" w:w="100"/>
+              <w:bottom w:type="dxa" w:w="60"/>
+              <w:right w:type="dxa" w:w="100"/>
+            </w:tcMar>
+          </w:tcPr>
+          <w:p>
+            <w:pPr>
+              <w:jc w:val="left"/>
+            </w:pPr>
+            <w:r>
+              <w:t xml:space="preserve">1.34%</w:t>
+            </w:r>
+          </w:p>
+        </w:tc>
+      </w:tr>
+      <w:tr>
+        <w:trPr>
+          <w:tblHeader w:val="false"/>
+        </w:trPr>
+        <w:tc>
+          <w:tcPr>
+            <w:tcW w:type="dxa" w:w="3200"/>
+            <w:tcBorders>
+              <w:top w:val="single" w:color="999999" w:sz="4"/>
+              <w:left w:val="single" w:color="999999" w:sz="4"/>
+              <w:bottom w:val="single" w:color="999999" w:sz="4"/>
+              <w:right w:val="single" w:color="999999" w:sz="4"/>
+            </w:tcBorders>
+            <w:tcMar>
+              <w:top w:type="dxa" w:w="60"/>
+              <w:left w:type="dxa" w:w="100"/>
+              <w:bottom w:type="dxa" w:w="60"/>
+              <w:right w:type="dxa" w:w="100"/>
+            </w:tcMar>
+          </w:tcPr>
+          <w:p>
+            <w:pPr>
+              <w:jc w:val="left"/>
+            </w:pPr>
+            <w:r>
+              <w:t xml:space="preserve">Average_Ticket</w:t>
+            </w:r>
+          </w:p>
+        </w:tc>
+        <w:tc>
+          <w:tcPr>
+            <w:tcW w:type="dxa" w:w="2560"/>
+            <w:tcBorders>
+              <w:top w:val="single" w:color="999999" w:sz="4"/>
+              <w:left w:val="single" w:color="999999" w:sz="4"/>
+              <w:bottom w:val="single" w:color="999999" w:sz="4"/>
+              <w:right w:val="single" w:color="999999" w:sz="4"/>
+            </w:tcBorders>
+            <w:tcMar>
+              <w:top w:type="dxa" w:w="60"/>
+              <w:left w:type="dxa" w:w="100"/>
+              <w:bottom w:type="dxa" w:w="60"/>
+              <w:right w:type="dxa" w:w="100"/>
+            </w:tcMar>
+          </w:tcPr>
+          <w:p>
+            <w:pPr>
+              <w:jc w:val="left"/>
+            </w:pPr>
+            <w:r>
+              <w:t xml:space="preserve">&gt; $3,809.32</w:t>
+            </w:r>
+          </w:p>
+        </w:tc>
+        <w:tc>
+          <w:tcPr>
+            <w:tcW w:type="dxa" w:w="1800"/>
+            <w:tcBorders>
+              <w:top w:val="single" w:color="999999" w:sz="4"/>
+              <w:left w:val="single" w:color="999999" w:sz="4"/>
+              <w:bottom w:val="single" w:color="999999" w:sz="4"/>
+              <w:right w:val="single" w:color="999999" w:sz="4"/>
+            </w:tcBorders>
+            <w:tcMar>
+              <w:top w:type="dxa" w:w="60"/>
+              <w:left w:type="dxa" w:w="100"/>
+              <w:bottom w:type="dxa" w:w="60"/>
+              <w:right w:type="dxa" w:w="100"/>
+            </w:tcMar>
+          </w:tcPr>
+          <w:p>
+            <w:pPr>
+              <w:jc w:val="left"/>
+            </w:pPr>
+            <w:r>
+              <w:t xml:space="preserve">50,116</w:t>
+            </w:r>
+          </w:p>
+        </w:tc>
+        <w:tc>
+          <w:tcPr>
+            <w:tcW w:type="dxa" w:w="1800"/>
+            <w:tcBorders>
+              <w:top w:val="single" w:color="999999" w:sz="4"/>
+              <w:left w:val="single" w:color="999999" w:sz="4"/>
+              <w:bottom w:val="single" w:color="999999" w:sz="4"/>
+              <w:right w:val="single" w:color="999999" w:sz="4"/>
+            </w:tcBorders>
+            <w:tcMar>
+              <w:top w:type="dxa" w:w="60"/>
+              <w:left w:type="dxa" w:w="100"/>
+              <w:bottom w:type="dxa" w:w="60"/>
+              <w:right w:type="dxa" w:w="100"/>
+            </w:tcMar>
+          </w:tcPr>
+          <w:p>
+            <w:pPr>
+              <w:jc w:val="left"/>
+            </w:pPr>
+            <w:r>
+              <w:t xml:space="preserve">2.09%</w:t>
+            </w:r>
+          </w:p>
+        </w:tc>
+      </w:tr>
+      <w:tr>
+        <w:trPr>
+          <w:tblHeader w:val="false"/>
+        </w:trPr>
+        <w:tc>
+          <w:tcPr>
+            <w:tcW w:type="dxa" w:w="3200"/>
+            <w:tcBorders>
+              <w:top w:val="single" w:color="999999" w:sz="4"/>
+              <w:left w:val="single" w:color="999999" w:sz="4"/>
+              <w:bottom w:val="single" w:color="999999" w:sz="4"/>
+              <w:right w:val="single" w:color="999999" w:sz="4"/>
+            </w:tcBorders>
+            <w:tcMar>
+              <w:top w:type="dxa" w:w="60"/>
+              <w:left w:type="dxa" w:w="100"/>
+              <w:bottom w:type="dxa" w:w="60"/>
+              <w:right w:type="dxa" w:w="100"/>
+            </w:tcMar>
+          </w:tcPr>
+          <w:p>
+            <w:pPr>
+              <w:jc w:val="left"/>
+            </w:pPr>
+            <w:r>
+              <w:t xml:space="preserve">Annual_Total_Spend</w:t>
+            </w:r>
+          </w:p>
+        </w:tc>
+        <w:tc>
+          <w:tcPr>
+            <w:tcW w:type="dxa" w:w="2560"/>
+            <w:tcBorders>
+              <w:top w:val="single" w:color="999999" w:sz="4"/>
+              <w:left w:val="single" w:color="999999" w:sz="4"/>
+              <w:bottom w:val="single" w:color="999999" w:sz="4"/>
+              <w:right w:val="single" w:color="999999" w:sz="4"/>
+            </w:tcBorders>
+            <w:tcMar>
+              <w:top w:type="dxa" w:w="60"/>
+              <w:left w:type="dxa" w:w="100"/>
+              <w:bottom w:type="dxa" w:w="60"/>
+              <w:right w:type="dxa" w:w="100"/>
+            </w:tcMar>
+          </w:tcPr>
+          <w:p>
+            <w:pPr>
+              <w:jc w:val="left"/>
+            </w:pPr>
+            <w:r>
+              <w:t xml:space="preserve">&gt; $32,706.10</w:t>
+            </w:r>
+          </w:p>
+        </w:tc>
+        <w:tc>
+          <w:tcPr>
+            <w:tcW w:type="dxa" w:w="1800"/>
+            <w:tcBorders>
+              <w:top w:val="single" w:color="999999" w:sz="4"/>
+              <w:left w:val="single" w:color="999999" w:sz="4"/>
+              <w:bottom w:val="single" w:color="999999" w:sz="4"/>
+              <w:right w:val="single" w:color="999999" w:sz="4"/>
+            </w:tcBorders>
+            <w:tcMar>
+              <w:top w:type="dxa" w:w="60"/>
+              <w:left w:type="dxa" w:w="100"/>
+              <w:bottom w:type="dxa" w:w="60"/>
+              <w:right w:type="dxa" w:w="100"/>
+            </w:tcMar>
+          </w:tcPr>
+          <w:p>
+            <w:pPr>
+              <w:jc w:val="left"/>
+            </w:pPr>
+            <w:r>
+              <w:t xml:space="preserve">145,907</w:t>
+            </w:r>
+          </w:p>
+        </w:tc>
+        <w:tc>
+          <w:tcPr>
+            <w:tcW w:type="dxa" w:w="1800"/>
+            <w:tcBorders>
+              <w:top w:val="single" w:color="999999" w:sz="4"/>
+              <w:left w:val="single" w:color="999999" w:sz="4"/>
+              <w:bottom w:val="single" w:color="999999" w:sz="4"/>
+              <w:right w:val="single" w:color="999999" w:sz="4"/>
+            </w:tcBorders>
+            <w:tcMar>
+              <w:top w:type="dxa" w:w="60"/>
+              <w:left w:type="dxa" w:w="100"/>
+              <w:bottom w:type="dxa" w:w="60"/>
+              <w:right w:type="dxa" w:w="100"/>
+            </w:tcMar>
+          </w:tcPr>
+          <w:p>
+            <w:pPr>
+              <w:jc w:val="left"/>
+            </w:pPr>
+            <w:r>
+              <w:t xml:space="preserve">6.09%</w:t>
+            </w:r>
+          </w:p>
+        </w:tc>
+      </w:tr>
+      <w:tr>
+        <w:trPr>
+          <w:tblHeader w:val="false"/>
+        </w:trPr>
+        <w:tc>
+          <w:tcPr>
+            <w:tcW w:type="dxa" w:w="3200"/>
+            <w:tcBorders>
+              <w:top w:val="single" w:color="999999" w:sz="4"/>
+              <w:left w:val="single" w:color="999999" w:sz="4"/>
+              <w:bottom w:val="single" w:color="999999" w:sz="4"/>
+              <w:right w:val="single" w:color="999999" w:sz="4"/>
+            </w:tcBorders>
+            <w:tcMar>
+              <w:top w:type="dxa" w:w="60"/>
+              <w:left w:type="dxa" w:w="100"/>
+              <w:bottom w:type="dxa" w:w="60"/>
+              <w:right w:type="dxa" w:w="100"/>
+            </w:tcMar>
+          </w:tcPr>
+          <w:p>
+            <w:pPr>
+              <w:jc w:val="left"/>
+            </w:pPr>
+            <w:r>
+              <w:t xml:space="preserve">Ventas_Acumuladas</w:t>
+            </w:r>
+          </w:p>
+        </w:tc>
+        <w:tc>
+          <w:tcPr>
+            <w:tcW w:type="dxa" w:w="2560"/>
+            <w:tcBorders>
+              <w:top w:val="single" w:color="999999" w:sz="4"/>
+              <w:left w:val="single" w:color="999999" w:sz="4"/>
+              <w:bottom w:val="single" w:color="999999" w:sz="4"/>
+              <w:right w:val="single" w:color="999999" w:sz="4"/>
+            </w:tcBorders>
+            <w:tcMar>
+              <w:top w:type="dxa" w:w="60"/>
+              <w:left w:type="dxa" w:w="100"/>
+              <w:bottom w:type="dxa" w:w="60"/>
+              <w:right w:type="dxa" w:w="100"/>
+            </w:tcMar>
+          </w:tcPr>
+          <w:p>
+            <w:pPr>
+              <w:jc w:val="left"/>
+            </w:pPr>
+            <w:r>
+              <w:t xml:space="preserve">&gt; 564.00</w:t>
+            </w:r>
+          </w:p>
+        </w:tc>
+        <w:tc>
+          <w:tcPr>
+            <w:tcW w:type="dxa" w:w="1800"/>
+            <w:tcBorders>
+              <w:top w:val="single" w:color="999999" w:sz="4"/>
+              <w:left w:val="single" w:color="999999" w:sz="4"/>
+              <w:bottom w:val="single" w:color="999999" w:sz="4"/>
+              <w:right w:val="single" w:color="999999" w:sz="4"/>
+            </w:tcBorders>
+            <w:tcMar>
+              <w:top w:type="dxa" w:w="60"/>
+              <w:left w:type="dxa" w:w="100"/>
+              <w:bottom w:type="dxa" w:w="60"/>
+              <w:right w:type="dxa" w:w="100"/>
+            </w:tcMar>
+          </w:tcPr>
+          <w:p>
+            <w:pPr>
+              <w:jc w:val="left"/>
+            </w:pPr>
+            <w:r>
+              <w:t xml:space="preserve">81,375</w:t>
+            </w:r>
+          </w:p>
+        </w:tc>
+        <w:tc>
+          <w:tcPr>
+            <w:tcW w:type="dxa" w:w="1800"/>
+            <w:tcBorders>
+              <w:top w:val="single" w:color="999999" w:sz="4"/>
+              <w:left w:val="single" w:color="999999" w:sz="4"/>
+              <w:bottom w:val="single" w:color="999999" w:sz="4"/>
+              <w:right w:val="single" w:color="999999" w:sz="4"/>
+            </w:tcBorders>
+            <w:tcMar>
+              <w:top w:type="dxa" w:w="60"/>
+              <w:left w:type="dxa" w:w="100"/>
+              <w:bottom w:type="dxa" w:w="60"/>
+              <w:right w:type="dxa" w:w="100"/>
+            </w:tcMar>
+          </w:tcPr>
+          <w:p>
+            <w:pPr>
+              <w:jc w:val="left"/>
+            </w:pPr>
+            <w:r>
+              <w:t xml:space="preserve">3.40%</w:t>
+            </w:r>
+          </w:p>
+        </w:tc>
+      </w:tr>
+      <w:tr>
+        <w:trPr>
+          <w:tblHeader w:val="false"/>
+        </w:trPr>
+        <w:tc>
+          <w:tcPr>
+            <w:tcW w:type="dxa" w:w="3200"/>
+            <w:tcBorders>
+              <w:top w:val="single" w:color="999999" w:sz="4"/>
+              <w:left w:val="single" w:color="999999" w:sz="4"/>
+              <w:bottom w:val="single" w:color="999999" w:sz="4"/>
+              <w:right w:val="single" w:color="999999" w:sz="4"/>
+            </w:tcBorders>
+            <w:tcMar>
+              <w:top w:type="dxa" w:w="60"/>
+              <w:left w:type="dxa" w:w="100"/>
+              <w:bottom w:type="dxa" w:w="60"/>
+              <w:right w:type="dxa" w:w="100"/>
+            </w:tcMar>
+          </w:tcPr>
+          <w:p>
+            <w:pPr>
+              <w:jc w:val="left"/>
+            </w:pPr>
+            <w:r>
+              <w:t xml:space="preserve">Stock_Restante</w:t>
+            </w:r>
+          </w:p>
+        </w:tc>
+        <w:tc>
+          <w:tcPr>
+            <w:tcW w:type="dxa" w:w="2560"/>
+            <w:tcBorders>
+              <w:top w:val="single" w:color="999999" w:sz="4"/>
+              <w:left w:val="single" w:color="999999" w:sz="4"/>
+              <w:bottom w:val="single" w:color="999999" w:sz="4"/>
+              <w:right w:val="single" w:color="999999" w:sz="4"/>
+            </w:tcBorders>
+            <w:tcMar>
+              <w:top w:type="dxa" w:w="60"/>
+              <w:left w:type="dxa" w:w="100"/>
+              <w:bottom w:type="dxa" w:w="60"/>
+              <w:right w:type="dxa" w:w="100"/>
+            </w:tcMar>
+          </w:tcPr>
+          <w:p>
+            <w:pPr>
+              <w:jc w:val="left"/>
+            </w:pPr>
+            <w:r>
+              <w:t xml:space="preserve">&gt; 3,050.50</w:t>
+            </w:r>
+          </w:p>
+        </w:tc>
+        <w:tc>
+          <w:tcPr>
+            <w:tcW w:type="dxa" w:w="1800"/>
+            <w:tcBorders>
+              <w:top w:val="single" w:color="999999" w:sz="4"/>
+              <w:left w:val="single" w:color="999999" w:sz="4"/>
+              <w:bottom w:val="single" w:color="999999" w:sz="4"/>
+              <w:right w:val="single" w:color="999999" w:sz="4"/>
+            </w:tcBorders>
+            <w:tcMar>
+              <w:top w:type="dxa" w:w="60"/>
+              <w:left w:type="dxa" w:w="100"/>
+              <w:bottom w:type="dxa" w:w="60"/>
+              <w:right w:type="dxa" w:w="100"/>
+            </w:tcMar>
+          </w:tcPr>
+          <w:p>
+            <w:pPr>
+              <w:jc w:val="left"/>
+            </w:pPr>
+            <w:r>
+              <w:t xml:space="preserve">16,645</w:t>
+            </w:r>
+          </w:p>
+        </w:tc>
+        <w:tc>
+          <w:tcPr>
+            <w:tcW w:type="dxa" w:w="1800"/>
+            <w:tcBorders>
+              <w:top w:val="single" w:color="999999" w:sz="4"/>
+              <w:left w:val="single" w:color="999999" w:sz="4"/>
+              <w:bottom w:val="single" w:color="999999" w:sz="4"/>
+              <w:right w:val="single" w:color="999999" w:sz="4"/>
+            </w:tcBorders>
+            <w:tcMar>
+              <w:top w:type="dxa" w:w="60"/>
+              <w:left w:type="dxa" w:w="100"/>
+              <w:bottom w:type="dxa" w:w="60"/>
+              <w:right w:type="dxa" w:w="100"/>
+            </w:tcMar>
+          </w:tcPr>
+          <w:p>
+            <w:pPr>
+              <w:jc w:val="left"/>
+            </w:pPr>
+            <w:r>
+              <w:t xml:space="preserve">0.69%</w:t>
+            </w:r>
+          </w:p>
+        </w:tc>
+      </w:tr>
+      <w:tr>
+        <w:trPr>
+          <w:tblHeader w:val="false"/>
+        </w:trPr>
+        <w:tc>
+          <w:tcPr>
+            <w:tcW w:type="dxa" w:w="3200"/>
+            <w:tcBorders>
+              <w:top w:val="single" w:color="999999" w:sz="4"/>
+              <w:left w:val="single" w:color="999999" w:sz="4"/>
+              <w:bottom w:val="single" w:color="999999" w:sz="4"/>
+              <w:right w:val="single" w:color="999999" w:sz="4"/>
+            </w:tcBorders>
+            <w:tcMar>
+              <w:top w:type="dxa" w:w="60"/>
+              <w:left w:type="dxa" w:w="100"/>
+              <w:bottom w:type="dxa" w:w="60"/>
+              <w:right w:type="dxa" w:w="100"/>
+            </w:tcMar>
+          </w:tcPr>
+          <w:p>
+            <w:pPr>
+              <w:jc w:val="left"/>
+            </w:pPr>
+            <w:r>
+              <w:t xml:space="preserve">Cumplimiento_Venta_Esperada</w:t>
+            </w:r>
+          </w:p>
+        </w:tc>
+        <w:tc>
+          <w:tcPr>
+            <w:tcW w:type="dxa" w:w="2560"/>
+            <w:tcBorders>
+              <w:top w:val="single" w:color="999999" w:sz="4"/>
+              <w:left w:val="single" w:color="999999" w:sz="4"/>
+              <w:bottom w:val="single" w:color="999999" w:sz="4"/>
+              <w:right w:val="single" w:color="999999" w:sz="4"/>
+            </w:tcBorders>
+            <w:tcMar>
+              <w:top w:type="dxa" w:w="60"/>
+              <w:left w:type="dxa" w:w="100"/>
+              <w:bottom w:type="dxa" w:w="60"/>
+              <w:right w:type="dxa" w:w="100"/>
+            </w:tcMar>
+          </w:tcPr>
+          <w:p>
+            <w:pPr>
+              <w:jc w:val="left"/>
+            </w:pPr>
+            <w:r>
+              <w:t xml:space="preserve">&gt; 57.76%</w:t>
+            </w:r>
+          </w:p>
+        </w:tc>
+        <w:tc>
+          <w:tcPr>
+            <w:tcW w:type="dxa" w:w="1800"/>
+            <w:tcBorders>
+              <w:top w:val="single" w:color="999999" w:sz="4"/>
+              <w:left w:val="single" w:color="999999" w:sz="4"/>
+              <w:bottom w:val="single" w:color="999999" w:sz="4"/>
+              <w:right w:val="single" w:color="999999" w:sz="4"/>
+            </w:tcBorders>
+            <w:tcMar>
+              <w:top w:type="dxa" w:w="60"/>
+              <w:left w:type="dxa" w:w="100"/>
+              <w:bottom w:type="dxa" w:w="60"/>
+              <w:right w:type="dxa" w:w="100"/>
+            </w:tcMar>
+          </w:tcPr>
+          <w:p>
+            <w:pPr>
+              <w:jc w:val="left"/>
+            </w:pPr>
+            <w:r>
+              <w:t xml:space="preserve">184</w:t>
+            </w:r>
+          </w:p>
+        </w:tc>
+        <w:tc>
+          <w:tcPr>
+            <w:tcW w:type="dxa" w:w="1800"/>
+            <w:tcBorders>
+              <w:top w:val="single" w:color="999999" w:sz="4"/>
+              <w:left w:val="single" w:color="999999" w:sz="4"/>
+              <w:bottom w:val="single" w:color="999999" w:sz="4"/>
+              <w:right w:val="single" w:color="999999" w:sz="4"/>
+            </w:tcBorders>
+            <w:tcMar>
+              <w:top w:type="dxa" w:w="60"/>
+              <w:left w:type="dxa" w:w="100"/>
+              <w:bottom w:type="dxa" w:w="60"/>
+              <w:right w:type="dxa" w:w="100"/>
+            </w:tcMar>
+          </w:tcPr>
+          <w:p>
+            <w:pPr>
+              <w:jc w:val="left"/>
+            </w:pPr>
+            <w:r>
+              <w:t xml:space="preserve">0.01%</w:t>
+            </w:r>
+          </w:p>
+        </w:tc>
+      </w:tr>
+      <w:tr>
+        <w:trPr>
+          <w:tblHeader w:val="false"/>
+        </w:trPr>
+        <w:tc>
+          <w:tcPr>
+            <w:tcW w:type="dxa" w:w="3200"/>
+            <w:tcBorders>
+              <w:top w:val="single" w:color="999999" w:sz="4"/>
+              <w:left w:val="single" w:color="999999" w:sz="4"/>
+              <w:bottom w:val="single" w:color="999999" w:sz="4"/>
+              <w:right w:val="single" w:color="999999" w:sz="4"/>
+            </w:tcBorders>
+            <w:tcMar>
+              <w:top w:type="dxa" w:w="60"/>
+              <w:left w:type="dxa" w:w="100"/>
+              <w:bottom w:type="dxa" w:w="60"/>
+              <w:right w:type="dxa" w:w="100"/>
+            </w:tcMar>
+          </w:tcPr>
+          <w:p>
+            <w:pPr>
+              <w:jc w:val="left"/>
+            </w:pPr>
+            <w:r>
+              <w:t xml:space="preserve">Repeat_Purchase_Rate</w:t>
+            </w:r>
+          </w:p>
+        </w:tc>
+        <w:tc>
+          <w:tcPr>
+            <w:tcW w:type="dxa" w:w="2560"/>
+            <w:tcBorders>
+              <w:top w:val="single" w:color="999999" w:sz="4"/>
+              <w:left w:val="single" w:color="999999" w:sz="4"/>
+              <w:bottom w:val="single" w:color="999999" w:sz="4"/>
+              <w:right w:val="single" w:color="999999" w:sz="4"/>
+            </w:tcBorders>
+            <w:tcMar>
+              <w:top w:type="dxa" w:w="60"/>
+              <w:left w:type="dxa" w:w="100"/>
+              <w:bottom w:type="dxa" w:w="60"/>
+              <w:right w:type="dxa" w:w="100"/>
+            </w:tcMar>
+          </w:tcPr>
+          <w:p>
+            <w:pPr>
+              <w:jc w:val="left"/>
+            </w:pPr>
+            <w:r>
+              <w:t xml:space="preserve">&lt; 100 (la mayoría vale 100)</w:t>
+            </w:r>
+          </w:p>
+        </w:tc>
+        <w:tc>
+          <w:tcPr>
+            <w:tcW w:type="dxa" w:w="1800"/>
+            <w:tcBorders>
+              <w:top w:val="single" w:color="999999" w:sz="4"/>
+              <w:left w:val="single" w:color="999999" w:sz="4"/>
+              <w:bottom w:val="single" w:color="999999" w:sz="4"/>
+              <w:right w:val="single" w:color="999999" w:sz="4"/>
+            </w:tcBorders>
+            <w:tcMar>
+              <w:top w:type="dxa" w:w="60"/>
+              <w:left w:type="dxa" w:w="100"/>
+              <w:bottom w:type="dxa" w:w="60"/>
+              <w:right w:type="dxa" w:w="100"/>
+            </w:tcMar>
+          </w:tcPr>
+          <w:p>
+            <w:pPr>
+              <w:jc w:val="left"/>
+            </w:pPr>
+            <w:r>
+              <w:t xml:space="preserve">151,710</w:t>
+            </w:r>
+          </w:p>
+        </w:tc>
+        <w:tc>
+          <w:tcPr>
+            <w:tcW w:type="dxa" w:w="1800"/>
+            <w:tcBorders>
+              <w:top w:val="single" w:color="999999" w:sz="4"/>
+              <w:left w:val="single" w:color="999999" w:sz="4"/>
+              <w:bottom w:val="single" w:color="999999" w:sz="4"/>
+              <w:right w:val="single" w:color="999999" w:sz="4"/>
+            </w:tcBorders>
+            <w:tcMar>
+              <w:top w:type="dxa" w:w="60"/>
+              <w:left w:type="dxa" w:w="100"/>
+              <w:bottom w:type="dxa" w:w="60"/>
+              <w:right w:type="dxa" w:w="100"/>
+            </w:tcMar>
+          </w:tcPr>
+          <w:p>
+            <w:pPr>
+              <w:jc w:val="left"/>
+            </w:pPr>
+            <w:r>
+              <w:t xml:space="preserve">6.33%</w:t>
+            </w:r>
+          </w:p>
+        </w:tc>
+      </w:tr>
+    </w:tbl>
+    <w:p>
+      <w:pPr>
+        <w:spacing w:after="120"/>
+      </w:pPr>
+      <w:r>
+        <w:t xml:space="preserve">Las variables de precio, ventas y gasto tienen outliers solo en la parte alta (sesgo a la derecha); Age, Num_Children y Client_Seniority_Years no tienen outliers. Product_Repeat_Purchase_Rate y Repeat_Purchase_Rate casi siempre valen ~100, por lo que cualquier valor menor aparece como outlier y aportan poca información.</w:t>
+      </w:r>
+    </w:p>
     <w:p>
       <w:pPr>
         <w:pStyle w:val="Heading2"/>
@@ -8089,7 +11472,7 @@
         <w:t xml:space="preserve">region – units_sold y sales_amount:</w:t>
       </w:r>
       <w:r>
-        <w:t xml:space="preserve"> jerarquía clara: Ciudad de México vende 7.6 veces más unidades que Sureste (mediana 512.5 vs. 67) y casi 8 veces más en monto. Outliers generales a partir de 593.5 unidades y $39,299.74 al mes.</w:t>
+        <w:t xml:space="preserve"> jerarquía clara: Ciudad de México vende 7.6 veces más unidades que Sureste (mediana 512.5 vs. 67) y casi 8 veces más en monto. Los límites de outliers cambian mucho por región: en unidades van de 135.38 (Sureste) a 989.00 (Ciudad de México), y en monto de $11,400.73 a $86,597.36.</w:t>
       </w:r>
     </w:p>
     <w:p>
@@ -8109,7 +11492,7 @@
         <w:t xml:space="preserve">region – Cumplimiento_Venta_Esperada:</w:t>
       </w:r>
       <w:r>
-        <w:t xml:space="preserve"> mismo orden: de 33.29% en Ciudad de México a 6.58% en Sureste. Outliers generales a partir de 40.97%.</w:t>
+        <w:t xml:space="preserve"> mismo orden: de 33.29% en Ciudad de México a 6.58% en Sureste. Outliers a partir de 10.99% en Sureste hasta 47.59% en Ciudad de México.</w:t>
       </w:r>
     </w:p>
     <w:p>
@@ -8129,7 +11512,7 @@
         <w:t xml:space="preserve">region – Dias_Cobertura_Inventario:</w:t>
       </w:r>
       <w:r>
-        <w:t xml:space="preserve"> comportamiento inverso: de 109 días en Ciudad de México a 472 días en Sureste. Outliers generales a partir de 710.25 días (276 registros) y extremos a partir de 1,037.21 días (16 registros). </w:t>
+        <w:t xml:space="preserve"> comportamiento inverso: de 109 días en Ciudad de México a 472 días en Sureste. Outliers a partir de 168 días en Ciudad de México hasta 820.94 días en Sureste. </w:t>
       </w:r>
       <w:r>
         <w:rPr>
@@ -8869,7 +12252,7 @@
         <w:t xml:space="preserve">category:</w:t>
       </w:r>
       <w:r>
-        <w:t xml:space="preserve"> las diferencias son pequeñas. Casual Wear tiene la mediana más alta de unidades (155.5), pero Footwear genera más monto ($12,910.62) por su mayor precio; a la vez, Footwear tiene el menor cumplimiento (10.99%) y la mayor cobertura (288 días).</w:t>
+        <w:t xml:space="preserve"> las diferencias son pequeñas. Casual Wear tiene la mediana más alta de unidades (155.5), pero Footwear genera más monto ($12,910.62) por su mayor precio; a la vez, Footwear tiene el menor cumplimiento (10.99%) y la mayor cobertura (288 días). Outliers de unidades a partir de 557.5 (Accessories) a 684.5 (Casual Wear); de monto de $31,229.45 a $55,601.91 (Footwear); de cumplimiento de 37.15% (Footwear) a 43.24%; de cobertura de 662.50 a 789.24 días (Footwear).</w:t>
       </w:r>
     </w:p>
     <w:p>
@@ -8889,7 +12272,7 @@
         <w:t xml:space="preserve">subcategory (regla del 70% por unidades vendidas: Sneakers, Bottoms, Shirts, Pants, Dresses, Tops, Boots y Sandals; el resto en "Otras"):</w:t>
       </w:r>
       <w:r>
-        <w:t xml:space="preserve"> Bottoms tiene la mediana más alta de unidades (165) y Boots la de monto ($19,624.73). Las subcategorías de mayor precio (Boots, Sneakers y Bags) tienen el menor cumplimiento (10.17–10.29%) y la mayor cobertura (305–312 días): son las que más sobrestock acumulan.</w:t>
+        <w:t xml:space="preserve"> Bottoms tiene la mediana más alta de unidades (165) y Boots la de monto ($19,624.73). Las subcategorías de mayor precio (Boots, Sneakers y Bags) tienen el menor cumplimiento (10.17–10.29%) y la mayor cobertura (305–312 días): son las que más sobrestock acumulan. Outliers de monto a partir de $20,053.27 (Belts) hasta $79,290.15 (Boots), y de cobertura a partir de 656.45 (Belts) hasta 828.38 días (Sneakers).</w:t>
       </w:r>
     </w:p>
     <w:p>
@@ -8906,7 +12289,7 @@
         <w:spacing w:after="120"/>
       </w:pPr>
       <w:r>
-        <w:t xml:space="preserve">Medianas por transacción. En todas las variables cualitativas, units_sold tiene mediana 2 y outliers a partir de 4 piezas (límite 3.5).</w:t>
+        <w:t xml:space="preserve">Medianas por transacción. units_sold tiene mediana de 2 piezas en todas las categorías de todas las variables. En region, Client_Category, Preferred_Channel, Socioeconomic_Level y Rango_Edad presenta outliers a partir de 4 piezas (límite 3.5) en todas sus categorías.</w:t>
       </w:r>
     </w:p>
     <w:p>
@@ -8923,10 +12306,10 @@
           <w:b/>
           <w:bCs/>
         </w:rPr>
-        <w:t xml:space="preserve">category y subcategory:</w:t>
-      </w:r>
-      <w:r>
-        <w:t xml:space="preserve"> solo cambia el monto por transacción, por el precio de cada producto: Footwear tiene mediana de $159.74 contra ~$90–92 del resto; por subcategoría va de $59.83 (Shirts) a $209.54 (Boots). La frecuencia (mediana 5) y el gasto anual (~$6,600–6,780) son iguales en todas.</w:t>
+        <w:t xml:space="preserve">category y subcategory – units_sold:</w:t>
+      </w:r>
+      <w:r>
+        <w:t xml:space="preserve"> Accessories y Footwear tienen Q3 de 2 piezas y outliers a partir de 4; Casual Wear y Fitness Wear tienen Q3 de 3 y no presentan outliers (límite 6). Por subcategoría, Bags, Boots y Sneakers nunca superan 2 piezas por transacción y Jewelry 3; el resto llega hasta 6 sin outliers.</w:t>
       </w:r>
     </w:p>
     <w:p>
@@ -8946,7 +12329,7 @@
         <w:t xml:space="preserve">region:</w:t>
       </w:r>
       <w:r>
-        <w:t xml:space="preserve"> el monto por transacción es igual en todas (~$108–110) y la frecuencia también (mediana 5). Cambia el gasto anual: Ciudad de México ($7,155.00) y Monterrey ($6,953.96) contra Sur ($5,960.64) y Bajío ($5,967.45).</w:t>
+        <w:t xml:space="preserve"> el monto por transacción es igual en todas (~$108–110) y la frecuencia también (mediana 5). Cambia el gasto anual: Ciudad de México ($7,155.00) y Monterrey ($6,953.96) contra Sur ($5,960.64) y Bajío ($5,967.45). Outliers: monto a partir de ~$332–335, frecuencia a partir de 16 compras y gasto anual a partir de $28,791.10 (Noroeste) a $34,912.93 (Ciudad de México).</w:t>
       </w:r>
     </w:p>
     <w:p>
@@ -8966,7 +12349,7 @@
         <w:t xml:space="preserve">Client_Category:</w:t>
       </w:r>
       <w:r>
-        <w:t xml:space="preserve"> gran diferencia en valor del cliente: la frecuencia anual mediana es 4 en Básico, 7 en Silver, 12 en Gold y 11 en Premium, y el gasto anual mediano es $2,938.50, $13,040.24, $38,239.08 y $57,971.16 respectivamente. El ticket por transacción casi no cambia ($105–120). El programa de lealtad sí separa a los clientes de mayor valor.</w:t>
+        <w:t xml:space="preserve"> gran diferencia en valor del cliente: la frecuencia anual mediana es 4 en Básico, 7 en Silver, 12 en Gold y 11 en Premium, y el gasto anual mediano es $2,938.50, $13,040.24, $38,239.08 y $57,971.16 respectivamente. El ticket por transacción casi no cambia ($105–120). El programa de lealtad sí separa a los clientes de mayor valor. Outliers de frecuencia a partir de 10 compras en Básico y de 22 en Premium; de gasto anual a partir de $11,879.88 en Básico y $106,021.25 en Premium; de monto a partir de $321.45 (Básico) a $357.50 (Gold).</w:t>
       </w:r>
     </w:p>
     <w:p>
@@ -8986,7 +12369,7 @@
         <w:t xml:space="preserve">Preferred_Channel:</w:t>
       </w:r>
       <w:r>
-        <w:t xml:space="preserve"> sin diferencias relevantes: App, Online y Tienda física tienen mediana de 5 compras al año, ~$110 por transacción y ~$6,600–6,810 de gasto anual.</w:t>
+        <w:t xml:space="preserve"> sin diferencias relevantes: App, Online y Tienda física tienen mediana de 5 compras al año, ~$110 por transacción y ~$6,600–6,810 de gasto anual. Los límites de outliers también son casi iguales: monto a partir de ~$334, frecuencia a partir de 16 compras y gasto anual a partir de $32,034.15–33,334.15.</w:t>
       </w:r>
     </w:p>
     <w:p>
@@ -9046,7 +12429,7 @@
         <w:t xml:space="preserve">Socioeconomic_Level – sales_amount:</w:t>
       </w:r>
       <w:r>
-        <w:t xml:space="preserve"> el ticket por transacción es muy similar: mediana de $103.06 en Bajo a $119.94 en Alto. Outliers en todos los niveles; el límite general es $333.93.</w:t>
+        <w:t xml:space="preserve"> el ticket por transacción es muy similar: mediana de $103.06 en Bajo a $119.94 en Alto. Outliers a partir de $314.55 en Bajo hasta $356.46 en Medio-Alto.</w:t>
       </w:r>
     </w:p>
     <w:p>
@@ -9066,7 +12449,7 @@
         <w:t xml:space="preserve">Socioeconomic_Level – Annual_Total_Spend (escala log):</w:t>
       </w:r>
       <w:r>
-        <w:t xml:space="preserve"> fuerte gradiente: mediana de $1,769.32 en Bajo, $4,804.98 en Medio-Bajo, $12,001.62 en Medio, $21,154.40 en Medio-Alto y $41,275.52 en Alto (23 veces más que Bajo). </w:t>
+        <w:t xml:space="preserve"> fuerte gradiente: mediana de $1,769.32 en Bajo, $4,804.98 en Medio-Bajo, $12,001.62 en Medio, $21,154.40 en Medio-Alto y $41,275.52 en Alto (23 veces más que Bajo). Outliers a partir de $7,285.86 en Bajo y de $86,007.30 en Alto. </w:t>
       </w:r>
       <w:r>
         <w:rPr>
@@ -9096,7 +12479,7 @@
         <w:t xml:space="preserve">Rango_Edad:</w:t>
       </w:r>
       <w:r>
-        <w:t xml:space="preserve"> las cuatro variables tienen distribuciones prácticamente iguales: mediana de 2 piezas y 5 compras al año en todos los rangos, ticket mediano de $109.38 a $110.16 y gasto anual mediano de $6,566.55 a $6,838.72. Todos presentan outliers de sales_amount en la parte alta (límite general $333.93). </w:t>
+        <w:t xml:space="preserve"> las cuatro variables tienen distribuciones prácticamente iguales: mediana de 2 piezas y 5 compras al año en todos los rangos, ticket mediano de $109.38 a $110.16 y gasto anual mediano de $6,566.55 a $6,838.72. Los límites de outliers también son casi iguales: monto a partir de $333.09–335.48, frecuencia a partir de 16 compras y gasto anual a partir de $31,934.62–33,230.24. </w:t>
       </w:r>
       <w:r>
         <w:rPr>

</xml_diff>